<commit_message>
Add literature recommendations and distribution-check comment to review
Append Part 4 listing uncited literature by objective with rationale and
placement, and add item 3.12 on preliminary checks of test assumptions.

Co-Authored-By: Claude Opus 5.5 <noreply@anthropic.com>
Claude-Session: https://claude.ai/code/session_01WM787U75sCAxndSxcQWdj4
</commit_message>
<xml_diff>
--- a/supervision/Supervisory_Review_Ch3-5.docx
+++ b/supervision/Supervisory_Review_Ch3-5.docx
@@ -118,7 +118,17 @@
         <w:t xml:space="preserve">Part 3</w:t>
       </w:r>
       <w:r>
-        <w:t xml:space="preserve"> shows how examiners would likely read the chapters now.</w:t>
+        <w:t xml:space="preserve"> shows how examiners would likely read the chapters now. </w:t>
+      </w:r>
+      <w:r>
+        <w:rPr>
+          <w:b/>
+          <w:bCs/>
+        </w:rPr>
+        <w:t xml:space="preserve">Part 4</w:t>
+      </w:r>
+      <w:r>
+        <w:t xml:space="preserve"> lists the most important literature you have not yet cited, why it matters and where to use it.</w:t>
       </w:r>
     </w:p>
     <w:p>
@@ -2631,7 +2641,7 @@
                 <w:sz w:val="18"/>
                 <w:szCs w:val="18"/>
               </w:rPr>
-              <w:t xml:space="preserve">Which test decides? Table 3.1 (p. 5) says all five tests decide. Table 4.17 (p. 69) uses the t-test; §4.11 (p. 50) uses the sign-flip test. Test assumptions are not checked.</w:t>
+              <w:t xml:space="preserve">Which test decides? Table 3.1 (p. 5) says all five tests decide. Table 4.17 (p. 69) uses the t-test; §4.11 (p. 50) uses the sign-flip test.</w:t>
             </w:r>
           </w:p>
         </w:tc>
@@ -2678,7 +2688,7 @@
                 <w:sz w:val="18"/>
                 <w:szCs w:val="18"/>
               </w:rPr>
-              <w:t xml:space="preserve">When tests disagree, the reader cannot tell which result counts (see 4.7 and Figure 2). The sign-flip and Wilcoxon tests assume symmetry (Canay, Romano &amp; Shaikh, 2017), but the data are skewed (e.g., +694 bp).</w:t>
+              <w:t xml:space="preserve">When the tests disagree, the reader cannot tell which result counts (see 4.7 and Figure 2).</w:t>
             </w:r>
           </w:p>
         </w:tc>
@@ -2701,7 +2711,7 @@
                 <w:sz w:val="18"/>
                 <w:szCs w:val="18"/>
               </w:rPr>
-              <w:t xml:space="preserve">Name one deciding test in advance, and state what happens if tests disagree. Show the spread of pair means.</w:t>
+              <w:t xml:space="preserve">Name one deciding test in advance, and state what happens if the tests disagree.</w:t>
             </w:r>
           </w:p>
         </w:tc>
@@ -2752,31 +2762,31 @@
                 <w:sz w:val="18"/>
                 <w:szCs w:val="18"/>
               </w:rPr>
-              <w:t xml:space="preserve">The number of simulation draws is 999,999 on p. 16 but one million on p. 35. The rule for exact tests on p. 35 does not match the Table 4.2 caption (p. 36).</w:t>
+              <w:t xml:space="preserve">There are no preliminary checks on the distribution of the pair means (§3.8, pp. 15–17). Each test rests on an assumption: the t-test on roughly normal pair means, and the Wilcoxon and sign-flip tests on symmetry. Your own tables show clear skew. Callable: mean +39 bp but median −5 bp. AT1: mean +104 bp, median +128 bp. Labelled (window): mean −16 bp, median −4 bp (Table 4.1, p. 35). Single pairs reach +694 bp and +425 bp (Table 4.3, pp. 36–37).</w:t>
             </w:r>
           </w:p>
         </w:tc>
         <w:tc>
           <w:tcPr>
             <w:tcW w:type="dxa" w:w="1166"/>
-            <w:shd w:fill="E2EFDA" w:color="auto" w:val="clear"/>
-            <w:tcMar>
-              <w:top w:type="dxa" w:w="60"/>
-              <w:left w:type="dxa" w:w="90"/>
-              <w:bottom w:type="dxa" w:w="60"/>
-              <w:right w:type="dxa" w:w="90"/>
-            </w:tcMar>
-          </w:tcPr>
-          <w:p>
-            <w:pPr>
-              <w:spacing w:after="40"/>
-            </w:pPr>
-            <w:r>
-              <w:rPr>
-                <w:sz w:val="18"/>
-                <w:szCs w:val="18"/>
-              </w:rPr>
-              <w:t xml:space="preserve">Minor</w:t>
+            <w:shd w:fill="FCE5CD" w:color="auto" w:val="clear"/>
+            <w:tcMar>
+              <w:top w:type="dxa" w:w="60"/>
+              <w:left w:type="dxa" w:w="90"/>
+              <w:bottom w:type="dxa" w:w="60"/>
+              <w:right w:type="dxa" w:w="90"/>
+            </w:tcMar>
+          </w:tcPr>
+          <w:p>
+            <w:pPr>
+              <w:spacing w:after="40"/>
+            </w:pPr>
+            <w:r>
+              <w:rPr>
+                <w:sz w:val="18"/>
+                <w:szCs w:val="18"/>
+              </w:rPr>
+              <w:t xml:space="preserve">Major</w:t>
             </w:r>
           </w:p>
         </w:tc>
@@ -2799,7 +2809,7 @@
                 <w:sz w:val="18"/>
                 <w:szCs w:val="18"/>
               </w:rPr>
-              <w:t xml:space="preserve">Small, but examiners notice.</w:t>
+              <w:t xml:space="preserve">If the assumptions do not hold, the p-values and confidence intervals can be wrong: too small or too large. The mean itself is not biased, but a few extreme pairs can drive it, so it may not describe a typical pair. The sign-flip test is only valid under approximate symmetry (Canay, Romano &amp; Shaikh, 2017). With 17–30 pairs, the t-test cannot rely on large-sample theory either. Formal normality tests have little power at this sample size, and picking a test after a pre-test changes its error rate. So the checks and the fallback tests must be set out in advance.</w:t>
             </w:r>
           </w:p>
         </w:tc>
@@ -2822,7 +2832,7 @@
                 <w:sz w:val="18"/>
                 <w:szCs w:val="18"/>
               </w:rPr>
-              <w:t xml:space="preserve">Make consistent.</w:t>
+              <w:t xml:space="preserve">Add a short distribution-check step before the main tests: (i) a dot plot or histogram and a Q–Q plot of pair means for each class; (ii) report the mean, median, skewness and any outlying pairs; (iii) a formal normality and symmetry test, used as supporting evidence only; (iv) robust alternatives set in advance: the sign test (no symmetry needed), a bootstrap interval for the median or trimmed mean, and the Hodges–Lehmann estimate alongside the Wilcoxon test; (v) state whether any conclusion changes.</w:t>
             </w:r>
           </w:p>
         </w:tc>
@@ -2873,7 +2883,7 @@
                 <w:sz w:val="18"/>
                 <w:szCs w:val="18"/>
               </w:rPr>
-              <w:t xml:space="preserve">Power is calculated after the fact and reported in the methods chapter (p. 17).</w:t>
+              <w:t xml:space="preserve">The number of simulation draws is 999,999 on p. 16 but one million on p. 35. The rule for exact tests on p. 35 does not match the Table 4.2 caption (p. 36).</w:t>
             </w:r>
           </w:p>
         </w:tc>
@@ -2920,7 +2930,7 @@
                 <w:sz w:val="18"/>
                 <w:szCs w:val="18"/>
               </w:rPr>
-              <w:t xml:space="preserve">Power computed after the data are seen adds little (Hoenig &amp; Heisey, 2001). Confidence intervals are more useful.</w:t>
+              <w:t xml:space="preserve">Small, but examiners notice.</w:t>
             </w:r>
           </w:p>
         </w:tc>
@@ -2943,7 +2953,7 @@
                 <w:sz w:val="18"/>
                 <w:szCs w:val="18"/>
               </w:rPr>
-              <w:t xml:space="preserve">Report detectable effect sizes as a design limit. Move the numbers to Chapter 4.</w:t>
+              <w:t xml:space="preserve">Make consistent.</w:t>
             </w:r>
           </w:p>
         </w:tc>
@@ -2994,31 +3004,31 @@
                 <w:sz w:val="18"/>
                 <w:szCs w:val="18"/>
               </w:rPr>
-              <w:t xml:space="preserve">Holm results are reported in the methods chapter (p. 18). The correction ignores the multiple horizons, rules and samples.</w:t>
+              <w:t xml:space="preserve">Power is calculated after the fact and reported in the methods chapter (p. 17).</w:t>
             </w:r>
           </w:p>
         </w:tc>
         <w:tc>
           <w:tcPr>
             <w:tcW w:type="dxa" w:w="1166"/>
-            <w:shd w:fill="FCE5CD" w:color="auto" w:val="clear"/>
-            <w:tcMar>
-              <w:top w:type="dxa" w:w="60"/>
-              <w:left w:type="dxa" w:w="90"/>
-              <w:bottom w:type="dxa" w:w="60"/>
-              <w:right w:type="dxa" w:w="90"/>
-            </w:tcMar>
-          </w:tcPr>
-          <w:p>
-            <w:pPr>
-              <w:spacing w:after="40"/>
-            </w:pPr>
-            <w:r>
-              <w:rPr>
-                <w:sz w:val="18"/>
-                <w:szCs w:val="18"/>
-              </w:rPr>
-              <w:t xml:space="preserve">Major</w:t>
+            <w:shd w:fill="E2EFDA" w:color="auto" w:val="clear"/>
+            <w:tcMar>
+              <w:top w:type="dxa" w:w="60"/>
+              <w:left w:type="dxa" w:w="90"/>
+              <w:bottom w:type="dxa" w:w="60"/>
+              <w:right w:type="dxa" w:w="90"/>
+            </w:tcMar>
+          </w:tcPr>
+          <w:p>
+            <w:pPr>
+              <w:spacing w:after="40"/>
+            </w:pPr>
+            <w:r>
+              <w:rPr>
+                <w:sz w:val="18"/>
+                <w:szCs w:val="18"/>
+              </w:rPr>
+              <w:t xml:space="preserve">Minor</w:t>
             </w:r>
           </w:p>
         </w:tc>
@@ -3041,7 +3051,7 @@
                 <w:sz w:val="18"/>
                 <w:szCs w:val="18"/>
               </w:rPr>
-              <w:t xml:space="preserve">Uncorrected multiple testing is a common cause of false findings (Harvey, 2017).</w:t>
+              <w:t xml:space="preserve">Power computed after the data are seen adds little (Hoenig &amp; Heisey, 2001). Confidence intervals are more useful.</w:t>
             </w:r>
           </w:p>
         </w:tc>
@@ -3064,7 +3074,7 @@
                 <w:sz w:val="18"/>
                 <w:szCs w:val="18"/>
               </w:rPr>
-              <w:t xml:space="preserve">Define the test family in advance, and report results in Chapter 4.</w:t>
+              <w:t xml:space="preserve">Report detectable effect sizes as a design limit. Move the numbers to Chapter 4.</w:t>
             </w:r>
           </w:p>
         </w:tc>
@@ -3115,31 +3125,31 @@
                 <w:sz w:val="18"/>
                 <w:szCs w:val="18"/>
               </w:rPr>
-              <w:t xml:space="preserve">The determinants objective (RO3) is left to a supervisory decision (pp. 21–22).</w:t>
+              <w:t xml:space="preserve">Holm results are reported in the methods chapter (p. 18). The correction ignores the multiple horizons, rules and samples.</w:t>
             </w:r>
           </w:p>
         </w:tc>
         <w:tc>
           <w:tcPr>
             <w:tcW w:type="dxa" w:w="1166"/>
-            <w:shd w:fill="F4CCCC" w:color="auto" w:val="clear"/>
-            <w:tcMar>
-              <w:top w:type="dxa" w:w="60"/>
-              <w:left w:type="dxa" w:w="90"/>
-              <w:bottom w:type="dxa" w:w="60"/>
-              <w:right w:type="dxa" w:w="90"/>
-            </w:tcMar>
-          </w:tcPr>
-          <w:p>
-            <w:pPr>
-              <w:spacing w:after="40"/>
-            </w:pPr>
-            <w:r>
-              <w:rPr>
-                <w:sz w:val="18"/>
-                <w:szCs w:val="18"/>
-              </w:rPr>
-              <w:t xml:space="preserve">Critical</w:t>
+            <w:shd w:fill="FCE5CD" w:color="auto" w:val="clear"/>
+            <w:tcMar>
+              <w:top w:type="dxa" w:w="60"/>
+              <w:left w:type="dxa" w:w="90"/>
+              <w:bottom w:type="dxa" w:w="60"/>
+              <w:right w:type="dxa" w:w="90"/>
+            </w:tcMar>
+          </w:tcPr>
+          <w:p>
+            <w:pPr>
+              <w:spacing w:after="40"/>
+            </w:pPr>
+            <w:r>
+              <w:rPr>
+                <w:sz w:val="18"/>
+                <w:szCs w:val="18"/>
+              </w:rPr>
+              <w:t xml:space="preserve">Major</w:t>
             </w:r>
           </w:p>
         </w:tc>
@@ -3162,7 +3172,7 @@
                 <w:sz w:val="18"/>
                 <w:szCs w:val="18"/>
               </w:rPr>
-              <w:t xml:space="preserve">Objective (b) is not answered. See MI-1.</w:t>
+              <w:t xml:space="preserve">Uncorrected multiple testing is a common cause of false findings (Harvey, 2017).</w:t>
             </w:r>
           </w:p>
         </w:tc>
@@ -3185,7 +3195,7 @@
                 <w:sz w:val="18"/>
                 <w:szCs w:val="18"/>
               </w:rPr>
-              <w:t xml:space="preserve">Build the determinants analysis.</w:t>
+              <w:t xml:space="preserve">Define the test family in advance, and report results in Chapter 4.</w:t>
             </w:r>
           </w:p>
         </w:tc>
@@ -3236,31 +3246,31 @@
                 <w:sz w:val="18"/>
                 <w:szCs w:val="18"/>
               </w:rPr>
-              <w:t xml:space="preserve">The reconciliation with the proposal (pp. 23–26) sits in the main text.</w:t>
+              <w:t xml:space="preserve">The determinants objective (RO3) is left to a supervisory decision (pp. 21–22).</w:t>
             </w:r>
           </w:p>
         </w:tc>
         <w:tc>
           <w:tcPr>
             <w:tcW w:type="dxa" w:w="1166"/>
-            <w:shd w:fill="E2EFDA" w:color="auto" w:val="clear"/>
-            <w:tcMar>
-              <w:top w:type="dxa" w:w="60"/>
-              <w:left w:type="dxa" w:w="90"/>
-              <w:bottom w:type="dxa" w:w="60"/>
-              <w:right w:type="dxa" w:w="90"/>
-            </w:tcMar>
-          </w:tcPr>
-          <w:p>
-            <w:pPr>
-              <w:spacing w:after="40"/>
-            </w:pPr>
-            <w:r>
-              <w:rPr>
-                <w:sz w:val="18"/>
-                <w:szCs w:val="18"/>
-              </w:rPr>
-              <w:t xml:space="preserve">Minor</w:t>
+            <w:shd w:fill="F4CCCC" w:color="auto" w:val="clear"/>
+            <w:tcMar>
+              <w:top w:type="dxa" w:w="60"/>
+              <w:left w:type="dxa" w:w="90"/>
+              <w:bottom w:type="dxa" w:w="60"/>
+              <w:right w:type="dxa" w:w="90"/>
+            </w:tcMar>
+          </w:tcPr>
+          <w:p>
+            <w:pPr>
+              <w:spacing w:after="40"/>
+            </w:pPr>
+            <w:r>
+              <w:rPr>
+                <w:sz w:val="18"/>
+                <w:szCs w:val="18"/>
+              </w:rPr>
+              <w:t xml:space="preserve">Critical</w:t>
             </w:r>
           </w:p>
         </w:tc>
@@ -3283,7 +3293,7 @@
                 <w:sz w:val="18"/>
                 <w:szCs w:val="18"/>
               </w:rPr>
-              <w:t xml:space="preserve">It is process documentation and breaks the flow.</w:t>
+              <w:t xml:space="preserve">Objective (b) is not answered. See MI-1.</w:t>
             </w:r>
           </w:p>
         </w:tc>
@@ -3306,7 +3316,7 @@
                 <w:sz w:val="18"/>
                 <w:szCs w:val="18"/>
               </w:rPr>
-              <w:t xml:space="preserve">Move it to an appendix and keep a short summary.</w:t>
+              <w:t xml:space="preserve">Build the determinants analysis.</w:t>
             </w:r>
           </w:p>
         </w:tc>
@@ -3335,6 +3345,127 @@
                 <w:szCs w:val="18"/>
               </w:rPr>
               <w:t xml:space="preserve">3.17</w:t>
+            </w:r>
+          </w:p>
+        </w:tc>
+        <w:tc>
+          <w:tcPr>
+            <w:tcW w:type="dxa" w:w="3934"/>
+            <w:tcMar>
+              <w:top w:type="dxa" w:w="60"/>
+              <w:left w:type="dxa" w:w="90"/>
+              <w:bottom w:type="dxa" w:w="60"/>
+              <w:right w:type="dxa" w:w="90"/>
+            </w:tcMar>
+          </w:tcPr>
+          <w:p>
+            <w:pPr>
+              <w:spacing w:after="40"/>
+            </w:pPr>
+            <w:r>
+              <w:rPr>
+                <w:sz w:val="18"/>
+                <w:szCs w:val="18"/>
+              </w:rPr>
+              <w:t xml:space="preserve">The reconciliation with the proposal (pp. 23–26) sits in the main text.</w:t>
+            </w:r>
+          </w:p>
+        </w:tc>
+        <w:tc>
+          <w:tcPr>
+            <w:tcW w:type="dxa" w:w="1166"/>
+            <w:shd w:fill="E2EFDA" w:color="auto" w:val="clear"/>
+            <w:tcMar>
+              <w:top w:type="dxa" w:w="60"/>
+              <w:left w:type="dxa" w:w="90"/>
+              <w:bottom w:type="dxa" w:w="60"/>
+              <w:right w:type="dxa" w:w="90"/>
+            </w:tcMar>
+          </w:tcPr>
+          <w:p>
+            <w:pPr>
+              <w:spacing w:after="40"/>
+            </w:pPr>
+            <w:r>
+              <w:rPr>
+                <w:sz w:val="18"/>
+                <w:szCs w:val="18"/>
+              </w:rPr>
+              <w:t xml:space="preserve">Minor</w:t>
+            </w:r>
+          </w:p>
+        </w:tc>
+        <w:tc>
+          <w:tcPr>
+            <w:tcW w:type="dxa" w:w="4662"/>
+            <w:tcMar>
+              <w:top w:type="dxa" w:w="60"/>
+              <w:left w:type="dxa" w:w="90"/>
+              <w:bottom w:type="dxa" w:w="60"/>
+              <w:right w:type="dxa" w:w="90"/>
+            </w:tcMar>
+          </w:tcPr>
+          <w:p>
+            <w:pPr>
+              <w:spacing w:after="40"/>
+            </w:pPr>
+            <w:r>
+              <w:rPr>
+                <w:sz w:val="18"/>
+                <w:szCs w:val="18"/>
+              </w:rPr>
+              <w:t xml:space="preserve">It is process documentation and breaks the flow.</w:t>
+            </w:r>
+          </w:p>
+        </w:tc>
+        <w:tc>
+          <w:tcPr>
+            <w:tcW w:type="dxa" w:w="4079"/>
+            <w:tcMar>
+              <w:top w:type="dxa" w:w="60"/>
+              <w:left w:type="dxa" w:w="90"/>
+              <w:bottom w:type="dxa" w:w="60"/>
+              <w:right w:type="dxa" w:w="90"/>
+            </w:tcMar>
+          </w:tcPr>
+          <w:p>
+            <w:pPr>
+              <w:spacing w:after="40"/>
+            </w:pPr>
+            <w:r>
+              <w:rPr>
+                <w:sz w:val="18"/>
+                <w:szCs w:val="18"/>
+              </w:rPr>
+              <w:t xml:space="preserve">Move it to an appendix and keep a short summary.</w:t>
+            </w:r>
+          </w:p>
+        </w:tc>
+      </w:tr>
+      <w:tr>
+        <w:trPr>
+          <w:cantSplit w:val="off"/>
+        </w:trPr>
+        <w:tc>
+          <w:tcPr>
+            <w:tcW w:type="dxa" w:w="729"/>
+            <w:tcMar>
+              <w:top w:type="dxa" w:w="60"/>
+              <w:left w:type="dxa" w:w="90"/>
+              <w:bottom w:type="dxa" w:w="60"/>
+              <w:right w:type="dxa" w:w="90"/>
+            </w:tcMar>
+          </w:tcPr>
+          <w:p>
+            <w:pPr>
+              <w:spacing w:after="40"/>
+            </w:pPr>
+            <w:r>
+              <w:rPr>
+                <w:sz w:val="18"/>
+                <w:szCs w:val="18"/>
+              </w:rPr>
+              <w:t xml:space="preserve">3.18</w:t>
             </w:r>
           </w:p>
         </w:tc>
@@ -8436,7 +8567,7 @@
                 <w:sz w:val="18"/>
                 <w:szCs w:val="18"/>
               </w:rPr>
-              <w:t xml:space="preserve">MI-3, MI-4, MI-5; items 3.8, 3.11, 3.17</w:t>
+              <w:t xml:space="preserve">MI-3, MI-4, MI-5; items 3.8, 3.11, 3.12, 3.18</w:t>
             </w:r>
           </w:p>
         </w:tc>
@@ -8722,6 +8853,3322 @@
     </w:p>
     <w:p>
       <w:pPr>
+        <w:pStyle w:val="Heading1"/>
+      </w:pPr>
+      <w:r>
+        <w:t xml:space="preserve">Part 4. Literature to add</w:t>
+      </w:r>
+    </w:p>
+    <w:p>
+      <w:pPr>
+        <w:spacing w:after="120" w:line="276"/>
+      </w:pPr>
+      <w:r>
+        <w:t xml:space="preserve">None of the sources below is in your current reference list. I have listed the ones I think matter most. For each, I say why it matters for your study and where in the draft it belongs. </w:t>
+      </w:r>
+      <w:r>
+        <w:rPr>
+          <w:b/>
+          <w:bCs/>
+        </w:rPr>
+        <w:t xml:space="preserve">Essential</w:t>
+      </w:r>
+      <w:r>
+        <w:t xml:space="preserve"> means an examiner is likely to expect it. </w:t>
+      </w:r>
+      <w:r>
+        <w:rPr>
+          <w:b/>
+          <w:bCs/>
+        </w:rPr>
+        <w:t xml:space="preserve">Recommended</w:t>
+      </w:r>
+      <w:r>
+        <w:t xml:space="preserve"> means it would strengthen the argument.</w:t>
+      </w:r>
+    </w:p>
+    <w:p>
+      <w:pPr>
+        <w:spacing w:after="120" w:line="276"/>
+      </w:pPr>
+      <w:r>
+        <w:t xml:space="preserve">Five sources are working papers (marked </w:t>
+      </w:r>
+      <w:r>
+        <w:rPr>
+          <w:b/>
+          <w:bCs/>
+        </w:rPr>
+        <w:t xml:space="preserve">[WP]</w:t>
+      </w:r>
+      <w:r>
+        <w:t xml:space="preserve">). They are very recent and directly relevant, but they are not yet peer-reviewed. Cite them with that caveat, and check whether a published version exists before you submit.</w:t>
+      </w:r>
+    </w:p>
+    <w:p>
+      <w:pPr>
+        <w:pStyle w:val="Heading2"/>
+      </w:pPr>
+      <w:r>
+        <w:t xml:space="preserve">4.1 Objective (a): callable, putable and AT1 features</w:t>
+      </w:r>
+    </w:p>
+    <w:tbl>
+      <w:tblPr>
+        <w:tblW w:type="dxa" w:w="9638"/>
+        <w:tblBorders>
+          <w:top w:val="single" w:color="auto" w:sz="4"/>
+          <w:left w:val="single" w:color="auto" w:sz="4"/>
+          <w:bottom w:val="single" w:color="auto" w:sz="4"/>
+          <w:right w:val="single" w:color="auto" w:sz="4"/>
+          <w:insideH w:val="single" w:color="auto" w:sz="4"/>
+          <w:insideV w:val="single" w:color="auto" w:sz="4"/>
+        </w:tblBorders>
+      </w:tblPr>
+      <w:tblGrid>
+        <w:gridCol w:w="2313"/>
+        <w:gridCol w:w="4433"/>
+        <w:gridCol w:w="1735"/>
+        <w:gridCol w:w="1157"/>
+      </w:tblGrid>
+      <w:tr>
+        <w:trPr>
+          <w:tblHeader/>
+        </w:trPr>
+        <w:tc>
+          <w:tcPr>
+            <w:tcW w:type="dxa" w:w="2313"/>
+            <w:shd w:fill="1F3864" w:color="auto" w:val="clear"/>
+            <w:tcMar>
+              <w:top w:type="dxa" w:w="60"/>
+              <w:left w:type="dxa" w:w="90"/>
+              <w:bottom w:type="dxa" w:w="60"/>
+              <w:right w:type="dxa" w:w="90"/>
+            </w:tcMar>
+          </w:tcPr>
+          <w:p>
+            <w:pPr>
+              <w:spacing w:after="40"/>
+            </w:pPr>
+            <w:r>
+              <w:rPr>
+                <w:b/>
+                <w:bCs/>
+                <w:color w:val="FFFFFF"/>
+                <w:sz w:val="18"/>
+                <w:szCs w:val="18"/>
+              </w:rPr>
+              <w:t xml:space="preserve">Source</w:t>
+            </w:r>
+          </w:p>
+        </w:tc>
+        <w:tc>
+          <w:tcPr>
+            <w:tcW w:type="dxa" w:w="4433"/>
+            <w:shd w:fill="1F3864" w:color="auto" w:val="clear"/>
+            <w:tcMar>
+              <w:top w:type="dxa" w:w="60"/>
+              <w:left w:type="dxa" w:w="90"/>
+              <w:bottom w:type="dxa" w:w="60"/>
+              <w:right w:type="dxa" w:w="90"/>
+            </w:tcMar>
+          </w:tcPr>
+          <w:p>
+            <w:pPr>
+              <w:spacing w:after="40"/>
+            </w:pPr>
+            <w:r>
+              <w:rPr>
+                <w:b/>
+                <w:bCs/>
+                <w:color w:val="FFFFFF"/>
+                <w:sz w:val="18"/>
+                <w:szCs w:val="18"/>
+              </w:rPr>
+              <w:t xml:space="preserve">Why it matters for your study</w:t>
+            </w:r>
+          </w:p>
+        </w:tc>
+        <w:tc>
+          <w:tcPr>
+            <w:tcW w:type="dxa" w:w="1735"/>
+            <w:shd w:fill="1F3864" w:color="auto" w:val="clear"/>
+            <w:tcMar>
+              <w:top w:type="dxa" w:w="60"/>
+              <w:left w:type="dxa" w:w="90"/>
+              <w:bottom w:type="dxa" w:w="60"/>
+              <w:right w:type="dxa" w:w="90"/>
+            </w:tcMar>
+          </w:tcPr>
+          <w:p>
+            <w:pPr>
+              <w:spacing w:after="40"/>
+            </w:pPr>
+            <w:r>
+              <w:rPr>
+                <w:b/>
+                <w:bCs/>
+                <w:color w:val="FFFFFF"/>
+                <w:sz w:val="18"/>
+                <w:szCs w:val="18"/>
+              </w:rPr>
+              <w:t xml:space="preserve">Where to use it</w:t>
+            </w:r>
+          </w:p>
+        </w:tc>
+        <w:tc>
+          <w:tcPr>
+            <w:tcW w:type="dxa" w:w="1157"/>
+            <w:shd w:fill="1F3864" w:color="auto" w:val="clear"/>
+            <w:tcMar>
+              <w:top w:type="dxa" w:w="60"/>
+              <w:left w:type="dxa" w:w="90"/>
+              <w:bottom w:type="dxa" w:w="60"/>
+              <w:right w:type="dxa" w:w="90"/>
+            </w:tcMar>
+          </w:tcPr>
+          <w:p>
+            <w:pPr>
+              <w:spacing w:after="40"/>
+            </w:pPr>
+            <w:r>
+              <w:rPr>
+                <w:b/>
+                <w:bCs/>
+                <w:color w:val="FFFFFF"/>
+                <w:sz w:val="18"/>
+                <w:szCs w:val="18"/>
+              </w:rPr>
+              <w:t xml:space="preserve">Priority</w:t>
+            </w:r>
+          </w:p>
+        </w:tc>
+      </w:tr>
+      <w:tr>
+        <w:trPr>
+          <w:cantSplit w:val="off"/>
+        </w:trPr>
+        <w:tc>
+          <w:tcPr>
+            <w:tcW w:type="dxa" w:w="2313"/>
+            <w:tcMar>
+              <w:top w:type="dxa" w:w="60"/>
+              <w:left w:type="dxa" w:w="90"/>
+              <w:bottom w:type="dxa" w:w="60"/>
+              <w:right w:type="dxa" w:w="90"/>
+            </w:tcMar>
+          </w:tcPr>
+          <w:p>
+            <w:pPr>
+              <w:spacing w:after="40"/>
+            </w:pPr>
+            <w:r>
+              <w:rPr>
+                <w:sz w:val="18"/>
+                <w:szCs w:val="18"/>
+              </w:rPr>
+              <w:t xml:space="preserve">Powers &amp; Tsyplakov (2008)</w:t>
+            </w:r>
+          </w:p>
+        </w:tc>
+        <w:tc>
+          <w:tcPr>
+            <w:tcW w:type="dxa" w:w="4433"/>
+            <w:tcMar>
+              <w:top w:type="dxa" w:w="60"/>
+              <w:left w:type="dxa" w:w="90"/>
+              <w:bottom w:type="dxa" w:w="60"/>
+              <w:right w:type="dxa" w:w="90"/>
+            </w:tcMar>
+          </w:tcPr>
+          <w:p>
+            <w:pPr>
+              <w:spacing w:after="40"/>
+            </w:pPr>
+            <w:r>
+              <w:rPr>
+                <w:sz w:val="18"/>
+                <w:szCs w:val="18"/>
+              </w:rPr>
+              <w:t xml:space="preserve">Models put the cost of a make-whole call at 2–5 bp, while observed extra yields are 13–24 bp. This gives you a benchmark for how small a call premium can be, and supports your point that short calls near maturity are worth little.</w:t>
+            </w:r>
+          </w:p>
+        </w:tc>
+        <w:tc>
+          <w:tcPr>
+            <w:tcW w:type="dxa" w:w="1735"/>
+            <w:tcMar>
+              <w:top w:type="dxa" w:w="60"/>
+              <w:left w:type="dxa" w:w="90"/>
+              <w:bottom w:type="dxa" w:w="60"/>
+              <w:right w:type="dxa" w:w="90"/>
+            </w:tcMar>
+          </w:tcPr>
+          <w:p>
+            <w:pPr>
+              <w:spacing w:after="40"/>
+            </w:pPr>
+            <w:r>
+              <w:rPr>
+                <w:sz w:val="18"/>
+                <w:szCs w:val="18"/>
+              </w:rPr>
+              <w:t xml:space="preserve">§5.2 (pp. 74–76); §4.9 (p. 47)</w:t>
+            </w:r>
+          </w:p>
+        </w:tc>
+        <w:tc>
+          <w:tcPr>
+            <w:tcW w:type="dxa" w:w="1157"/>
+            <w:tcMar>
+              <w:top w:type="dxa" w:w="60"/>
+              <w:left w:type="dxa" w:w="90"/>
+              <w:bottom w:type="dxa" w:w="60"/>
+              <w:right w:type="dxa" w:w="90"/>
+            </w:tcMar>
+          </w:tcPr>
+          <w:p>
+            <w:pPr>
+              <w:spacing w:after="40"/>
+            </w:pPr>
+            <w:r>
+              <w:rPr>
+                <w:sz w:val="18"/>
+                <w:szCs w:val="18"/>
+              </w:rPr>
+              <w:t xml:space="preserve">Essential</w:t>
+            </w:r>
+          </w:p>
+        </w:tc>
+      </w:tr>
+      <w:tr>
+        <w:trPr>
+          <w:cantSplit w:val="off"/>
+        </w:trPr>
+        <w:tc>
+          <w:tcPr>
+            <w:tcW w:type="dxa" w:w="2313"/>
+            <w:tcMar>
+              <w:top w:type="dxa" w:w="60"/>
+              <w:left w:type="dxa" w:w="90"/>
+              <w:bottom w:type="dxa" w:w="60"/>
+              <w:right w:type="dxa" w:w="90"/>
+            </w:tcMar>
+          </w:tcPr>
+          <w:p>
+            <w:pPr>
+              <w:spacing w:after="40"/>
+            </w:pPr>
+            <w:r>
+              <w:rPr>
+                <w:sz w:val="18"/>
+                <w:szCs w:val="18"/>
+              </w:rPr>
+              <w:t xml:space="preserve">Booth, Gounopoulos &amp; Skinner (2014)</w:t>
+            </w:r>
+          </w:p>
+        </w:tc>
+        <w:tc>
+          <w:tcPr>
+            <w:tcW w:type="dxa" w:w="4433"/>
+            <w:tcMar>
+              <w:top w:type="dxa" w:w="60"/>
+              <w:left w:type="dxa" w:w="90"/>
+              <w:bottom w:type="dxa" w:w="60"/>
+              <w:right w:type="dxa" w:w="90"/>
+            </w:tcMar>
+          </w:tcPr>
+          <w:p>
+            <w:pPr>
+              <w:spacing w:after="40"/>
+            </w:pPr>
+            <w:r>
+              <w:rPr>
+                <w:sz w:val="18"/>
+                <w:szCs w:val="18"/>
+              </w:rPr>
+              <w:t xml:space="preserve">Callable versus non-callable spreads differ between financial and non-financial issuers, so the two should be analysed separately. Your callable and AT1 samples are dominated by banks and financial vehicles.</w:t>
+            </w:r>
+          </w:p>
+        </w:tc>
+        <w:tc>
+          <w:tcPr>
+            <w:tcW w:type="dxa" w:w="1735"/>
+            <w:tcMar>
+              <w:top w:type="dxa" w:w="60"/>
+              <w:left w:type="dxa" w:w="90"/>
+              <w:bottom w:type="dxa" w:w="60"/>
+              <w:right w:type="dxa" w:w="90"/>
+            </w:tcMar>
+          </w:tcPr>
+          <w:p>
+            <w:pPr>
+              <w:spacing w:after="40"/>
+            </w:pPr>
+            <w:r>
+              <w:rPr>
+                <w:sz w:val="18"/>
+                <w:szCs w:val="18"/>
+              </w:rPr>
+              <w:t xml:space="preserve">§3.5 (pp. 9–11); §5.2</w:t>
+            </w:r>
+          </w:p>
+        </w:tc>
+        <w:tc>
+          <w:tcPr>
+            <w:tcW w:type="dxa" w:w="1157"/>
+            <w:tcMar>
+              <w:top w:type="dxa" w:w="60"/>
+              <w:left w:type="dxa" w:w="90"/>
+              <w:bottom w:type="dxa" w:w="60"/>
+              <w:right w:type="dxa" w:w="90"/>
+            </w:tcMar>
+          </w:tcPr>
+          <w:p>
+            <w:pPr>
+              <w:spacing w:after="40"/>
+            </w:pPr>
+            <w:r>
+              <w:rPr>
+                <w:sz w:val="18"/>
+                <w:szCs w:val="18"/>
+              </w:rPr>
+              <w:t xml:space="preserve">Recommended</w:t>
+            </w:r>
+          </w:p>
+        </w:tc>
+      </w:tr>
+      <w:tr>
+        <w:trPr>
+          <w:cantSplit w:val="off"/>
+        </w:trPr>
+        <w:tc>
+          <w:tcPr>
+            <w:tcW w:type="dxa" w:w="2313"/>
+            <w:tcMar>
+              <w:top w:type="dxa" w:w="60"/>
+              <w:left w:type="dxa" w:w="90"/>
+              <w:bottom w:type="dxa" w:w="60"/>
+              <w:right w:type="dxa" w:w="90"/>
+            </w:tcMar>
+          </w:tcPr>
+          <w:p>
+            <w:pPr>
+              <w:spacing w:after="40"/>
+            </w:pPr>
+            <w:r>
+              <w:rPr>
+                <w:sz w:val="18"/>
+                <w:szCs w:val="18"/>
+              </w:rPr>
+              <w:t xml:space="preserve">Spivey (1989)</w:t>
+            </w:r>
+          </w:p>
+        </w:tc>
+        <w:tc>
+          <w:tcPr>
+            <w:tcW w:type="dxa" w:w="4433"/>
+            <w:tcMar>
+              <w:top w:type="dxa" w:w="60"/>
+              <w:left w:type="dxa" w:w="90"/>
+              <w:bottom w:type="dxa" w:w="60"/>
+              <w:right w:type="dxa" w:w="90"/>
+            </w:tcMar>
+          </w:tcPr>
+          <w:p>
+            <w:pPr>
+              <w:spacing w:after="40"/>
+            </w:pPr>
+            <w:r>
+              <w:rPr>
+                <w:sz w:val="18"/>
+                <w:szCs w:val="18"/>
+              </w:rPr>
+              <w:t xml:space="preserve">Issuers pay a call premium once self-selection into callable issuance is corrected. This supports your point that feature choice is endogenous (§3.1, p. 3), and it offers a correction method (probit switching regression).</w:t>
+            </w:r>
+          </w:p>
+        </w:tc>
+        <w:tc>
+          <w:tcPr>
+            <w:tcW w:type="dxa" w:w="1735"/>
+            <w:tcMar>
+              <w:top w:type="dxa" w:w="60"/>
+              <w:left w:type="dxa" w:w="90"/>
+              <w:bottom w:type="dxa" w:w="60"/>
+              <w:right w:type="dxa" w:w="90"/>
+            </w:tcMar>
+          </w:tcPr>
+          <w:p>
+            <w:pPr>
+              <w:spacing w:after="40"/>
+            </w:pPr>
+            <w:r>
+              <w:rPr>
+                <w:sz w:val="18"/>
+                <w:szCs w:val="18"/>
+              </w:rPr>
+              <w:t xml:space="preserve">§3.1 (p. 3); §5.5 (p. 86)</w:t>
+            </w:r>
+          </w:p>
+        </w:tc>
+        <w:tc>
+          <w:tcPr>
+            <w:tcW w:type="dxa" w:w="1157"/>
+            <w:tcMar>
+              <w:top w:type="dxa" w:w="60"/>
+              <w:left w:type="dxa" w:w="90"/>
+              <w:bottom w:type="dxa" w:w="60"/>
+              <w:right w:type="dxa" w:w="90"/>
+            </w:tcMar>
+          </w:tcPr>
+          <w:p>
+            <w:pPr>
+              <w:spacing w:after="40"/>
+            </w:pPr>
+            <w:r>
+              <w:rPr>
+                <w:sz w:val="18"/>
+                <w:szCs w:val="18"/>
+              </w:rPr>
+              <w:t xml:space="preserve">Recommended</w:t>
+            </w:r>
+          </w:p>
+        </w:tc>
+      </w:tr>
+      <w:tr>
+        <w:trPr>
+          <w:cantSplit w:val="off"/>
+        </w:trPr>
+        <w:tc>
+          <w:tcPr>
+            <w:tcW w:type="dxa" w:w="2313"/>
+            <w:tcMar>
+              <w:top w:type="dxa" w:w="60"/>
+              <w:left w:type="dxa" w:w="90"/>
+              <w:bottom w:type="dxa" w:w="60"/>
+              <w:right w:type="dxa" w:w="90"/>
+            </w:tcMar>
+          </w:tcPr>
+          <w:p>
+            <w:pPr>
+              <w:spacing w:after="40"/>
+            </w:pPr>
+            <w:r>
+              <w:rPr>
+                <w:sz w:val="18"/>
+                <w:szCs w:val="18"/>
+              </w:rPr>
+              <w:t xml:space="preserve">Elkamhi, Ericsson &amp; Wang (2012)</w:t>
+            </w:r>
+          </w:p>
+        </w:tc>
+        <w:tc>
+          <w:tcPr>
+            <w:tcW w:type="dxa" w:w="4433"/>
+            <w:tcMar>
+              <w:top w:type="dxa" w:w="60"/>
+              <w:left w:type="dxa" w:w="90"/>
+              <w:bottom w:type="dxa" w:w="60"/>
+              <w:right w:type="dxa" w:w="90"/>
+            </w:tcMar>
+          </w:tcPr>
+          <w:p>
+            <w:pPr>
+              <w:spacing w:after="40"/>
+            </w:pPr>
+            <w:r>
+              <w:rPr>
+                <w:sz w:val="18"/>
+                <w:szCs w:val="18"/>
+              </w:rPr>
+              <w:t xml:space="preserve">Put features lower yield spreads, mainly by reducing default risk. This gives H1c its theoretical prediction, even though you cannot test it.</w:t>
+            </w:r>
+          </w:p>
+        </w:tc>
+        <w:tc>
+          <w:tcPr>
+            <w:tcW w:type="dxa" w:w="1735"/>
+            <w:tcMar>
+              <w:top w:type="dxa" w:w="60"/>
+              <w:left w:type="dxa" w:w="90"/>
+              <w:bottom w:type="dxa" w:w="60"/>
+              <w:right w:type="dxa" w:w="90"/>
+            </w:tcMar>
+          </w:tcPr>
+          <w:p>
+            <w:pPr>
+              <w:spacing w:after="40"/>
+            </w:pPr>
+            <w:r>
+              <w:rPr>
+                <w:sz w:val="18"/>
+                <w:szCs w:val="18"/>
+              </w:rPr>
+              <w:t xml:space="preserve">§4.10 (p. 49); §5.12 (p. 94)</w:t>
+            </w:r>
+          </w:p>
+        </w:tc>
+        <w:tc>
+          <w:tcPr>
+            <w:tcW w:type="dxa" w:w="1157"/>
+            <w:tcMar>
+              <w:top w:type="dxa" w:w="60"/>
+              <w:left w:type="dxa" w:w="90"/>
+              <w:bottom w:type="dxa" w:w="60"/>
+              <w:right w:type="dxa" w:w="90"/>
+            </w:tcMar>
+          </w:tcPr>
+          <w:p>
+            <w:pPr>
+              <w:spacing w:after="40"/>
+            </w:pPr>
+            <w:r>
+              <w:rPr>
+                <w:sz w:val="18"/>
+                <w:szCs w:val="18"/>
+              </w:rPr>
+              <w:t xml:space="preserve">Essential</w:t>
+            </w:r>
+          </w:p>
+        </w:tc>
+      </w:tr>
+      <w:tr>
+        <w:trPr>
+          <w:cantSplit w:val="off"/>
+        </w:trPr>
+        <w:tc>
+          <w:tcPr>
+            <w:tcW w:type="dxa" w:w="2313"/>
+            <w:tcMar>
+              <w:top w:type="dxa" w:w="60"/>
+              <w:left w:type="dxa" w:w="90"/>
+              <w:bottom w:type="dxa" w:w="60"/>
+              <w:right w:type="dxa" w:w="90"/>
+            </w:tcMar>
+          </w:tcPr>
+          <w:p>
+            <w:pPr>
+              <w:spacing w:after="40"/>
+            </w:pPr>
+            <w:r>
+              <w:rPr>
+                <w:sz w:val="18"/>
+                <w:szCs w:val="18"/>
+              </w:rPr>
+              <w:t xml:space="preserve">Tewari &amp; Ramanlal (2022)</w:t>
+            </w:r>
+          </w:p>
+        </w:tc>
+        <w:tc>
+          <w:tcPr>
+            <w:tcW w:type="dxa" w:w="4433"/>
+            <w:tcMar>
+              <w:top w:type="dxa" w:w="60"/>
+              <w:left w:type="dxa" w:w="90"/>
+              <w:bottom w:type="dxa" w:w="60"/>
+              <w:right w:type="dxa" w:w="90"/>
+            </w:tcMar>
+          </w:tcPr>
+          <w:p>
+            <w:pPr>
+              <w:spacing w:after="40"/>
+            </w:pPr>
+            <w:r>
+              <w:rPr>
+                <w:sz w:val="18"/>
+                <w:szCs w:val="18"/>
+              </w:rPr>
+              <w:t xml:space="preserve">The put reduces credit risk and agency conflicts, while the call mainly reduces interest-rate risk. This clarifies what each feature should do to yields.</w:t>
+            </w:r>
+          </w:p>
+        </w:tc>
+        <w:tc>
+          <w:tcPr>
+            <w:tcW w:type="dxa" w:w="1735"/>
+            <w:tcMar>
+              <w:top w:type="dxa" w:w="60"/>
+              <w:left w:type="dxa" w:w="90"/>
+              <w:bottom w:type="dxa" w:w="60"/>
+              <w:right w:type="dxa" w:w="90"/>
+            </w:tcMar>
+          </w:tcPr>
+          <w:p>
+            <w:pPr>
+              <w:spacing w:after="40"/>
+            </w:pPr>
+            <w:r>
+              <w:rPr>
+                <w:sz w:val="18"/>
+                <w:szCs w:val="18"/>
+              </w:rPr>
+              <w:t xml:space="preserve">§4.10; Chapter 2 framing</w:t>
+            </w:r>
+          </w:p>
+        </w:tc>
+        <w:tc>
+          <w:tcPr>
+            <w:tcW w:type="dxa" w:w="1157"/>
+            <w:tcMar>
+              <w:top w:type="dxa" w:w="60"/>
+              <w:left w:type="dxa" w:w="90"/>
+              <w:bottom w:type="dxa" w:w="60"/>
+              <w:right w:type="dxa" w:w="90"/>
+            </w:tcMar>
+          </w:tcPr>
+          <w:p>
+            <w:pPr>
+              <w:spacing w:after="40"/>
+            </w:pPr>
+            <w:r>
+              <w:rPr>
+                <w:sz w:val="18"/>
+                <w:szCs w:val="18"/>
+              </w:rPr>
+              <w:t xml:space="preserve">Recommended</w:t>
+            </w:r>
+          </w:p>
+        </w:tc>
+      </w:tr>
+      <w:tr>
+        <w:trPr>
+          <w:cantSplit w:val="off"/>
+        </w:trPr>
+        <w:tc>
+          <w:tcPr>
+            <w:tcW w:type="dxa" w:w="2313"/>
+            <w:tcMar>
+              <w:top w:type="dxa" w:w="60"/>
+              <w:left w:type="dxa" w:w="90"/>
+              <w:bottom w:type="dxa" w:w="60"/>
+              <w:right w:type="dxa" w:w="90"/>
+            </w:tcMar>
+          </w:tcPr>
+          <w:p>
+            <w:pPr>
+              <w:spacing w:after="40"/>
+            </w:pPr>
+            <w:r>
+              <w:rPr>
+                <w:sz w:val="18"/>
+                <w:szCs w:val="18"/>
+              </w:rPr>
+              <w:t xml:space="preserve">Bolton, Jiang &amp; Kartasheva (2023)</w:t>
+            </w:r>
+          </w:p>
+        </w:tc>
+        <w:tc>
+          <w:tcPr>
+            <w:tcW w:type="dxa" w:w="4433"/>
+            <w:tcMar>
+              <w:top w:type="dxa" w:w="60"/>
+              <w:left w:type="dxa" w:w="90"/>
+              <w:bottom w:type="dxa" w:w="60"/>
+              <w:right w:type="dxa" w:w="90"/>
+            </w:tcMar>
+          </w:tcPr>
+          <w:p>
+            <w:pPr>
+              <w:spacing w:after="40"/>
+            </w:pPr>
+            <w:r>
+              <w:rPr>
+                <w:sz w:val="18"/>
+                <w:szCs w:val="18"/>
+              </w:rPr>
+              <w:t xml:space="preserve">An analysis of the Credit Suisse AT1 write-down. You rely on BIS and Basel reports for March 2023 (p. 78). This is the academic source you need for an event test around that date.</w:t>
+            </w:r>
+          </w:p>
+        </w:tc>
+        <w:tc>
+          <w:tcPr>
+            <w:tcW w:type="dxa" w:w="1735"/>
+            <w:tcMar>
+              <w:top w:type="dxa" w:w="60"/>
+              <w:left w:type="dxa" w:w="90"/>
+              <w:bottom w:type="dxa" w:w="60"/>
+              <w:right w:type="dxa" w:w="90"/>
+            </w:tcMar>
+          </w:tcPr>
+          <w:p>
+            <w:pPr>
+              <w:spacing w:after="40"/>
+            </w:pPr>
+            <w:r>
+              <w:rPr>
+                <w:sz w:val="18"/>
+                <w:szCs w:val="18"/>
+              </w:rPr>
+              <w:t xml:space="preserve">§5.3 (p. 78); new event analysis (MI-1)</w:t>
+            </w:r>
+          </w:p>
+        </w:tc>
+        <w:tc>
+          <w:tcPr>
+            <w:tcW w:type="dxa" w:w="1157"/>
+            <w:tcMar>
+              <w:top w:type="dxa" w:w="60"/>
+              <w:left w:type="dxa" w:w="90"/>
+              <w:bottom w:type="dxa" w:w="60"/>
+              <w:right w:type="dxa" w:w="90"/>
+            </w:tcMar>
+          </w:tcPr>
+          <w:p>
+            <w:pPr>
+              <w:spacing w:after="40"/>
+            </w:pPr>
+            <w:r>
+              <w:rPr>
+                <w:sz w:val="18"/>
+                <w:szCs w:val="18"/>
+              </w:rPr>
+              <w:t xml:space="preserve">Essential</w:t>
+            </w:r>
+          </w:p>
+        </w:tc>
+      </w:tr>
+      <w:tr>
+        <w:trPr>
+          <w:cantSplit w:val="off"/>
+        </w:trPr>
+        <w:tc>
+          <w:tcPr>
+            <w:tcW w:type="dxa" w:w="2313"/>
+            <w:tcMar>
+              <w:top w:type="dxa" w:w="60"/>
+              <w:left w:type="dxa" w:w="90"/>
+              <w:bottom w:type="dxa" w:w="60"/>
+              <w:right w:type="dxa" w:w="90"/>
+            </w:tcMar>
+          </w:tcPr>
+          <w:p>
+            <w:pPr>
+              <w:spacing w:after="40"/>
+            </w:pPr>
+            <w:r>
+              <w:rPr>
+                <w:sz w:val="18"/>
+                <w:szCs w:val="18"/>
+              </w:rPr>
+              <w:t xml:space="preserve">Salhani &amp; Mouselli (2022)</w:t>
+            </w:r>
+          </w:p>
+        </w:tc>
+        <w:tc>
+          <w:tcPr>
+            <w:tcW w:type="dxa" w:w="4433"/>
+            <w:tcMar>
+              <w:top w:type="dxa" w:w="60"/>
+              <w:left w:type="dxa" w:w="90"/>
+              <w:bottom w:type="dxa" w:w="60"/>
+              <w:right w:type="dxa" w:w="90"/>
+            </w:tcMar>
+          </w:tcPr>
+          <w:p>
+            <w:pPr>
+              <w:spacing w:after="40"/>
+            </w:pPr>
+            <w:r>
+              <w:rPr>
+                <w:sz w:val="18"/>
+                <w:szCs w:val="18"/>
+              </w:rPr>
+              <w:t xml:space="preserve">The only empirical study I found on Tier 1 sukuk: it finds them cheaper than equity for UAE Islamic banks. It helps place your ~100 bp AT1 premium between senior debt and equity.</w:t>
+            </w:r>
+          </w:p>
+        </w:tc>
+        <w:tc>
+          <w:tcPr>
+            <w:tcW w:type="dxa" w:w="1735"/>
+            <w:tcMar>
+              <w:top w:type="dxa" w:w="60"/>
+              <w:left w:type="dxa" w:w="90"/>
+              <w:bottom w:type="dxa" w:w="60"/>
+              <w:right w:type="dxa" w:w="90"/>
+            </w:tcMar>
+          </w:tcPr>
+          <w:p>
+            <w:pPr>
+              <w:spacing w:after="40"/>
+            </w:pPr>
+            <w:r>
+              <w:rPr>
+                <w:sz w:val="18"/>
+                <w:szCs w:val="18"/>
+              </w:rPr>
+              <w:t xml:space="preserve">§5.3 (pp. 76–80)</w:t>
+            </w:r>
+          </w:p>
+        </w:tc>
+        <w:tc>
+          <w:tcPr>
+            <w:tcW w:type="dxa" w:w="1157"/>
+            <w:tcMar>
+              <w:top w:type="dxa" w:w="60"/>
+              <w:left w:type="dxa" w:w="90"/>
+              <w:bottom w:type="dxa" w:w="60"/>
+              <w:right w:type="dxa" w:w="90"/>
+            </w:tcMar>
+          </w:tcPr>
+          <w:p>
+            <w:pPr>
+              <w:spacing w:after="40"/>
+            </w:pPr>
+            <w:r>
+              <w:rPr>
+                <w:sz w:val="18"/>
+                <w:szCs w:val="18"/>
+              </w:rPr>
+              <w:t xml:space="preserve">Essential</w:t>
+            </w:r>
+          </w:p>
+        </w:tc>
+      </w:tr>
+      <w:tr>
+        <w:trPr>
+          <w:cantSplit w:val="off"/>
+        </w:trPr>
+        <w:tc>
+          <w:tcPr>
+            <w:tcW w:type="dxa" w:w="2313"/>
+            <w:tcMar>
+              <w:top w:type="dxa" w:w="60"/>
+              <w:left w:type="dxa" w:w="90"/>
+              <w:bottom w:type="dxa" w:w="60"/>
+              <w:right w:type="dxa" w:w="90"/>
+            </w:tcMar>
+          </w:tcPr>
+          <w:p>
+            <w:pPr>
+              <w:spacing w:after="40"/>
+            </w:pPr>
+            <w:r>
+              <w:rPr>
+                <w:sz w:val="18"/>
+                <w:szCs w:val="18"/>
+              </w:rPr>
+              <w:t xml:space="preserve">Nasr &amp; Hasan (2024)</w:t>
+            </w:r>
+          </w:p>
+        </w:tc>
+        <w:tc>
+          <w:tcPr>
+            <w:tcW w:type="dxa" w:w="4433"/>
+            <w:tcMar>
+              <w:top w:type="dxa" w:w="60"/>
+              <w:left w:type="dxa" w:w="90"/>
+              <w:bottom w:type="dxa" w:w="60"/>
+              <w:right w:type="dxa" w:w="90"/>
+            </w:tcMar>
+          </w:tcPr>
+          <w:p>
+            <w:pPr>
+              <w:spacing w:after="40"/>
+            </w:pPr>
+            <w:r>
+              <w:rPr>
+                <w:sz w:val="18"/>
+                <w:szCs w:val="18"/>
+              </w:rPr>
+              <w:t xml:space="preserve">Reviews Shari’ah issues in Tier 1 sukuk, including how deferred profit payments are treated. This is the sukuk-specific side of coupon discretion that your AT1 discussion currently lacks.</w:t>
+            </w:r>
+          </w:p>
+        </w:tc>
+        <w:tc>
+          <w:tcPr>
+            <w:tcW w:type="dxa" w:w="1735"/>
+            <w:tcMar>
+              <w:top w:type="dxa" w:w="60"/>
+              <w:left w:type="dxa" w:w="90"/>
+              <w:bottom w:type="dxa" w:w="60"/>
+              <w:right w:type="dxa" w:w="90"/>
+            </w:tcMar>
+          </w:tcPr>
+          <w:p>
+            <w:pPr>
+              <w:spacing w:after="40"/>
+            </w:pPr>
+            <w:r>
+              <w:rPr>
+                <w:sz w:val="18"/>
+                <w:szCs w:val="18"/>
+              </w:rPr>
+              <w:t xml:space="preserve">§5.3; §5.5 (pp. 85–86)</w:t>
+            </w:r>
+          </w:p>
+        </w:tc>
+        <w:tc>
+          <w:tcPr>
+            <w:tcW w:type="dxa" w:w="1157"/>
+            <w:tcMar>
+              <w:top w:type="dxa" w:w="60"/>
+              <w:left w:type="dxa" w:w="90"/>
+              <w:bottom w:type="dxa" w:w="60"/>
+              <w:right w:type="dxa" w:w="90"/>
+            </w:tcMar>
+          </w:tcPr>
+          <w:p>
+            <w:pPr>
+              <w:spacing w:after="40"/>
+            </w:pPr>
+            <w:r>
+              <w:rPr>
+                <w:sz w:val="18"/>
+                <w:szCs w:val="18"/>
+              </w:rPr>
+              <w:t xml:space="preserve">Recommended</w:t>
+            </w:r>
+          </w:p>
+        </w:tc>
+      </w:tr>
+    </w:tbl>
+    <w:p>
+      <w:pPr>
+        <w:spacing w:after="60"/>
+      </w:pPr>
+    </w:p>
+    <w:p>
+      <w:pPr>
+        <w:pStyle w:val="Heading2"/>
+      </w:pPr>
+      <w:r>
+        <w:t xml:space="preserve">4.2 Objective (a): labelled and sustainability instruments</w:t>
+      </w:r>
+    </w:p>
+    <w:tbl>
+      <w:tblPr>
+        <w:tblW w:type="dxa" w:w="9638"/>
+        <w:tblBorders>
+          <w:top w:val="single" w:color="auto" w:sz="4"/>
+          <w:left w:val="single" w:color="auto" w:sz="4"/>
+          <w:bottom w:val="single" w:color="auto" w:sz="4"/>
+          <w:right w:val="single" w:color="auto" w:sz="4"/>
+          <w:insideH w:val="single" w:color="auto" w:sz="4"/>
+          <w:insideV w:val="single" w:color="auto" w:sz="4"/>
+        </w:tblBorders>
+      </w:tblPr>
+      <w:tblGrid>
+        <w:gridCol w:w="2313"/>
+        <w:gridCol w:w="4433"/>
+        <w:gridCol w:w="1735"/>
+        <w:gridCol w:w="1157"/>
+      </w:tblGrid>
+      <w:tr>
+        <w:trPr>
+          <w:tblHeader/>
+        </w:trPr>
+        <w:tc>
+          <w:tcPr>
+            <w:tcW w:type="dxa" w:w="2313"/>
+            <w:shd w:fill="1F3864" w:color="auto" w:val="clear"/>
+            <w:tcMar>
+              <w:top w:type="dxa" w:w="60"/>
+              <w:left w:type="dxa" w:w="90"/>
+              <w:bottom w:type="dxa" w:w="60"/>
+              <w:right w:type="dxa" w:w="90"/>
+            </w:tcMar>
+          </w:tcPr>
+          <w:p>
+            <w:pPr>
+              <w:spacing w:after="40"/>
+            </w:pPr>
+            <w:r>
+              <w:rPr>
+                <w:b/>
+                <w:bCs/>
+                <w:color w:val="FFFFFF"/>
+                <w:sz w:val="18"/>
+                <w:szCs w:val="18"/>
+              </w:rPr>
+              <w:t xml:space="preserve">Source</w:t>
+            </w:r>
+          </w:p>
+        </w:tc>
+        <w:tc>
+          <w:tcPr>
+            <w:tcW w:type="dxa" w:w="4433"/>
+            <w:shd w:fill="1F3864" w:color="auto" w:val="clear"/>
+            <w:tcMar>
+              <w:top w:type="dxa" w:w="60"/>
+              <w:left w:type="dxa" w:w="90"/>
+              <w:bottom w:type="dxa" w:w="60"/>
+              <w:right w:type="dxa" w:w="90"/>
+            </w:tcMar>
+          </w:tcPr>
+          <w:p>
+            <w:pPr>
+              <w:spacing w:after="40"/>
+            </w:pPr>
+            <w:r>
+              <w:rPr>
+                <w:b/>
+                <w:bCs/>
+                <w:color w:val="FFFFFF"/>
+                <w:sz w:val="18"/>
+                <w:szCs w:val="18"/>
+              </w:rPr>
+              <w:t xml:space="preserve">Why it matters for your study</w:t>
+            </w:r>
+          </w:p>
+        </w:tc>
+        <w:tc>
+          <w:tcPr>
+            <w:tcW w:type="dxa" w:w="1735"/>
+            <w:shd w:fill="1F3864" w:color="auto" w:val="clear"/>
+            <w:tcMar>
+              <w:top w:type="dxa" w:w="60"/>
+              <w:left w:type="dxa" w:w="90"/>
+              <w:bottom w:type="dxa" w:w="60"/>
+              <w:right w:type="dxa" w:w="90"/>
+            </w:tcMar>
+          </w:tcPr>
+          <w:p>
+            <w:pPr>
+              <w:spacing w:after="40"/>
+            </w:pPr>
+            <w:r>
+              <w:rPr>
+                <w:b/>
+                <w:bCs/>
+                <w:color w:val="FFFFFF"/>
+                <w:sz w:val="18"/>
+                <w:szCs w:val="18"/>
+              </w:rPr>
+              <w:t xml:space="preserve">Where to use it</w:t>
+            </w:r>
+          </w:p>
+        </w:tc>
+        <w:tc>
+          <w:tcPr>
+            <w:tcW w:type="dxa" w:w="1157"/>
+            <w:shd w:fill="1F3864" w:color="auto" w:val="clear"/>
+            <w:tcMar>
+              <w:top w:type="dxa" w:w="60"/>
+              <w:left w:type="dxa" w:w="90"/>
+              <w:bottom w:type="dxa" w:w="60"/>
+              <w:right w:type="dxa" w:w="90"/>
+            </w:tcMar>
+          </w:tcPr>
+          <w:p>
+            <w:pPr>
+              <w:spacing w:after="40"/>
+            </w:pPr>
+            <w:r>
+              <w:rPr>
+                <w:b/>
+                <w:bCs/>
+                <w:color w:val="FFFFFF"/>
+                <w:sz w:val="18"/>
+                <w:szCs w:val="18"/>
+              </w:rPr>
+              <w:t xml:space="preserve">Priority</w:t>
+            </w:r>
+          </w:p>
+        </w:tc>
+      </w:tr>
+      <w:tr>
+        <w:trPr>
+          <w:cantSplit w:val="off"/>
+        </w:trPr>
+        <w:tc>
+          <w:tcPr>
+            <w:tcW w:type="dxa" w:w="2313"/>
+            <w:tcMar>
+              <w:top w:type="dxa" w:w="60"/>
+              <w:left w:type="dxa" w:w="90"/>
+              <w:bottom w:type="dxa" w:w="60"/>
+              <w:right w:type="dxa" w:w="90"/>
+            </w:tcMar>
+          </w:tcPr>
+          <w:p>
+            <w:pPr>
+              <w:spacing w:after="40"/>
+            </w:pPr>
+            <w:r>
+              <w:rPr>
+                <w:sz w:val="18"/>
+                <w:szCs w:val="18"/>
+              </w:rPr>
+              <w:t xml:space="preserve">Fatica, Panzica &amp; Rancan (2021)</w:t>
+            </w:r>
+          </w:p>
+        </w:tc>
+        <w:tc>
+          <w:tcPr>
+            <w:tcW w:type="dxa" w:w="4433"/>
+            <w:tcMar>
+              <w:top w:type="dxa" w:w="60"/>
+              <w:left w:type="dxa" w:w="90"/>
+              <w:bottom w:type="dxa" w:w="60"/>
+              <w:right w:type="dxa" w:w="90"/>
+            </w:tcMar>
+          </w:tcPr>
+          <w:p>
+            <w:pPr>
+              <w:spacing w:after="40"/>
+            </w:pPr>
+            <w:r>
+              <w:rPr>
+                <w:sz w:val="18"/>
+                <w:szCs w:val="18"/>
+              </w:rPr>
+              <w:t xml:space="preserve">There is a greenium for supranational and corporate issuers but </w:t>
+            </w:r>
+            <w:r>
+              <w:rPr>
+                <w:b/>
+                <w:bCs/>
+                <w:sz w:val="18"/>
+                <w:szCs w:val="18"/>
+              </w:rPr>
+              <w:t xml:space="preserve">not for financial institutions</w:t>
+            </w:r>
+            <w:r>
+              <w:rPr>
+                <w:sz w:val="18"/>
+                <w:szCs w:val="18"/>
+              </w:rPr>
+              <w:t xml:space="preserve">, and external review increases it. Several of your labelled issuers are banks. This helps explain why your full-horizon label result is not significant.</w:t>
+            </w:r>
+          </w:p>
+        </w:tc>
+        <w:tc>
+          <w:tcPr>
+            <w:tcW w:type="dxa" w:w="1735"/>
+            <w:tcMar>
+              <w:top w:type="dxa" w:w="60"/>
+              <w:left w:type="dxa" w:w="90"/>
+              <w:bottom w:type="dxa" w:w="60"/>
+              <w:right w:type="dxa" w:w="90"/>
+            </w:tcMar>
+          </w:tcPr>
+          <w:p>
+            <w:pPr>
+              <w:spacing w:after="40"/>
+            </w:pPr>
+            <w:r>
+              <w:rPr>
+                <w:sz w:val="18"/>
+                <w:szCs w:val="18"/>
+              </w:rPr>
+              <w:t xml:space="preserve">§5.4 (pp. 80–85)</w:t>
+            </w:r>
+          </w:p>
+        </w:tc>
+        <w:tc>
+          <w:tcPr>
+            <w:tcW w:type="dxa" w:w="1157"/>
+            <w:tcMar>
+              <w:top w:type="dxa" w:w="60"/>
+              <w:left w:type="dxa" w:w="90"/>
+              <w:bottom w:type="dxa" w:w="60"/>
+              <w:right w:type="dxa" w:w="90"/>
+            </w:tcMar>
+          </w:tcPr>
+          <w:p>
+            <w:pPr>
+              <w:spacing w:after="40"/>
+            </w:pPr>
+            <w:r>
+              <w:rPr>
+                <w:sz w:val="18"/>
+                <w:szCs w:val="18"/>
+              </w:rPr>
+              <w:t xml:space="preserve">Essential</w:t>
+            </w:r>
+          </w:p>
+        </w:tc>
+      </w:tr>
+      <w:tr>
+        <w:trPr>
+          <w:cantSplit w:val="off"/>
+        </w:trPr>
+        <w:tc>
+          <w:tcPr>
+            <w:tcW w:type="dxa" w:w="2313"/>
+            <w:tcMar>
+              <w:top w:type="dxa" w:w="60"/>
+              <w:left w:type="dxa" w:w="90"/>
+              <w:bottom w:type="dxa" w:w="60"/>
+              <w:right w:type="dxa" w:w="90"/>
+            </w:tcMar>
+          </w:tcPr>
+          <w:p>
+            <w:pPr>
+              <w:spacing w:after="40"/>
+            </w:pPr>
+            <w:r>
+              <w:rPr>
+                <w:sz w:val="18"/>
+                <w:szCs w:val="18"/>
+              </w:rPr>
+              <w:t xml:space="preserve">Dorfleitner, Utz &amp; Zhang (2021)</w:t>
+            </w:r>
+          </w:p>
+        </w:tc>
+        <w:tc>
+          <w:tcPr>
+            <w:tcW w:type="dxa" w:w="4433"/>
+            <w:tcMar>
+              <w:top w:type="dxa" w:w="60"/>
+              <w:left w:type="dxa" w:w="90"/>
+              <w:bottom w:type="dxa" w:w="60"/>
+              <w:right w:type="dxa" w:w="90"/>
+            </w:tcMar>
+          </w:tcPr>
+          <w:p>
+            <w:pPr>
+              <w:spacing w:after="40"/>
+            </w:pPr>
+            <w:r>
+              <w:rPr>
+                <w:sz w:val="18"/>
+                <w:szCs w:val="18"/>
+              </w:rPr>
+              <w:t xml:space="preserve">The green premium rises with the strength of external review. This is the direct literature for your verification split, which currently has no reference.</w:t>
+            </w:r>
+          </w:p>
+        </w:tc>
+        <w:tc>
+          <w:tcPr>
+            <w:tcW w:type="dxa" w:w="1735"/>
+            <w:tcMar>
+              <w:top w:type="dxa" w:w="60"/>
+              <w:left w:type="dxa" w:w="90"/>
+              <w:bottom w:type="dxa" w:w="60"/>
+              <w:right w:type="dxa" w:w="90"/>
+            </w:tcMar>
+          </w:tcPr>
+          <w:p>
+            <w:pPr>
+              <w:spacing w:after="40"/>
+            </w:pPr>
+            <w:r>
+              <w:rPr>
+                <w:sz w:val="18"/>
+                <w:szCs w:val="18"/>
+              </w:rPr>
+              <w:t xml:space="preserve">§4.7 (pp. 40–41); §5.4</w:t>
+            </w:r>
+          </w:p>
+        </w:tc>
+        <w:tc>
+          <w:tcPr>
+            <w:tcW w:type="dxa" w:w="1157"/>
+            <w:tcMar>
+              <w:top w:type="dxa" w:w="60"/>
+              <w:left w:type="dxa" w:w="90"/>
+              <w:bottom w:type="dxa" w:w="60"/>
+              <w:right w:type="dxa" w:w="90"/>
+            </w:tcMar>
+          </w:tcPr>
+          <w:p>
+            <w:pPr>
+              <w:spacing w:after="40"/>
+            </w:pPr>
+            <w:r>
+              <w:rPr>
+                <w:sz w:val="18"/>
+                <w:szCs w:val="18"/>
+              </w:rPr>
+              <w:t xml:space="preserve">Essential</w:t>
+            </w:r>
+          </w:p>
+        </w:tc>
+      </w:tr>
+      <w:tr>
+        <w:trPr>
+          <w:cantSplit w:val="off"/>
+        </w:trPr>
+        <w:tc>
+          <w:tcPr>
+            <w:tcW w:type="dxa" w:w="2313"/>
+            <w:tcMar>
+              <w:top w:type="dxa" w:w="60"/>
+              <w:left w:type="dxa" w:w="90"/>
+              <w:bottom w:type="dxa" w:w="60"/>
+              <w:right w:type="dxa" w:w="90"/>
+            </w:tcMar>
+          </w:tcPr>
+          <w:p>
+            <w:pPr>
+              <w:spacing w:after="40"/>
+            </w:pPr>
+            <w:r>
+              <w:rPr>
+                <w:sz w:val="18"/>
+                <w:szCs w:val="18"/>
+              </w:rPr>
+              <w:t xml:space="preserve">Sun, Feng &amp; Zhou (2022)</w:t>
+            </w:r>
+          </w:p>
+        </w:tc>
+        <w:tc>
+          <w:tcPr>
+            <w:tcW w:type="dxa" w:w="4433"/>
+            <w:tcMar>
+              <w:top w:type="dxa" w:w="60"/>
+              <w:left w:type="dxa" w:w="90"/>
+              <w:bottom w:type="dxa" w:w="60"/>
+              <w:right w:type="dxa" w:w="90"/>
+            </w:tcMar>
+          </w:tcPr>
+          <w:p>
+            <w:pPr>
+              <w:spacing w:after="40"/>
+            </w:pPr>
+            <w:r>
+              <w:rPr>
+                <w:sz w:val="18"/>
+                <w:szCs w:val="18"/>
+              </w:rPr>
+              <w:t xml:space="preserve">Third-party certification strengthens the greenium, and financial green bonds show none. This supports Fatica et al. (2021), in an emerging market.</w:t>
+            </w:r>
+          </w:p>
+        </w:tc>
+        <w:tc>
+          <w:tcPr>
+            <w:tcW w:type="dxa" w:w="1735"/>
+            <w:tcMar>
+              <w:top w:type="dxa" w:w="60"/>
+              <w:left w:type="dxa" w:w="90"/>
+              <w:bottom w:type="dxa" w:w="60"/>
+              <w:right w:type="dxa" w:w="90"/>
+            </w:tcMar>
+          </w:tcPr>
+          <w:p>
+            <w:pPr>
+              <w:spacing w:after="40"/>
+            </w:pPr>
+            <w:r>
+              <w:rPr>
+                <w:sz w:val="18"/>
+                <w:szCs w:val="18"/>
+              </w:rPr>
+              <w:t xml:space="preserve">§5.4</w:t>
+            </w:r>
+          </w:p>
+        </w:tc>
+        <w:tc>
+          <w:tcPr>
+            <w:tcW w:type="dxa" w:w="1157"/>
+            <w:tcMar>
+              <w:top w:type="dxa" w:w="60"/>
+              <w:left w:type="dxa" w:w="90"/>
+              <w:bottom w:type="dxa" w:w="60"/>
+              <w:right w:type="dxa" w:w="90"/>
+            </w:tcMar>
+          </w:tcPr>
+          <w:p>
+            <w:pPr>
+              <w:spacing w:after="40"/>
+            </w:pPr>
+            <w:r>
+              <w:rPr>
+                <w:sz w:val="18"/>
+                <w:szCs w:val="18"/>
+              </w:rPr>
+              <w:t xml:space="preserve">Recommended</w:t>
+            </w:r>
+          </w:p>
+        </w:tc>
+      </w:tr>
+      <w:tr>
+        <w:trPr>
+          <w:cantSplit w:val="off"/>
+        </w:trPr>
+        <w:tc>
+          <w:tcPr>
+            <w:tcW w:type="dxa" w:w="2313"/>
+            <w:tcMar>
+              <w:top w:type="dxa" w:w="60"/>
+              <w:left w:type="dxa" w:w="90"/>
+              <w:bottom w:type="dxa" w:w="60"/>
+              <w:right w:type="dxa" w:w="90"/>
+            </w:tcMar>
+          </w:tcPr>
+          <w:p>
+            <w:pPr>
+              <w:spacing w:after="40"/>
+            </w:pPr>
+            <w:r>
+              <w:rPr>
+                <w:sz w:val="18"/>
+                <w:szCs w:val="18"/>
+              </w:rPr>
+              <w:t xml:space="preserve">Sheng, Zheng &amp; Zhong (2021)</w:t>
+            </w:r>
+          </w:p>
+        </w:tc>
+        <w:tc>
+          <w:tcPr>
+            <w:tcW w:type="dxa" w:w="4433"/>
+            <w:tcMar>
+              <w:top w:type="dxa" w:w="60"/>
+              <w:left w:type="dxa" w:w="90"/>
+              <w:bottom w:type="dxa" w:w="60"/>
+              <w:right w:type="dxa" w:w="90"/>
+            </w:tcMar>
+          </w:tcPr>
+          <w:p>
+            <w:pPr>
+              <w:spacing w:after="40"/>
+            </w:pPr>
+            <w:r>
+              <w:rPr>
+                <w:sz w:val="18"/>
+                <w:szCs w:val="18"/>
+              </w:rPr>
+              <w:t xml:space="preserve">The greenium is larger for state-owned issuers and depends on verification. This is relevant to your sovereign and state-linked issuers (Indonesia, Saudi Electricity).</w:t>
+            </w:r>
+          </w:p>
+        </w:tc>
+        <w:tc>
+          <w:tcPr>
+            <w:tcW w:type="dxa" w:w="1735"/>
+            <w:tcMar>
+              <w:top w:type="dxa" w:w="60"/>
+              <w:left w:type="dxa" w:w="90"/>
+              <w:bottom w:type="dxa" w:w="60"/>
+              <w:right w:type="dxa" w:w="90"/>
+            </w:tcMar>
+          </w:tcPr>
+          <w:p>
+            <w:pPr>
+              <w:spacing w:after="40"/>
+            </w:pPr>
+            <w:r>
+              <w:rPr>
+                <w:sz w:val="18"/>
+                <w:szCs w:val="18"/>
+              </w:rPr>
+              <w:t xml:space="preserve">§5.4</w:t>
+            </w:r>
+          </w:p>
+        </w:tc>
+        <w:tc>
+          <w:tcPr>
+            <w:tcW w:type="dxa" w:w="1157"/>
+            <w:tcMar>
+              <w:top w:type="dxa" w:w="60"/>
+              <w:left w:type="dxa" w:w="90"/>
+              <w:bottom w:type="dxa" w:w="60"/>
+              <w:right w:type="dxa" w:w="90"/>
+            </w:tcMar>
+          </w:tcPr>
+          <w:p>
+            <w:pPr>
+              <w:spacing w:after="40"/>
+            </w:pPr>
+            <w:r>
+              <w:rPr>
+                <w:sz w:val="18"/>
+                <w:szCs w:val="18"/>
+              </w:rPr>
+              <w:t xml:space="preserve">Recommended</w:t>
+            </w:r>
+          </w:p>
+        </w:tc>
+      </w:tr>
+      <w:tr>
+        <w:trPr>
+          <w:cantSplit w:val="off"/>
+        </w:trPr>
+        <w:tc>
+          <w:tcPr>
+            <w:tcW w:type="dxa" w:w="2313"/>
+            <w:tcMar>
+              <w:top w:type="dxa" w:w="60"/>
+              <w:left w:type="dxa" w:w="90"/>
+              <w:bottom w:type="dxa" w:w="60"/>
+              <w:right w:type="dxa" w:w="90"/>
+            </w:tcMar>
+          </w:tcPr>
+          <w:p>
+            <w:pPr>
+              <w:spacing w:after="40"/>
+            </w:pPr>
+            <w:r>
+              <w:rPr>
+                <w:sz w:val="18"/>
+                <w:szCs w:val="18"/>
+              </w:rPr>
+              <w:t xml:space="preserve">Wollny, Derwall &amp; Galema (2026) [WP]</w:t>
+            </w:r>
+          </w:p>
+        </w:tc>
+        <w:tc>
+          <w:tcPr>
+            <w:tcW w:type="dxa" w:w="4433"/>
+            <w:tcMar>
+              <w:top w:type="dxa" w:w="60"/>
+              <w:left w:type="dxa" w:w="90"/>
+              <w:bottom w:type="dxa" w:w="60"/>
+              <w:right w:type="dxa" w:w="90"/>
+            </w:tcMar>
+          </w:tcPr>
+          <w:p>
+            <w:pPr>
+              <w:spacing w:after="40"/>
+            </w:pPr>
+            <w:r>
+              <w:rPr>
+                <w:sz w:val="18"/>
+                <w:szCs w:val="18"/>
+              </w:rPr>
+              <w:t xml:space="preserve">The corporate greenium disappeared and </w:t>
+            </w:r>
+            <w:r>
+              <w:rPr>
+                <w:b/>
+                <w:bCs/>
+                <w:sz w:val="18"/>
+                <w:szCs w:val="18"/>
+              </w:rPr>
+              <w:t xml:space="preserve">reversed from 2023</w:t>
+            </w:r>
+            <w:r>
+              <w:rPr>
+                <w:sz w:val="18"/>
+                <w:szCs w:val="18"/>
+              </w:rPr>
+              <w:t xml:space="preserve">: green bonds yielded 6.4 bp more in 2024. This is a direct explanation for why your label result turns positive on the full horizon to August 2026.</w:t>
+            </w:r>
+          </w:p>
+        </w:tc>
+        <w:tc>
+          <w:tcPr>
+            <w:tcW w:type="dxa" w:w="1735"/>
+            <w:tcMar>
+              <w:top w:type="dxa" w:w="60"/>
+              <w:left w:type="dxa" w:w="90"/>
+              <w:bottom w:type="dxa" w:w="60"/>
+              <w:right w:type="dxa" w:w="90"/>
+            </w:tcMar>
+          </w:tcPr>
+          <w:p>
+            <w:pPr>
+              <w:spacing w:after="40"/>
+            </w:pPr>
+            <w:r>
+              <w:rPr>
+                <w:sz w:val="18"/>
+                <w:szCs w:val="18"/>
+              </w:rPr>
+              <w:t xml:space="preserve">§4.5 (p. 33); §5.4 (p. 80)</w:t>
+            </w:r>
+          </w:p>
+        </w:tc>
+        <w:tc>
+          <w:tcPr>
+            <w:tcW w:type="dxa" w:w="1157"/>
+            <w:tcMar>
+              <w:top w:type="dxa" w:w="60"/>
+              <w:left w:type="dxa" w:w="90"/>
+              <w:bottom w:type="dxa" w:w="60"/>
+              <w:right w:type="dxa" w:w="90"/>
+            </w:tcMar>
+          </w:tcPr>
+          <w:p>
+            <w:pPr>
+              <w:spacing w:after="40"/>
+            </w:pPr>
+            <w:r>
+              <w:rPr>
+                <w:sz w:val="18"/>
+                <w:szCs w:val="18"/>
+              </w:rPr>
+              <w:t xml:space="preserve">Essential</w:t>
+            </w:r>
+          </w:p>
+        </w:tc>
+      </w:tr>
+      <w:tr>
+        <w:trPr>
+          <w:cantSplit w:val="off"/>
+        </w:trPr>
+        <w:tc>
+          <w:tcPr>
+            <w:tcW w:type="dxa" w:w="2313"/>
+            <w:tcMar>
+              <w:top w:type="dxa" w:w="60"/>
+              <w:left w:type="dxa" w:w="90"/>
+              <w:bottom w:type="dxa" w:w="60"/>
+              <w:right w:type="dxa" w:w="90"/>
+            </w:tcMar>
+          </w:tcPr>
+          <w:p>
+            <w:pPr>
+              <w:spacing w:after="40"/>
+            </w:pPr>
+            <w:r>
+              <w:rPr>
+                <w:sz w:val="18"/>
+                <w:szCs w:val="18"/>
+              </w:rPr>
+              <w:t xml:space="preserve">Lehkonen, Heimonen &amp; Simola (2025) [WP]</w:t>
+            </w:r>
+          </w:p>
+        </w:tc>
+        <w:tc>
+          <w:tcPr>
+            <w:tcW w:type="dxa" w:w="4433"/>
+            <w:tcMar>
+              <w:top w:type="dxa" w:w="60"/>
+              <w:left w:type="dxa" w:w="90"/>
+              <w:bottom w:type="dxa" w:w="60"/>
+              <w:right w:type="dxa" w:w="90"/>
+            </w:tcMar>
+          </w:tcPr>
+          <w:p>
+            <w:pPr>
+              <w:spacing w:after="40"/>
+            </w:pPr>
+            <w:r>
+              <w:rPr>
+                <w:sz w:val="18"/>
+                <w:szCs w:val="18"/>
+              </w:rPr>
+              <w:t xml:space="preserve">The greenium shrinks as the market saturates and moves with climate concern and policy uncertainty. It supports treating the label premium as time-varying.</w:t>
+            </w:r>
+          </w:p>
+        </w:tc>
+        <w:tc>
+          <w:tcPr>
+            <w:tcW w:type="dxa" w:w="1735"/>
+            <w:tcMar>
+              <w:top w:type="dxa" w:w="60"/>
+              <w:left w:type="dxa" w:w="90"/>
+              <w:bottom w:type="dxa" w:w="60"/>
+              <w:right w:type="dxa" w:w="90"/>
+            </w:tcMar>
+          </w:tcPr>
+          <w:p>
+            <w:pPr>
+              <w:spacing w:after="40"/>
+            </w:pPr>
+            <w:r>
+              <w:rPr>
+                <w:sz w:val="18"/>
+                <w:szCs w:val="18"/>
+              </w:rPr>
+              <w:t xml:space="preserve">§5.4; determinants model</w:t>
+            </w:r>
+          </w:p>
+        </w:tc>
+        <w:tc>
+          <w:tcPr>
+            <w:tcW w:type="dxa" w:w="1157"/>
+            <w:tcMar>
+              <w:top w:type="dxa" w:w="60"/>
+              <w:left w:type="dxa" w:w="90"/>
+              <w:bottom w:type="dxa" w:w="60"/>
+              <w:right w:type="dxa" w:w="90"/>
+            </w:tcMar>
+          </w:tcPr>
+          <w:p>
+            <w:pPr>
+              <w:spacing w:after="40"/>
+            </w:pPr>
+            <w:r>
+              <w:rPr>
+                <w:sz w:val="18"/>
+                <w:szCs w:val="18"/>
+              </w:rPr>
+              <w:t xml:space="preserve">Recommended</w:t>
+            </w:r>
+          </w:p>
+        </w:tc>
+      </w:tr>
+      <w:tr>
+        <w:trPr>
+          <w:cantSplit w:val="off"/>
+        </w:trPr>
+        <w:tc>
+          <w:tcPr>
+            <w:tcW w:type="dxa" w:w="2313"/>
+            <w:tcMar>
+              <w:top w:type="dxa" w:w="60"/>
+              <w:left w:type="dxa" w:w="90"/>
+              <w:bottom w:type="dxa" w:w="60"/>
+              <w:right w:type="dxa" w:w="90"/>
+            </w:tcMar>
+          </w:tcPr>
+          <w:p>
+            <w:pPr>
+              <w:spacing w:after="40"/>
+            </w:pPr>
+            <w:r>
+              <w:rPr>
+                <w:sz w:val="18"/>
+                <w:szCs w:val="18"/>
+              </w:rPr>
+              <w:t xml:space="preserve">Latif, Husodo &amp; Hendranastiti (2026) [WP]</w:t>
+            </w:r>
+          </w:p>
+        </w:tc>
+        <w:tc>
+          <w:tcPr>
+            <w:tcW w:type="dxa" w:w="4433"/>
+            <w:tcMar>
+              <w:top w:type="dxa" w:w="60"/>
+              <w:left w:type="dxa" w:w="90"/>
+              <w:bottom w:type="dxa" w:w="60"/>
+              <w:right w:type="dxa" w:w="90"/>
+            </w:tcMar>
+          </w:tcPr>
+          <w:p>
+            <w:pPr>
+              <w:spacing w:after="40"/>
+            </w:pPr>
+            <w:r>
+              <w:rPr>
+                <w:sz w:val="18"/>
+                <w:szCs w:val="18"/>
+              </w:rPr>
+              <w:t xml:space="preserve">Reports large greeniums for Indonesian green sukuk (primary market). Your window result is concentrated in the Indonesian sovereign programme. This paper lets you present that as a finding rather than only as a threat.</w:t>
+            </w:r>
+          </w:p>
+        </w:tc>
+        <w:tc>
+          <w:tcPr>
+            <w:tcW w:type="dxa" w:w="1735"/>
+            <w:tcMar>
+              <w:top w:type="dxa" w:w="60"/>
+              <w:left w:type="dxa" w:w="90"/>
+              <w:bottom w:type="dxa" w:w="60"/>
+              <w:right w:type="dxa" w:w="90"/>
+            </w:tcMar>
+          </w:tcPr>
+          <w:p>
+            <w:pPr>
+              <w:spacing w:after="40"/>
+            </w:pPr>
+            <w:r>
+              <w:rPr>
+                <w:sz w:val="18"/>
+                <w:szCs w:val="18"/>
+              </w:rPr>
+              <w:t xml:space="preserve">§4.5 (pp. 33–34); §5.4</w:t>
+            </w:r>
+          </w:p>
+        </w:tc>
+        <w:tc>
+          <w:tcPr>
+            <w:tcW w:type="dxa" w:w="1157"/>
+            <w:tcMar>
+              <w:top w:type="dxa" w:w="60"/>
+              <w:left w:type="dxa" w:w="90"/>
+              <w:bottom w:type="dxa" w:w="60"/>
+              <w:right w:type="dxa" w:w="90"/>
+            </w:tcMar>
+          </w:tcPr>
+          <w:p>
+            <w:pPr>
+              <w:spacing w:after="40"/>
+            </w:pPr>
+            <w:r>
+              <w:rPr>
+                <w:sz w:val="18"/>
+                <w:szCs w:val="18"/>
+              </w:rPr>
+              <w:t xml:space="preserve">Essential</w:t>
+            </w:r>
+          </w:p>
+        </w:tc>
+      </w:tr>
+      <w:tr>
+        <w:trPr>
+          <w:cantSplit w:val="off"/>
+        </w:trPr>
+        <w:tc>
+          <w:tcPr>
+            <w:tcW w:type="dxa" w:w="2313"/>
+            <w:tcMar>
+              <w:top w:type="dxa" w:w="60"/>
+              <w:left w:type="dxa" w:w="90"/>
+              <w:bottom w:type="dxa" w:w="60"/>
+              <w:right w:type="dxa" w:w="90"/>
+            </w:tcMar>
+          </w:tcPr>
+          <w:p>
+            <w:pPr>
+              <w:spacing w:after="40"/>
+            </w:pPr>
+            <w:r>
+              <w:rPr>
+                <w:sz w:val="18"/>
+                <w:szCs w:val="18"/>
+              </w:rPr>
+              <w:t xml:space="preserve">Alkadi (2024)</w:t>
+            </w:r>
+          </w:p>
+        </w:tc>
+        <w:tc>
+          <w:tcPr>
+            <w:tcW w:type="dxa" w:w="4433"/>
+            <w:tcMar>
+              <w:top w:type="dxa" w:w="60"/>
+              <w:left w:type="dxa" w:w="90"/>
+              <w:bottom w:type="dxa" w:w="60"/>
+              <w:right w:type="dxa" w:w="90"/>
+            </w:tcMar>
+          </w:tcPr>
+          <w:p>
+            <w:pPr>
+              <w:spacing w:after="40"/>
+            </w:pPr>
+            <w:r>
+              <w:rPr>
+                <w:sz w:val="18"/>
+                <w:szCs w:val="18"/>
+              </w:rPr>
+              <w:t xml:space="preserve">A review of 62 green-sukuk studies: only four are quantitative, and pricing is the least-studied topic. This is your strongest evidence for the novelty claim.</w:t>
+            </w:r>
+          </w:p>
+        </w:tc>
+        <w:tc>
+          <w:tcPr>
+            <w:tcW w:type="dxa" w:w="1735"/>
+            <w:tcMar>
+              <w:top w:type="dxa" w:w="60"/>
+              <w:left w:type="dxa" w:w="90"/>
+              <w:bottom w:type="dxa" w:w="60"/>
+              <w:right w:type="dxa" w:w="90"/>
+            </w:tcMar>
+          </w:tcPr>
+          <w:p>
+            <w:pPr>
+              <w:spacing w:after="40"/>
+            </w:pPr>
+            <w:r>
+              <w:rPr>
+                <w:sz w:val="18"/>
+                <w:szCs w:val="18"/>
+              </w:rPr>
+              <w:t xml:space="preserve">§5.8 (p. 88); Chapter 1</w:t>
+            </w:r>
+          </w:p>
+        </w:tc>
+        <w:tc>
+          <w:tcPr>
+            <w:tcW w:type="dxa" w:w="1157"/>
+            <w:tcMar>
+              <w:top w:type="dxa" w:w="60"/>
+              <w:left w:type="dxa" w:w="90"/>
+              <w:bottom w:type="dxa" w:w="60"/>
+              <w:right w:type="dxa" w:w="90"/>
+            </w:tcMar>
+          </w:tcPr>
+          <w:p>
+            <w:pPr>
+              <w:spacing w:after="40"/>
+            </w:pPr>
+            <w:r>
+              <w:rPr>
+                <w:sz w:val="18"/>
+                <w:szCs w:val="18"/>
+              </w:rPr>
+              <w:t xml:space="preserve">Essential</w:t>
+            </w:r>
+          </w:p>
+        </w:tc>
+      </w:tr>
+      <w:tr>
+        <w:trPr>
+          <w:cantSplit w:val="off"/>
+        </w:trPr>
+        <w:tc>
+          <w:tcPr>
+            <w:tcW w:type="dxa" w:w="2313"/>
+            <w:tcMar>
+              <w:top w:type="dxa" w:w="60"/>
+              <w:left w:type="dxa" w:w="90"/>
+              <w:bottom w:type="dxa" w:w="60"/>
+              <w:right w:type="dxa" w:w="90"/>
+            </w:tcMar>
+          </w:tcPr>
+          <w:p>
+            <w:pPr>
+              <w:spacing w:after="40"/>
+            </w:pPr>
+            <w:r>
+              <w:rPr>
+                <w:sz w:val="18"/>
+                <w:szCs w:val="18"/>
+              </w:rPr>
+              <w:t xml:space="preserve">Asmuni &amp; Tan (2020)</w:t>
+            </w:r>
+          </w:p>
+        </w:tc>
+        <w:tc>
+          <w:tcPr>
+            <w:tcW w:type="dxa" w:w="4433"/>
+            <w:tcMar>
+              <w:top w:type="dxa" w:w="60"/>
+              <w:left w:type="dxa" w:w="90"/>
+              <w:bottom w:type="dxa" w:w="60"/>
+              <w:right w:type="dxa" w:w="90"/>
+            </w:tcMar>
+          </w:tcPr>
+          <w:p>
+            <w:pPr>
+              <w:spacing w:after="40"/>
+            </w:pPr>
+            <w:r>
+              <w:rPr>
+                <w:sz w:val="18"/>
+                <w:szCs w:val="18"/>
+              </w:rPr>
+              <w:t xml:space="preserve">Sovereign sukuk yield more than conventional bonds, mainly because they are less liquid. Several of your controls are sovereign sukuk, so the control leg may carry its own liquidity premium.</w:t>
+            </w:r>
+          </w:p>
+        </w:tc>
+        <w:tc>
+          <w:tcPr>
+            <w:tcW w:type="dxa" w:w="1735"/>
+            <w:tcMar>
+              <w:top w:type="dxa" w:w="60"/>
+              <w:left w:type="dxa" w:w="90"/>
+              <w:bottom w:type="dxa" w:w="60"/>
+              <w:right w:type="dxa" w:w="90"/>
+            </w:tcMar>
+          </w:tcPr>
+          <w:p>
+            <w:pPr>
+              <w:spacing w:after="40"/>
+            </w:pPr>
+            <w:r>
+              <w:rPr>
+                <w:sz w:val="18"/>
+                <w:szCs w:val="18"/>
+              </w:rPr>
+              <w:t xml:space="preserve">§5.5 (pp. 85–86); determinants model</w:t>
+            </w:r>
+          </w:p>
+        </w:tc>
+        <w:tc>
+          <w:tcPr>
+            <w:tcW w:type="dxa" w:w="1157"/>
+            <w:tcMar>
+              <w:top w:type="dxa" w:w="60"/>
+              <w:left w:type="dxa" w:w="90"/>
+              <w:bottom w:type="dxa" w:w="60"/>
+              <w:right w:type="dxa" w:w="90"/>
+            </w:tcMar>
+          </w:tcPr>
+          <w:p>
+            <w:pPr>
+              <w:spacing w:after="40"/>
+            </w:pPr>
+            <w:r>
+              <w:rPr>
+                <w:sz w:val="18"/>
+                <w:szCs w:val="18"/>
+              </w:rPr>
+              <w:t xml:space="preserve">Essential</w:t>
+            </w:r>
+          </w:p>
+        </w:tc>
+      </w:tr>
+      <w:tr>
+        <w:trPr>
+          <w:cantSplit w:val="off"/>
+        </w:trPr>
+        <w:tc>
+          <w:tcPr>
+            <w:tcW w:type="dxa" w:w="2313"/>
+            <w:tcMar>
+              <w:top w:type="dxa" w:w="60"/>
+              <w:left w:type="dxa" w:w="90"/>
+              <w:bottom w:type="dxa" w:w="60"/>
+              <w:right w:type="dxa" w:w="90"/>
+            </w:tcMar>
+          </w:tcPr>
+          <w:p>
+            <w:pPr>
+              <w:spacing w:after="40"/>
+            </w:pPr>
+            <w:r>
+              <w:rPr>
+                <w:sz w:val="18"/>
+                <w:szCs w:val="18"/>
+              </w:rPr>
+              <w:t xml:space="preserve">Fandella &amp; Cociancich (2024)</w:t>
+            </w:r>
+          </w:p>
+        </w:tc>
+        <w:tc>
+          <w:tcPr>
+            <w:tcW w:type="dxa" w:w="4433"/>
+            <w:tcMar>
+              <w:top w:type="dxa" w:w="60"/>
+              <w:left w:type="dxa" w:w="90"/>
+              <w:bottom w:type="dxa" w:w="60"/>
+              <w:right w:type="dxa" w:w="90"/>
+            </w:tcMar>
+          </w:tcPr>
+          <w:p>
+            <w:pPr>
+              <w:spacing w:after="40"/>
+            </w:pPr>
+            <w:r>
+              <w:rPr>
+                <w:sz w:val="18"/>
+                <w:szCs w:val="18"/>
+              </w:rPr>
+              <w:t xml:space="preserve">Controlling for liquidity flips the greenium from +38 bp to about −16 bp, and yield and Z-spread measures give different answers. This matches your own yield-versus-spread problem (MI-5).</w:t>
+            </w:r>
+          </w:p>
+        </w:tc>
+        <w:tc>
+          <w:tcPr>
+            <w:tcW w:type="dxa" w:w="1735"/>
+            <w:tcMar>
+              <w:top w:type="dxa" w:w="60"/>
+              <w:left w:type="dxa" w:w="90"/>
+              <w:bottom w:type="dxa" w:w="60"/>
+              <w:right w:type="dxa" w:w="90"/>
+            </w:tcMar>
+          </w:tcPr>
+          <w:p>
+            <w:pPr>
+              <w:spacing w:after="40"/>
+            </w:pPr>
+            <w:r>
+              <w:rPr>
+                <w:sz w:val="18"/>
+                <w:szCs w:val="18"/>
+              </w:rPr>
+              <w:t xml:space="preserve">§4.6 (p. 38); §4.8 (pp. 44–45)</w:t>
+            </w:r>
+          </w:p>
+        </w:tc>
+        <w:tc>
+          <w:tcPr>
+            <w:tcW w:type="dxa" w:w="1157"/>
+            <w:tcMar>
+              <w:top w:type="dxa" w:w="60"/>
+              <w:left w:type="dxa" w:w="90"/>
+              <w:bottom w:type="dxa" w:w="60"/>
+              <w:right w:type="dxa" w:w="90"/>
+            </w:tcMar>
+          </w:tcPr>
+          <w:p>
+            <w:pPr>
+              <w:spacing w:after="40"/>
+            </w:pPr>
+            <w:r>
+              <w:rPr>
+                <w:sz w:val="18"/>
+                <w:szCs w:val="18"/>
+              </w:rPr>
+              <w:t xml:space="preserve">Recommended</w:t>
+            </w:r>
+          </w:p>
+        </w:tc>
+      </w:tr>
+      <w:tr>
+        <w:trPr>
+          <w:cantSplit w:val="off"/>
+        </w:trPr>
+        <w:tc>
+          <w:tcPr>
+            <w:tcW w:type="dxa" w:w="2313"/>
+            <w:tcMar>
+              <w:top w:type="dxa" w:w="60"/>
+              <w:left w:type="dxa" w:w="90"/>
+              <w:bottom w:type="dxa" w:w="60"/>
+              <w:right w:type="dxa" w:w="90"/>
+            </w:tcMar>
+          </w:tcPr>
+          <w:p>
+            <w:pPr>
+              <w:spacing w:after="40"/>
+            </w:pPr>
+            <w:r>
+              <w:rPr>
+                <w:sz w:val="18"/>
+                <w:szCs w:val="18"/>
+              </w:rPr>
+              <w:t xml:space="preserve">Auzepy, Bannier &amp; Martin (2023); Oude Lansink &amp; Kapelko (2025)</w:t>
+            </w:r>
+          </w:p>
+        </w:tc>
+        <w:tc>
+          <w:tcPr>
+            <w:tcW w:type="dxa" w:w="4433"/>
+            <w:tcMar>
+              <w:top w:type="dxa" w:w="60"/>
+              <w:left w:type="dxa" w:w="90"/>
+              <w:bottom w:type="dxa" w:w="60"/>
+              <w:right w:type="dxa" w:w="90"/>
+            </w:tcMar>
+          </w:tcPr>
+          <w:p>
+            <w:pPr>
+              <w:spacing w:after="40"/>
+            </w:pPr>
+            <w:r>
+              <w:rPr>
+                <w:sz w:val="18"/>
+                <w:szCs w:val="18"/>
+              </w:rPr>
+              <w:t xml:space="preserve">Sustainability-linked loans and bonds show weak incentives and no clear pricing benefit. They place labelled sukuk in the wider family of labelled debt products.</w:t>
+            </w:r>
+          </w:p>
+        </w:tc>
+        <w:tc>
+          <w:tcPr>
+            <w:tcW w:type="dxa" w:w="1735"/>
+            <w:tcMar>
+              <w:top w:type="dxa" w:w="60"/>
+              <w:left w:type="dxa" w:w="90"/>
+              <w:bottom w:type="dxa" w:w="60"/>
+              <w:right w:type="dxa" w:w="90"/>
+            </w:tcMar>
+          </w:tcPr>
+          <w:p>
+            <w:pPr>
+              <w:spacing w:after="40"/>
+            </w:pPr>
+            <w:r>
+              <w:rPr>
+                <w:sz w:val="18"/>
+                <w:szCs w:val="18"/>
+              </w:rPr>
+              <w:t xml:space="preserve">Chapter 2; §5.4</w:t>
+            </w:r>
+          </w:p>
+        </w:tc>
+        <w:tc>
+          <w:tcPr>
+            <w:tcW w:type="dxa" w:w="1157"/>
+            <w:tcMar>
+              <w:top w:type="dxa" w:w="60"/>
+              <w:left w:type="dxa" w:w="90"/>
+              <w:bottom w:type="dxa" w:w="60"/>
+              <w:right w:type="dxa" w:w="90"/>
+            </w:tcMar>
+          </w:tcPr>
+          <w:p>
+            <w:pPr>
+              <w:spacing w:after="40"/>
+            </w:pPr>
+            <w:r>
+              <w:rPr>
+                <w:sz w:val="18"/>
+                <w:szCs w:val="18"/>
+              </w:rPr>
+              <w:t xml:space="preserve">Recommended</w:t>
+            </w:r>
+          </w:p>
+        </w:tc>
+      </w:tr>
+    </w:tbl>
+    <w:p>
+      <w:pPr>
+        <w:spacing w:after="60"/>
+      </w:pPr>
+    </w:p>
+    <w:p>
+      <w:pPr>
+        <w:pStyle w:val="Heading2"/>
+      </w:pPr>
+      <w:r>
+        <w:t xml:space="preserve">4.3 Objective (b): determinants and design</w:t>
+      </w:r>
+    </w:p>
+    <w:tbl>
+      <w:tblPr>
+        <w:tblW w:type="dxa" w:w="9638"/>
+        <w:tblBorders>
+          <w:top w:val="single" w:color="auto" w:sz="4"/>
+          <w:left w:val="single" w:color="auto" w:sz="4"/>
+          <w:bottom w:val="single" w:color="auto" w:sz="4"/>
+          <w:right w:val="single" w:color="auto" w:sz="4"/>
+          <w:insideH w:val="single" w:color="auto" w:sz="4"/>
+          <w:insideV w:val="single" w:color="auto" w:sz="4"/>
+        </w:tblBorders>
+      </w:tblPr>
+      <w:tblGrid>
+        <w:gridCol w:w="2313"/>
+        <w:gridCol w:w="4433"/>
+        <w:gridCol w:w="1735"/>
+        <w:gridCol w:w="1157"/>
+      </w:tblGrid>
+      <w:tr>
+        <w:trPr>
+          <w:tblHeader/>
+        </w:trPr>
+        <w:tc>
+          <w:tcPr>
+            <w:tcW w:type="dxa" w:w="2313"/>
+            <w:shd w:fill="1F3864" w:color="auto" w:val="clear"/>
+            <w:tcMar>
+              <w:top w:type="dxa" w:w="60"/>
+              <w:left w:type="dxa" w:w="90"/>
+              <w:bottom w:type="dxa" w:w="60"/>
+              <w:right w:type="dxa" w:w="90"/>
+            </w:tcMar>
+          </w:tcPr>
+          <w:p>
+            <w:pPr>
+              <w:spacing w:after="40"/>
+            </w:pPr>
+            <w:r>
+              <w:rPr>
+                <w:b/>
+                <w:bCs/>
+                <w:color w:val="FFFFFF"/>
+                <w:sz w:val="18"/>
+                <w:szCs w:val="18"/>
+              </w:rPr>
+              <w:t xml:space="preserve">Source</w:t>
+            </w:r>
+          </w:p>
+        </w:tc>
+        <w:tc>
+          <w:tcPr>
+            <w:tcW w:type="dxa" w:w="4433"/>
+            <w:shd w:fill="1F3864" w:color="auto" w:val="clear"/>
+            <w:tcMar>
+              <w:top w:type="dxa" w:w="60"/>
+              <w:left w:type="dxa" w:w="90"/>
+              <w:bottom w:type="dxa" w:w="60"/>
+              <w:right w:type="dxa" w:w="90"/>
+            </w:tcMar>
+          </w:tcPr>
+          <w:p>
+            <w:pPr>
+              <w:spacing w:after="40"/>
+            </w:pPr>
+            <w:r>
+              <w:rPr>
+                <w:b/>
+                <w:bCs/>
+                <w:color w:val="FFFFFF"/>
+                <w:sz w:val="18"/>
+                <w:szCs w:val="18"/>
+              </w:rPr>
+              <w:t xml:space="preserve">Why it matters for your study</w:t>
+            </w:r>
+          </w:p>
+        </w:tc>
+        <w:tc>
+          <w:tcPr>
+            <w:tcW w:type="dxa" w:w="1735"/>
+            <w:shd w:fill="1F3864" w:color="auto" w:val="clear"/>
+            <w:tcMar>
+              <w:top w:type="dxa" w:w="60"/>
+              <w:left w:type="dxa" w:w="90"/>
+              <w:bottom w:type="dxa" w:w="60"/>
+              <w:right w:type="dxa" w:w="90"/>
+            </w:tcMar>
+          </w:tcPr>
+          <w:p>
+            <w:pPr>
+              <w:spacing w:after="40"/>
+            </w:pPr>
+            <w:r>
+              <w:rPr>
+                <w:b/>
+                <w:bCs/>
+                <w:color w:val="FFFFFF"/>
+                <w:sz w:val="18"/>
+                <w:szCs w:val="18"/>
+              </w:rPr>
+              <w:t xml:space="preserve">Where to use it</w:t>
+            </w:r>
+          </w:p>
+        </w:tc>
+        <w:tc>
+          <w:tcPr>
+            <w:tcW w:type="dxa" w:w="1157"/>
+            <w:shd w:fill="1F3864" w:color="auto" w:val="clear"/>
+            <w:tcMar>
+              <w:top w:type="dxa" w:w="60"/>
+              <w:left w:type="dxa" w:w="90"/>
+              <w:bottom w:type="dxa" w:w="60"/>
+              <w:right w:type="dxa" w:w="90"/>
+            </w:tcMar>
+          </w:tcPr>
+          <w:p>
+            <w:pPr>
+              <w:spacing w:after="40"/>
+            </w:pPr>
+            <w:r>
+              <w:rPr>
+                <w:b/>
+                <w:bCs/>
+                <w:color w:val="FFFFFF"/>
+                <w:sz w:val="18"/>
+                <w:szCs w:val="18"/>
+              </w:rPr>
+              <w:t xml:space="preserve">Priority</w:t>
+            </w:r>
+          </w:p>
+        </w:tc>
+      </w:tr>
+      <w:tr>
+        <w:trPr>
+          <w:cantSplit w:val="off"/>
+        </w:trPr>
+        <w:tc>
+          <w:tcPr>
+            <w:tcW w:type="dxa" w:w="2313"/>
+            <w:tcMar>
+              <w:top w:type="dxa" w:w="60"/>
+              <w:left w:type="dxa" w:w="90"/>
+              <w:bottom w:type="dxa" w:w="60"/>
+              <w:right w:type="dxa" w:w="90"/>
+            </w:tcMar>
+          </w:tcPr>
+          <w:p>
+            <w:pPr>
+              <w:spacing w:after="40"/>
+            </w:pPr>
+            <w:r>
+              <w:rPr>
+                <w:sz w:val="18"/>
+                <w:szCs w:val="18"/>
+              </w:rPr>
+              <w:t xml:space="preserve">Oktavio &amp; Riyanti (2021)</w:t>
+            </w:r>
+          </w:p>
+        </w:tc>
+        <w:tc>
+          <w:tcPr>
+            <w:tcW w:type="dxa" w:w="4433"/>
+            <w:tcMar>
+              <w:top w:type="dxa" w:w="60"/>
+              <w:left w:type="dxa" w:w="90"/>
+              <w:bottom w:type="dxa" w:w="60"/>
+              <w:right w:type="dxa" w:w="90"/>
+            </w:tcMar>
+          </w:tcPr>
+          <w:p>
+            <w:pPr>
+              <w:spacing w:after="40"/>
+            </w:pPr>
+            <w:r>
+              <w:rPr>
+                <w:sz w:val="18"/>
+                <w:szCs w:val="18"/>
+              </w:rPr>
+              <w:t xml:space="preserve">ASEAN green bonds: a two-step design (a fixed-effects panel to estimate the premium, then a cross-section to explain it) using only 42 bonds. They find rating, currency, size and maturity matter. It is a ready template for objective (b) and shows your 72 pairs are enough.</w:t>
+            </w:r>
+          </w:p>
+        </w:tc>
+        <w:tc>
+          <w:tcPr>
+            <w:tcW w:type="dxa" w:w="1735"/>
+            <w:tcMar>
+              <w:top w:type="dxa" w:w="60"/>
+              <w:left w:type="dxa" w:w="90"/>
+              <w:bottom w:type="dxa" w:w="60"/>
+              <w:right w:type="dxa" w:w="90"/>
+            </w:tcMar>
+          </w:tcPr>
+          <w:p>
+            <w:pPr>
+              <w:spacing w:after="40"/>
+            </w:pPr>
+            <w:r>
+              <w:rPr>
+                <w:sz w:val="18"/>
+                <w:szCs w:val="18"/>
+              </w:rPr>
+              <w:t xml:space="preserve">New determinants chapter (MI-1); §3.13 (pp. 21–22)</w:t>
+            </w:r>
+          </w:p>
+        </w:tc>
+        <w:tc>
+          <w:tcPr>
+            <w:tcW w:type="dxa" w:w="1157"/>
+            <w:tcMar>
+              <w:top w:type="dxa" w:w="60"/>
+              <w:left w:type="dxa" w:w="90"/>
+              <w:bottom w:type="dxa" w:w="60"/>
+              <w:right w:type="dxa" w:w="90"/>
+            </w:tcMar>
+          </w:tcPr>
+          <w:p>
+            <w:pPr>
+              <w:spacing w:after="40"/>
+            </w:pPr>
+            <w:r>
+              <w:rPr>
+                <w:sz w:val="18"/>
+                <w:szCs w:val="18"/>
+              </w:rPr>
+              <w:t xml:space="preserve">Essential</w:t>
+            </w:r>
+          </w:p>
+        </w:tc>
+      </w:tr>
+      <w:tr>
+        <w:trPr>
+          <w:cantSplit w:val="off"/>
+        </w:trPr>
+        <w:tc>
+          <w:tcPr>
+            <w:tcW w:type="dxa" w:w="2313"/>
+            <w:tcMar>
+              <w:top w:type="dxa" w:w="60"/>
+              <w:left w:type="dxa" w:w="90"/>
+              <w:bottom w:type="dxa" w:w="60"/>
+              <w:right w:type="dxa" w:w="90"/>
+            </w:tcMar>
+          </w:tcPr>
+          <w:p>
+            <w:pPr>
+              <w:spacing w:after="40"/>
+            </w:pPr>
+            <w:r>
+              <w:rPr>
+                <w:sz w:val="18"/>
+                <w:szCs w:val="18"/>
+              </w:rPr>
+              <w:t xml:space="preserve">Mundlak (1978)</w:t>
+            </w:r>
+          </w:p>
+        </w:tc>
+        <w:tc>
+          <w:tcPr>
+            <w:tcW w:type="dxa" w:w="4433"/>
+            <w:tcMar>
+              <w:top w:type="dxa" w:w="60"/>
+              <w:left w:type="dxa" w:w="90"/>
+              <w:bottom w:type="dxa" w:w="60"/>
+              <w:right w:type="dxa" w:w="90"/>
+            </w:tcMar>
+          </w:tcPr>
+          <w:p>
+            <w:pPr>
+              <w:spacing w:after="40"/>
+            </w:pPr>
+            <w:r>
+              <w:rPr>
+                <w:sz w:val="18"/>
+                <w:szCs w:val="18"/>
+              </w:rPr>
+              <w:t xml:space="preserve">Lets you estimate fixed pair characteristics and time-varying drivers in the same panel, by adding pair averages of the time-varying variables. This solves the problem in §3.13 that pair fixed effects absorb static covariates.</w:t>
+            </w:r>
+          </w:p>
+        </w:tc>
+        <w:tc>
+          <w:tcPr>
+            <w:tcW w:type="dxa" w:w="1735"/>
+            <w:tcMar>
+              <w:top w:type="dxa" w:w="60"/>
+              <w:left w:type="dxa" w:w="90"/>
+              <w:bottom w:type="dxa" w:w="60"/>
+              <w:right w:type="dxa" w:w="90"/>
+            </w:tcMar>
+          </w:tcPr>
+          <w:p>
+            <w:pPr>
+              <w:spacing w:after="40"/>
+            </w:pPr>
+            <w:r>
+              <w:rPr>
+                <w:sz w:val="18"/>
+                <w:szCs w:val="18"/>
+              </w:rPr>
+              <w:t xml:space="preserve">Determinants chapter; §3.13</w:t>
+            </w:r>
+          </w:p>
+        </w:tc>
+        <w:tc>
+          <w:tcPr>
+            <w:tcW w:type="dxa" w:w="1157"/>
+            <w:tcMar>
+              <w:top w:type="dxa" w:w="60"/>
+              <w:left w:type="dxa" w:w="90"/>
+              <w:bottom w:type="dxa" w:w="60"/>
+              <w:right w:type="dxa" w:w="90"/>
+            </w:tcMar>
+          </w:tcPr>
+          <w:p>
+            <w:pPr>
+              <w:spacing w:after="40"/>
+            </w:pPr>
+            <w:r>
+              <w:rPr>
+                <w:sz w:val="18"/>
+                <w:szCs w:val="18"/>
+              </w:rPr>
+              <w:t xml:space="preserve">Essential</w:t>
+            </w:r>
+          </w:p>
+        </w:tc>
+      </w:tr>
+      <w:tr>
+        <w:trPr>
+          <w:cantSplit w:val="off"/>
+        </w:trPr>
+        <w:tc>
+          <w:tcPr>
+            <w:tcW w:type="dxa" w:w="2313"/>
+            <w:tcMar>
+              <w:top w:type="dxa" w:w="60"/>
+              <w:left w:type="dxa" w:w="90"/>
+              <w:bottom w:type="dxa" w:w="60"/>
+              <w:right w:type="dxa" w:w="90"/>
+            </w:tcMar>
+          </w:tcPr>
+          <w:p>
+            <w:pPr>
+              <w:spacing w:after="40"/>
+            </w:pPr>
+            <w:r>
+              <w:rPr>
+                <w:sz w:val="18"/>
+                <w:szCs w:val="18"/>
+              </w:rPr>
+              <w:t xml:space="preserve">Lai &amp; Lu (2026) [WP]</w:t>
+            </w:r>
+          </w:p>
+        </w:tc>
+        <w:tc>
+          <w:tcPr>
+            <w:tcW w:type="dxa" w:w="4433"/>
+            <w:tcMar>
+              <w:top w:type="dxa" w:w="60"/>
+              <w:left w:type="dxa" w:w="90"/>
+              <w:bottom w:type="dxa" w:w="60"/>
+              <w:right w:type="dxa" w:w="90"/>
+            </w:tcMar>
+          </w:tcPr>
+          <w:p>
+            <w:pPr>
+              <w:spacing w:after="40"/>
+            </w:pPr>
+            <w:r>
+              <w:rPr>
+                <w:sz w:val="18"/>
+                <w:szCs w:val="18"/>
+              </w:rPr>
+              <w:t xml:space="preserve">Shows that matching biases the greenium </w:t>
+            </w:r>
+            <w:r>
+              <w:rPr>
+                <w:b/>
+                <w:bCs/>
+                <w:sz w:val="18"/>
+                <w:szCs w:val="18"/>
+              </w:rPr>
+              <w:t xml:space="preserve">towards zero</w:t>
+            </w:r>
+            <w:r>
+              <w:rPr>
+                <w:sz w:val="18"/>
+                <w:szCs w:val="18"/>
+              </w:rPr>
+              <w:t xml:space="preserve"> because of lost observations and poor balance, and proposes synthetic counterfactual bonds instead. This bears directly on your balance failure and on the size of your estimates.</w:t>
+            </w:r>
+          </w:p>
+        </w:tc>
+        <w:tc>
+          <w:tcPr>
+            <w:tcW w:type="dxa" w:w="1735"/>
+            <w:tcMar>
+              <w:top w:type="dxa" w:w="60"/>
+              <w:left w:type="dxa" w:w="90"/>
+              <w:bottom w:type="dxa" w:w="60"/>
+              <w:right w:type="dxa" w:w="90"/>
+            </w:tcMar>
+          </w:tcPr>
+          <w:p>
+            <w:pPr>
+              <w:spacing w:after="40"/>
+            </w:pPr>
+            <w:r>
+              <w:rPr>
+                <w:sz w:val="18"/>
+                <w:szCs w:val="18"/>
+              </w:rPr>
+              <w:t xml:space="preserve">§3.6 (p. 12); §5.4</w:t>
+            </w:r>
+          </w:p>
+        </w:tc>
+        <w:tc>
+          <w:tcPr>
+            <w:tcW w:type="dxa" w:w="1157"/>
+            <w:tcMar>
+              <w:top w:type="dxa" w:w="60"/>
+              <w:left w:type="dxa" w:w="90"/>
+              <w:bottom w:type="dxa" w:w="60"/>
+              <w:right w:type="dxa" w:w="90"/>
+            </w:tcMar>
+          </w:tcPr>
+          <w:p>
+            <w:pPr>
+              <w:spacing w:after="40"/>
+            </w:pPr>
+            <w:r>
+              <w:rPr>
+                <w:sz w:val="18"/>
+                <w:szCs w:val="18"/>
+              </w:rPr>
+              <w:t xml:space="preserve">Recommended</w:t>
+            </w:r>
+          </w:p>
+        </w:tc>
+      </w:tr>
+    </w:tbl>
+    <w:p>
+      <w:pPr>
+        <w:spacing w:after="60"/>
+      </w:pPr>
+    </w:p>
+    <w:p>
+      <w:pPr>
+        <w:pStyle w:val="Heading2"/>
+      </w:pPr>
+      <w:r>
+        <w:t xml:space="preserve">4.4 Methods and inference</w:t>
+      </w:r>
+    </w:p>
+    <w:tbl>
+      <w:tblPr>
+        <w:tblW w:type="dxa" w:w="9638"/>
+        <w:tblBorders>
+          <w:top w:val="single" w:color="auto" w:sz="4"/>
+          <w:left w:val="single" w:color="auto" w:sz="4"/>
+          <w:bottom w:val="single" w:color="auto" w:sz="4"/>
+          <w:right w:val="single" w:color="auto" w:sz="4"/>
+          <w:insideH w:val="single" w:color="auto" w:sz="4"/>
+          <w:insideV w:val="single" w:color="auto" w:sz="4"/>
+        </w:tblBorders>
+      </w:tblPr>
+      <w:tblGrid>
+        <w:gridCol w:w="2313"/>
+        <w:gridCol w:w="4433"/>
+        <w:gridCol w:w="1735"/>
+        <w:gridCol w:w="1157"/>
+      </w:tblGrid>
+      <w:tr>
+        <w:trPr>
+          <w:tblHeader/>
+        </w:trPr>
+        <w:tc>
+          <w:tcPr>
+            <w:tcW w:type="dxa" w:w="2313"/>
+            <w:shd w:fill="1F3864" w:color="auto" w:val="clear"/>
+            <w:tcMar>
+              <w:top w:type="dxa" w:w="60"/>
+              <w:left w:type="dxa" w:w="90"/>
+              <w:bottom w:type="dxa" w:w="60"/>
+              <w:right w:type="dxa" w:w="90"/>
+            </w:tcMar>
+          </w:tcPr>
+          <w:p>
+            <w:pPr>
+              <w:spacing w:after="40"/>
+            </w:pPr>
+            <w:r>
+              <w:rPr>
+                <w:b/>
+                <w:bCs/>
+                <w:color w:val="FFFFFF"/>
+                <w:sz w:val="18"/>
+                <w:szCs w:val="18"/>
+              </w:rPr>
+              <w:t xml:space="preserve">Source</w:t>
+            </w:r>
+          </w:p>
+        </w:tc>
+        <w:tc>
+          <w:tcPr>
+            <w:tcW w:type="dxa" w:w="4433"/>
+            <w:shd w:fill="1F3864" w:color="auto" w:val="clear"/>
+            <w:tcMar>
+              <w:top w:type="dxa" w:w="60"/>
+              <w:left w:type="dxa" w:w="90"/>
+              <w:bottom w:type="dxa" w:w="60"/>
+              <w:right w:type="dxa" w:w="90"/>
+            </w:tcMar>
+          </w:tcPr>
+          <w:p>
+            <w:pPr>
+              <w:spacing w:after="40"/>
+            </w:pPr>
+            <w:r>
+              <w:rPr>
+                <w:b/>
+                <w:bCs/>
+                <w:color w:val="FFFFFF"/>
+                <w:sz w:val="18"/>
+                <w:szCs w:val="18"/>
+              </w:rPr>
+              <w:t xml:space="preserve">Why it matters for your study</w:t>
+            </w:r>
+          </w:p>
+        </w:tc>
+        <w:tc>
+          <w:tcPr>
+            <w:tcW w:type="dxa" w:w="1735"/>
+            <w:shd w:fill="1F3864" w:color="auto" w:val="clear"/>
+            <w:tcMar>
+              <w:top w:type="dxa" w:w="60"/>
+              <w:left w:type="dxa" w:w="90"/>
+              <w:bottom w:type="dxa" w:w="60"/>
+              <w:right w:type="dxa" w:w="90"/>
+            </w:tcMar>
+          </w:tcPr>
+          <w:p>
+            <w:pPr>
+              <w:spacing w:after="40"/>
+            </w:pPr>
+            <w:r>
+              <w:rPr>
+                <w:b/>
+                <w:bCs/>
+                <w:color w:val="FFFFFF"/>
+                <w:sz w:val="18"/>
+                <w:szCs w:val="18"/>
+              </w:rPr>
+              <w:t xml:space="preserve">Where to use it</w:t>
+            </w:r>
+          </w:p>
+        </w:tc>
+        <w:tc>
+          <w:tcPr>
+            <w:tcW w:type="dxa" w:w="1157"/>
+            <w:shd w:fill="1F3864" w:color="auto" w:val="clear"/>
+            <w:tcMar>
+              <w:top w:type="dxa" w:w="60"/>
+              <w:left w:type="dxa" w:w="90"/>
+              <w:bottom w:type="dxa" w:w="60"/>
+              <w:right w:type="dxa" w:w="90"/>
+            </w:tcMar>
+          </w:tcPr>
+          <w:p>
+            <w:pPr>
+              <w:spacing w:after="40"/>
+            </w:pPr>
+            <w:r>
+              <w:rPr>
+                <w:b/>
+                <w:bCs/>
+                <w:color w:val="FFFFFF"/>
+                <w:sz w:val="18"/>
+                <w:szCs w:val="18"/>
+              </w:rPr>
+              <w:t xml:space="preserve">Priority</w:t>
+            </w:r>
+          </w:p>
+        </w:tc>
+      </w:tr>
+      <w:tr>
+        <w:trPr>
+          <w:cantSplit w:val="off"/>
+        </w:trPr>
+        <w:tc>
+          <w:tcPr>
+            <w:tcW w:type="dxa" w:w="2313"/>
+            <w:tcMar>
+              <w:top w:type="dxa" w:w="60"/>
+              <w:left w:type="dxa" w:w="90"/>
+              <w:bottom w:type="dxa" w:w="60"/>
+              <w:right w:type="dxa" w:w="90"/>
+            </w:tcMar>
+          </w:tcPr>
+          <w:p>
+            <w:pPr>
+              <w:spacing w:after="40"/>
+            </w:pPr>
+            <w:r>
+              <w:rPr>
+                <w:sz w:val="18"/>
+                <w:szCs w:val="18"/>
+              </w:rPr>
+              <w:t xml:space="preserve">Abadie &amp; Imbens (2011)</w:t>
+            </w:r>
+          </w:p>
+        </w:tc>
+        <w:tc>
+          <w:tcPr>
+            <w:tcW w:type="dxa" w:w="4433"/>
+            <w:tcMar>
+              <w:top w:type="dxa" w:w="60"/>
+              <w:left w:type="dxa" w:w="90"/>
+              <w:bottom w:type="dxa" w:w="60"/>
+              <w:right w:type="dxa" w:w="90"/>
+            </w:tcMar>
+          </w:tcPr>
+          <w:p>
+            <w:pPr>
+              <w:spacing w:after="40"/>
+            </w:pPr>
+            <w:r>
+              <w:rPr>
+                <w:sz w:val="18"/>
+                <w:szCs w:val="18"/>
+              </w:rPr>
+              <w:t xml:space="preserve">The standard bias correction for matching estimators when balance is imperfect. Your balance target is missed on every variable.</w:t>
+            </w:r>
+          </w:p>
+        </w:tc>
+        <w:tc>
+          <w:tcPr>
+            <w:tcW w:type="dxa" w:w="1735"/>
+            <w:tcMar>
+              <w:top w:type="dxa" w:w="60"/>
+              <w:left w:type="dxa" w:w="90"/>
+              <w:bottom w:type="dxa" w:w="60"/>
+              <w:right w:type="dxa" w:w="90"/>
+            </w:tcMar>
+          </w:tcPr>
+          <w:p>
+            <w:pPr>
+              <w:spacing w:after="40"/>
+            </w:pPr>
+            <w:r>
+              <w:rPr>
+                <w:sz w:val="18"/>
+                <w:szCs w:val="18"/>
+              </w:rPr>
+              <w:t xml:space="preserve">§3.6 (p. 12)</w:t>
+            </w:r>
+          </w:p>
+        </w:tc>
+        <w:tc>
+          <w:tcPr>
+            <w:tcW w:type="dxa" w:w="1157"/>
+            <w:tcMar>
+              <w:top w:type="dxa" w:w="60"/>
+              <w:left w:type="dxa" w:w="90"/>
+              <w:bottom w:type="dxa" w:w="60"/>
+              <w:right w:type="dxa" w:w="90"/>
+            </w:tcMar>
+          </w:tcPr>
+          <w:p>
+            <w:pPr>
+              <w:spacing w:after="40"/>
+            </w:pPr>
+            <w:r>
+              <w:rPr>
+                <w:sz w:val="18"/>
+                <w:szCs w:val="18"/>
+              </w:rPr>
+              <w:t xml:space="preserve">Essential</w:t>
+            </w:r>
+          </w:p>
+        </w:tc>
+      </w:tr>
+      <w:tr>
+        <w:trPr>
+          <w:cantSplit w:val="off"/>
+        </w:trPr>
+        <w:tc>
+          <w:tcPr>
+            <w:tcW w:type="dxa" w:w="2313"/>
+            <w:tcMar>
+              <w:top w:type="dxa" w:w="60"/>
+              <w:left w:type="dxa" w:w="90"/>
+              <w:bottom w:type="dxa" w:w="60"/>
+              <w:right w:type="dxa" w:w="90"/>
+            </w:tcMar>
+          </w:tcPr>
+          <w:p>
+            <w:pPr>
+              <w:spacing w:after="40"/>
+            </w:pPr>
+            <w:r>
+              <w:rPr>
+                <w:sz w:val="18"/>
+                <w:szCs w:val="18"/>
+              </w:rPr>
+              <w:t xml:space="preserve">Stuart (2010)</w:t>
+            </w:r>
+          </w:p>
+        </w:tc>
+        <w:tc>
+          <w:tcPr>
+            <w:tcW w:type="dxa" w:w="4433"/>
+            <w:tcMar>
+              <w:top w:type="dxa" w:w="60"/>
+              <w:left w:type="dxa" w:w="90"/>
+              <w:bottom w:type="dxa" w:w="60"/>
+              <w:right w:type="dxa" w:w="90"/>
+            </w:tcMar>
+          </w:tcPr>
+          <w:p>
+            <w:pPr>
+              <w:spacing w:after="40"/>
+            </w:pPr>
+            <w:r>
+              <w:rPr>
+                <w:sz w:val="18"/>
+                <w:szCs w:val="18"/>
+              </w:rPr>
+              <w:t xml:space="preserve">The main review of matching methods, including balance and overlap checks. Examiners will expect it alongside Austin (2009).</w:t>
+            </w:r>
+          </w:p>
+        </w:tc>
+        <w:tc>
+          <w:tcPr>
+            <w:tcW w:type="dxa" w:w="1735"/>
+            <w:tcMar>
+              <w:top w:type="dxa" w:w="60"/>
+              <w:left w:type="dxa" w:w="90"/>
+              <w:bottom w:type="dxa" w:w="60"/>
+              <w:right w:type="dxa" w:w="90"/>
+            </w:tcMar>
+          </w:tcPr>
+          <w:p>
+            <w:pPr>
+              <w:spacing w:after="40"/>
+            </w:pPr>
+            <w:r>
+              <w:rPr>
+                <w:sz w:val="18"/>
+                <w:szCs w:val="18"/>
+              </w:rPr>
+              <w:t xml:space="preserve">§3.5–3.6 (pp. 9–13)</w:t>
+            </w:r>
+          </w:p>
+        </w:tc>
+        <w:tc>
+          <w:tcPr>
+            <w:tcW w:type="dxa" w:w="1157"/>
+            <w:tcMar>
+              <w:top w:type="dxa" w:w="60"/>
+              <w:left w:type="dxa" w:w="90"/>
+              <w:bottom w:type="dxa" w:w="60"/>
+              <w:right w:type="dxa" w:w="90"/>
+            </w:tcMar>
+          </w:tcPr>
+          <w:p>
+            <w:pPr>
+              <w:spacing w:after="40"/>
+            </w:pPr>
+            <w:r>
+              <w:rPr>
+                <w:sz w:val="18"/>
+                <w:szCs w:val="18"/>
+              </w:rPr>
+              <w:t xml:space="preserve">Essential</w:t>
+            </w:r>
+          </w:p>
+        </w:tc>
+      </w:tr>
+      <w:tr>
+        <w:trPr>
+          <w:cantSplit w:val="off"/>
+        </w:trPr>
+        <w:tc>
+          <w:tcPr>
+            <w:tcW w:type="dxa" w:w="2313"/>
+            <w:tcMar>
+              <w:top w:type="dxa" w:w="60"/>
+              <w:left w:type="dxa" w:w="90"/>
+              <w:bottom w:type="dxa" w:w="60"/>
+              <w:right w:type="dxa" w:w="90"/>
+            </w:tcMar>
+          </w:tcPr>
+          <w:p>
+            <w:pPr>
+              <w:spacing w:after="40"/>
+            </w:pPr>
+            <w:r>
+              <w:rPr>
+                <w:sz w:val="18"/>
+                <w:szCs w:val="18"/>
+              </w:rPr>
+              <w:t xml:space="preserve">Solon, Haider &amp; Wooldridge (2015); Abadie, Athey, Imbens &amp; Wooldridge (2023)</w:t>
+            </w:r>
+          </w:p>
+        </w:tc>
+        <w:tc>
+          <w:tcPr>
+            <w:tcW w:type="dxa" w:w="4433"/>
+            <w:tcMar>
+              <w:top w:type="dxa" w:w="60"/>
+              <w:left w:type="dxa" w:w="90"/>
+              <w:bottom w:type="dxa" w:w="60"/>
+              <w:right w:type="dxa" w:w="90"/>
+            </w:tcMar>
+          </w:tcPr>
+          <w:p>
+            <w:pPr>
+              <w:spacing w:after="40"/>
+            </w:pPr>
+            <w:r>
+              <w:rPr>
+                <w:sz w:val="18"/>
+                <w:szCs w:val="18"/>
+              </w:rPr>
+              <w:t xml:space="preserve">The established papers on weighting and clustering. Your §3.2 argument and your §5.9 “methodological contribution” should cite them.</w:t>
+            </w:r>
+          </w:p>
+        </w:tc>
+        <w:tc>
+          <w:tcPr>
+            <w:tcW w:type="dxa" w:w="1735"/>
+            <w:tcMar>
+              <w:top w:type="dxa" w:w="60"/>
+              <w:left w:type="dxa" w:w="90"/>
+              <w:bottom w:type="dxa" w:w="60"/>
+              <w:right w:type="dxa" w:w="90"/>
+            </w:tcMar>
+          </w:tcPr>
+          <w:p>
+            <w:pPr>
+              <w:spacing w:after="40"/>
+            </w:pPr>
+            <w:r>
+              <w:rPr>
+                <w:sz w:val="18"/>
+                <w:szCs w:val="18"/>
+              </w:rPr>
+              <w:t xml:space="preserve">§3.2 (pp. 4–7); §5.9 (pp. 89–90)</w:t>
+            </w:r>
+          </w:p>
+        </w:tc>
+        <w:tc>
+          <w:tcPr>
+            <w:tcW w:type="dxa" w:w="1157"/>
+            <w:tcMar>
+              <w:top w:type="dxa" w:w="60"/>
+              <w:left w:type="dxa" w:w="90"/>
+              <w:bottom w:type="dxa" w:w="60"/>
+              <w:right w:type="dxa" w:w="90"/>
+            </w:tcMar>
+          </w:tcPr>
+          <w:p>
+            <w:pPr>
+              <w:spacing w:after="40"/>
+            </w:pPr>
+            <w:r>
+              <w:rPr>
+                <w:sz w:val="18"/>
+                <w:szCs w:val="18"/>
+              </w:rPr>
+              <w:t xml:space="preserve">Essential</w:t>
+            </w:r>
+          </w:p>
+        </w:tc>
+      </w:tr>
+      <w:tr>
+        <w:trPr>
+          <w:cantSplit w:val="off"/>
+        </w:trPr>
+        <w:tc>
+          <w:tcPr>
+            <w:tcW w:type="dxa" w:w="2313"/>
+            <w:tcMar>
+              <w:top w:type="dxa" w:w="60"/>
+              <w:left w:type="dxa" w:w="90"/>
+              <w:bottom w:type="dxa" w:w="60"/>
+              <w:right w:type="dxa" w:w="90"/>
+            </w:tcMar>
+          </w:tcPr>
+          <w:p>
+            <w:pPr>
+              <w:spacing w:after="40"/>
+            </w:pPr>
+            <w:r>
+              <w:rPr>
+                <w:sz w:val="18"/>
+                <w:szCs w:val="18"/>
+              </w:rPr>
+              <w:t xml:space="preserve">Simmons, Nelson &amp; Simonsohn (2011); Harvey (2017)</w:t>
+            </w:r>
+          </w:p>
+        </w:tc>
+        <w:tc>
+          <w:tcPr>
+            <w:tcW w:type="dxa" w:w="4433"/>
+            <w:tcMar>
+              <w:top w:type="dxa" w:w="60"/>
+              <w:left w:type="dxa" w:w="90"/>
+              <w:bottom w:type="dxa" w:w="60"/>
+              <w:right w:type="dxa" w:w="90"/>
+            </w:tcMar>
+          </w:tcPr>
+          <w:p>
+            <w:pPr>
+              <w:spacing w:after="40"/>
+            </w:pPr>
+            <w:r>
+              <w:rPr>
+                <w:sz w:val="18"/>
+                <w:szCs w:val="18"/>
+              </w:rPr>
+              <w:t xml:space="preserve">Show how flexible analysis choices and uncorrected multiple testing inflate false positives, with Harvey writing for finance. Needed when you explain your confirmatory framework (MI-3).</w:t>
+            </w:r>
+          </w:p>
+        </w:tc>
+        <w:tc>
+          <w:tcPr>
+            <w:tcW w:type="dxa" w:w="1735"/>
+            <w:tcMar>
+              <w:top w:type="dxa" w:w="60"/>
+              <w:left w:type="dxa" w:w="90"/>
+              <w:bottom w:type="dxa" w:w="60"/>
+              <w:right w:type="dxa" w:w="90"/>
+            </w:tcMar>
+          </w:tcPr>
+          <w:p>
+            <w:pPr>
+              <w:spacing w:after="40"/>
+            </w:pPr>
+            <w:r>
+              <w:rPr>
+                <w:sz w:val="18"/>
+                <w:szCs w:val="18"/>
+              </w:rPr>
+              <w:t xml:space="preserve">§3.1 (p. 3); §3.10 (p. 18)</w:t>
+            </w:r>
+          </w:p>
+        </w:tc>
+        <w:tc>
+          <w:tcPr>
+            <w:tcW w:type="dxa" w:w="1157"/>
+            <w:tcMar>
+              <w:top w:type="dxa" w:w="60"/>
+              <w:left w:type="dxa" w:w="90"/>
+              <w:bottom w:type="dxa" w:w="60"/>
+              <w:right w:type="dxa" w:w="90"/>
+            </w:tcMar>
+          </w:tcPr>
+          <w:p>
+            <w:pPr>
+              <w:spacing w:after="40"/>
+            </w:pPr>
+            <w:r>
+              <w:rPr>
+                <w:sz w:val="18"/>
+                <w:szCs w:val="18"/>
+              </w:rPr>
+              <w:t xml:space="preserve">Essential</w:t>
+            </w:r>
+          </w:p>
+        </w:tc>
+      </w:tr>
+      <w:tr>
+        <w:trPr>
+          <w:cantSplit w:val="off"/>
+        </w:trPr>
+        <w:tc>
+          <w:tcPr>
+            <w:tcW w:type="dxa" w:w="2313"/>
+            <w:tcMar>
+              <w:top w:type="dxa" w:w="60"/>
+              <w:left w:type="dxa" w:w="90"/>
+              <w:bottom w:type="dxa" w:w="60"/>
+              <w:right w:type="dxa" w:w="90"/>
+            </w:tcMar>
+          </w:tcPr>
+          <w:p>
+            <w:pPr>
+              <w:spacing w:after="40"/>
+            </w:pPr>
+            <w:r>
+              <w:rPr>
+                <w:sz w:val="18"/>
+                <w:szCs w:val="18"/>
+              </w:rPr>
+              <w:t xml:space="preserve">Hoenig &amp; Heisey (2001)</w:t>
+            </w:r>
+          </w:p>
+        </w:tc>
+        <w:tc>
+          <w:tcPr>
+            <w:tcW w:type="dxa" w:w="4433"/>
+            <w:tcMar>
+              <w:top w:type="dxa" w:w="60"/>
+              <w:left w:type="dxa" w:w="90"/>
+              <w:bottom w:type="dxa" w:w="60"/>
+              <w:right w:type="dxa" w:w="90"/>
+            </w:tcMar>
+          </w:tcPr>
+          <w:p>
+            <w:pPr>
+              <w:spacing w:after="40"/>
+            </w:pPr>
+            <w:r>
+              <w:rPr>
+                <w:sz w:val="18"/>
+                <w:szCs w:val="18"/>
+              </w:rPr>
+              <w:t xml:space="preserve">Explains why power computed after the data are seen adds little. Supports reporting detectable effects and confidence intervals instead.</w:t>
+            </w:r>
+          </w:p>
+        </w:tc>
+        <w:tc>
+          <w:tcPr>
+            <w:tcW w:type="dxa" w:w="1735"/>
+            <w:tcMar>
+              <w:top w:type="dxa" w:w="60"/>
+              <w:left w:type="dxa" w:w="90"/>
+              <w:bottom w:type="dxa" w:w="60"/>
+              <w:right w:type="dxa" w:w="90"/>
+            </w:tcMar>
+          </w:tcPr>
+          <w:p>
+            <w:pPr>
+              <w:spacing w:after="40"/>
+            </w:pPr>
+            <w:r>
+              <w:rPr>
+                <w:sz w:val="18"/>
+                <w:szCs w:val="18"/>
+              </w:rPr>
+              <w:t xml:space="preserve">§3.9 (p. 17)</w:t>
+            </w:r>
+          </w:p>
+        </w:tc>
+        <w:tc>
+          <w:tcPr>
+            <w:tcW w:type="dxa" w:w="1157"/>
+            <w:tcMar>
+              <w:top w:type="dxa" w:w="60"/>
+              <w:left w:type="dxa" w:w="90"/>
+              <w:bottom w:type="dxa" w:w="60"/>
+              <w:right w:type="dxa" w:w="90"/>
+            </w:tcMar>
+          </w:tcPr>
+          <w:p>
+            <w:pPr>
+              <w:spacing w:after="40"/>
+            </w:pPr>
+            <w:r>
+              <w:rPr>
+                <w:sz w:val="18"/>
+                <w:szCs w:val="18"/>
+              </w:rPr>
+              <w:t xml:space="preserve">Recommended</w:t>
+            </w:r>
+          </w:p>
+        </w:tc>
+      </w:tr>
+    </w:tbl>
+    <w:p>
+      <w:pPr>
+        <w:spacing w:after="60"/>
+      </w:pPr>
+    </w:p>
+    <w:p>
+      <w:pPr>
+        <w:spacing w:after="120" w:line="276"/>
+      </w:pPr>
+      <w:r>
+        <w:rPr>
+          <w:b/>
+          <w:bCs/>
+        </w:rPr>
+        <w:t xml:space="preserve">How to use these sources.</w:t>
+      </w:r>
+      <w:r>
+        <w:t xml:space="preserve"> Do not add them as a list in the literature chapter. Use each one where it explains or challenges a specific result. For example: “Our labelled estimate turns positive after 2023, in line with the reversal of the corporate greenium documented by Wollny et al. (2026).” That is the kind of engagement examiners reward.</w:t>
+      </w:r>
+    </w:p>
+    <w:p>
+      <w:pPr>
         <w:pStyle w:val="Heading2"/>
       </w:pPr>
       <w:r>
@@ -8738,7 +12185,7 @@
           <w:sz w:val="19"/>
           <w:szCs w:val="19"/>
         </w:rPr>
-        <w:t xml:space="preserve">Abadie, A., Athey, S., Imbens, G. W., &amp; Wooldridge, J. M. (2023). When should you adjust standard errors for clustering? </w:t>
+        <w:t xml:space="preserve">Abadie, A., &amp; Imbens, G. W. (2011). Bias-corrected matching estimators for average treatment effects. </w:t>
       </w:r>
       <w:r>
         <w:rPr>
@@ -8747,14 +12194,14 @@
           <w:sz w:val="19"/>
           <w:szCs w:val="19"/>
         </w:rPr>
-        <w:t xml:space="preserve">The Quarterly Journal of Economics, 138</w:t>
+        <w:t xml:space="preserve">Journal of Business &amp; Economic Statistics, 29</w:t>
       </w:r>
       <w:r>
         <w:rPr>
           <w:sz w:val="19"/>
           <w:szCs w:val="19"/>
         </w:rPr>
-        <w:t xml:space="preserve">(1), 1–35. https://doi.org/10.1093/qje/qjac038</w:t>
+        <w:t xml:space="preserve">(1), 1–11. https://doi.org/10.1198/jbes.2009.07333</w:t>
       </w:r>
     </w:p>
     <w:p>
@@ -8767,7 +12214,7 @@
           <w:sz w:val="19"/>
           <w:szCs w:val="19"/>
         </w:rPr>
-        <w:t xml:space="preserve">Abadie, A., &amp; Imbens, G. W. (2011). Bias-corrected matching estimators for average treatment effects. </w:t>
+        <w:t xml:space="preserve">Abadie, A., Athey, S., Imbens, G. W., &amp; Wooldridge, J. M. (2023). When should you adjust standard errors for clustering? </w:t>
       </w:r>
       <w:r>
         <w:rPr>
@@ -8776,14 +12223,14 @@
           <w:sz w:val="19"/>
           <w:szCs w:val="19"/>
         </w:rPr>
-        <w:t xml:space="preserve">Journal of Business &amp; Economic Statistics, 29</w:t>
+        <w:t xml:space="preserve">The Quarterly Journal of Economics, 138</w:t>
       </w:r>
       <w:r>
         <w:rPr>
           <w:sz w:val="19"/>
           <w:szCs w:val="19"/>
         </w:rPr>
-        <w:t xml:space="preserve">(1), 1–11. https://doi.org/10.1198/jbes.2009.07333</w:t>
+        <w:t xml:space="preserve">(1), 1–35. https://doi.org/10.1093/qje/qjac038</w:t>
       </w:r>
     </w:p>
     <w:p>
@@ -8883,7 +12330,7 @@
           <w:sz w:val="19"/>
           <w:szCs w:val="19"/>
         </w:rPr>
-        <w:t xml:space="preserve">Bachelet, M. J., Becchetti, L., &amp; Manfredonia, S. (2019). The green bonds premium puzzle: The role of issuer characteristics and third-party verification. </w:t>
+        <w:t xml:space="preserve">Auzepy, A., Bannier, C. E., &amp; Martin, F. (2023). Are sustainability-linked loans designed to effectively incentivize corporate sustainability? A framework for review. </w:t>
       </w:r>
       <w:r>
         <w:rPr>
@@ -8892,14 +12339,14 @@
           <w:sz w:val="19"/>
           <w:szCs w:val="19"/>
         </w:rPr>
-        <w:t xml:space="preserve">Sustainability, 11</w:t>
+        <w:t xml:space="preserve">Financial Management, 52</w:t>
       </w:r>
       <w:r>
         <w:rPr>
           <w:sz w:val="19"/>
           <w:szCs w:val="19"/>
         </w:rPr>
-        <w:t xml:space="preserve">(4), 1098. https://doi.org/10.3390/su11041098</w:t>
+        <w:t xml:space="preserve">(4), 643–675. https://doi.org/10.1111/fima.12437</w:t>
       </w:r>
     </w:p>
     <w:p>
@@ -8912,7 +12359,7 @@
           <w:sz w:val="19"/>
           <w:szCs w:val="19"/>
         </w:rPr>
-        <w:t xml:space="preserve">Baker, M., Bergstresser, D., Serafeim, G., &amp; Wurgler, J. (2022). The pricing and ownership of US green bonds. </w:t>
+        <w:t xml:space="preserve">Bachelet, M. J., Becchetti, L., &amp; Manfredonia, S. (2019). The green bonds premium puzzle: The role of issuer characteristics and third-party verification. </w:t>
       </w:r>
       <w:r>
         <w:rPr>
@@ -8921,14 +12368,14 @@
           <w:sz w:val="19"/>
           <w:szCs w:val="19"/>
         </w:rPr>
-        <w:t xml:space="preserve">Annual Review of Financial Economics, 14</w:t>
+        <w:t xml:space="preserve">Sustainability, 11</w:t>
       </w:r>
       <w:r>
         <w:rPr>
           <w:sz w:val="19"/>
           <w:szCs w:val="19"/>
         </w:rPr>
-        <w:t xml:space="preserve">, 415–437. https://doi.org/10.1146/annurev-financial-111620-014802</w:t>
+        <w:t xml:space="preserve">(4), 1098. https://doi.org/10.3390/su11041098</w:t>
       </w:r>
     </w:p>
     <w:p>
@@ -8941,7 +12388,7 @@
           <w:sz w:val="19"/>
           <w:szCs w:val="19"/>
         </w:rPr>
-        <w:t xml:space="preserve">Becker, B., Campello, M., Thell, V., &amp; Yan, D. (2024). Credit risk, debt overhang, and the life cycle of callable bonds. </w:t>
+        <w:t xml:space="preserve">Baker, M., Bergstresser, D., Serafeim, G., &amp; Wurgler, J. (2022). The pricing and ownership of US green bonds. </w:t>
       </w:r>
       <w:r>
         <w:rPr>
@@ -8950,14 +12397,14 @@
           <w:sz w:val="19"/>
           <w:szCs w:val="19"/>
         </w:rPr>
-        <w:t xml:space="preserve">Review of Finance, 28</w:t>
+        <w:t xml:space="preserve">Annual Review of Financial Economics, 14</w:t>
       </w:r>
       <w:r>
         <w:rPr>
           <w:sz w:val="19"/>
           <w:szCs w:val="19"/>
         </w:rPr>
-        <w:t xml:space="preserve">(3), 945–985. https://doi.org/10.1093/rof/rfae001</w:t>
+        <w:t xml:space="preserve">, 415–437. https://doi.org/10.1146/annurev-financial-111620-014802</w:t>
       </w:r>
     </w:p>
     <w:p>
@@ -8970,7 +12417,7 @@
           <w:sz w:val="19"/>
           <w:szCs w:val="19"/>
         </w:rPr>
-        <w:t xml:space="preserve">Bolton, P., Jiang, W., &amp; Kartasheva, A. V. (2023). The Credit Suisse CoCo wipeout: Facts, misperceptions, and lessons for financial regulation. </w:t>
+        <w:t xml:space="preserve">Becker, B., Campello, M., Thell, V., &amp; Yan, D. (2024). Credit risk, debt overhang, and the life cycle of callable bonds. </w:t>
       </w:r>
       <w:r>
         <w:rPr>
@@ -8979,14 +12426,14 @@
           <w:sz w:val="19"/>
           <w:szCs w:val="19"/>
         </w:rPr>
-        <w:t xml:space="preserve">Journal of Applied Corporate Finance, 35</w:t>
+        <w:t xml:space="preserve">Review of Finance, 28</w:t>
       </w:r>
       <w:r>
         <w:rPr>
           <w:sz w:val="19"/>
           <w:szCs w:val="19"/>
         </w:rPr>
-        <w:t xml:space="preserve">(2), 66–74. https://doi.org/10.1111/jacf.12553</w:t>
+        <w:t xml:space="preserve">(3), 945–985. https://doi.org/10.1093/rof/rfae001</w:t>
       </w:r>
     </w:p>
     <w:p>
@@ -8999,7 +12446,7 @@
           <w:sz w:val="19"/>
           <w:szCs w:val="19"/>
         </w:rPr>
-        <w:t xml:space="preserve">Canay, I. A., Romano, J. P., &amp; Shaikh, A. M. (2017). Randomization tests under an approximate symmetry assumption. </w:t>
+        <w:t xml:space="preserve">Bolton, P., Jiang, W., &amp; Kartasheva, A. V. (2023). The Credit Suisse CoCo wipeout: Facts, misperceptions, and lessons for financial regulation. </w:t>
       </w:r>
       <w:r>
         <w:rPr>
@@ -9008,14 +12455,14 @@
           <w:sz w:val="19"/>
           <w:szCs w:val="19"/>
         </w:rPr>
-        <w:t xml:space="preserve">Econometrica, 85</w:t>
+        <w:t xml:space="preserve">Journal of Applied Corporate Finance, 35</w:t>
       </w:r>
       <w:r>
         <w:rPr>
           <w:sz w:val="19"/>
           <w:szCs w:val="19"/>
         </w:rPr>
-        <w:t xml:space="preserve">(3), 1013–1030. https://doi.org/10.3982/ECTA13081</w:t>
+        <w:t xml:space="preserve">(2), 66–74. https://doi.org/10.1111/jacf.12553</w:t>
       </w:r>
     </w:p>
     <w:p>
@@ -9028,7 +12475,7 @@
           <w:sz w:val="19"/>
           <w:szCs w:val="19"/>
         </w:rPr>
-        <w:t xml:space="preserve">Dorfleitner, G., Utz, S., &amp; Zhang, R. (2021). The pricing of green bonds: External reviews and the shades of green. </w:t>
+        <w:t xml:space="preserve">Booth, L., Gounopoulos, D., &amp; Skinner, F. S. (2014). The choice between callable and noncallable bonds. </w:t>
       </w:r>
       <w:r>
         <w:rPr>
@@ -9037,14 +12484,14 @@
           <w:sz w:val="19"/>
           <w:szCs w:val="19"/>
         </w:rPr>
-        <w:t xml:space="preserve">Review of Managerial Science, 16</w:t>
+        <w:t xml:space="preserve">Journal of Financial Research, 37</w:t>
       </w:r>
       <w:r>
         <w:rPr>
           <w:sz w:val="19"/>
           <w:szCs w:val="19"/>
         </w:rPr>
-        <w:t xml:space="preserve">(3), 797–834. https://doi.org/10.1007/s11846-021-00458-9</w:t>
+        <w:t xml:space="preserve">(4), 435–460. https://doi.org/10.1111/jfir.12042</w:t>
       </w:r>
     </w:p>
     <w:p>
@@ -9057,7 +12504,7 @@
           <w:sz w:val="19"/>
           <w:szCs w:val="19"/>
         </w:rPr>
-        <w:t xml:space="preserve">Fama, E. F. (1970). Efficient capital markets: A review of theory and empirical work. </w:t>
+        <w:t xml:space="preserve">Canay, I. A., Romano, J. P., &amp; Shaikh, A. M. (2017). Randomization tests under an approximate symmetry assumption. </w:t>
       </w:r>
       <w:r>
         <w:rPr>
@@ -9066,14 +12513,14 @@
           <w:sz w:val="19"/>
           <w:szCs w:val="19"/>
         </w:rPr>
-        <w:t xml:space="preserve">The Journal of Finance, 25</w:t>
+        <w:t xml:space="preserve">Econometrica, 85</w:t>
       </w:r>
       <w:r>
         <w:rPr>
           <w:sz w:val="19"/>
           <w:szCs w:val="19"/>
         </w:rPr>
-        <w:t xml:space="preserve">(2), 383–417. https://doi.org/10.2307/2325486</w:t>
+        <w:t xml:space="preserve">(3), 1013–1030. https://doi.org/10.3982/ECTA13081</w:t>
       </w:r>
     </w:p>
     <w:p>
@@ -9086,7 +12533,7 @@
           <w:sz w:val="19"/>
           <w:szCs w:val="19"/>
         </w:rPr>
-        <w:t xml:space="preserve">Fatica, S., Panzica, R., &amp; Rancan, M. (2021). The pricing of green bonds: Are financial institutions special? </w:t>
+        <w:t xml:space="preserve">Dorfleitner, G., Utz, S., &amp; Zhang, R. (2021). The pricing of green bonds: External reviews and the shades of green. </w:t>
       </w:r>
       <w:r>
         <w:rPr>
@@ -9095,14 +12542,14 @@
           <w:sz w:val="19"/>
           <w:szCs w:val="19"/>
         </w:rPr>
-        <w:t xml:space="preserve">Journal of Financial Stability, 54</w:t>
+        <w:t xml:space="preserve">Review of Managerial Science, 16</w:t>
       </w:r>
       <w:r>
         <w:rPr>
           <w:sz w:val="19"/>
           <w:szCs w:val="19"/>
         </w:rPr>
-        <w:t xml:space="preserve">, 100873. https://doi.org/10.1016/j.jfs.2021.100873</w:t>
+        <w:t xml:space="preserve">(3), 797–834. https://doi.org/10.1007/s11846-021-00458-9</w:t>
       </w:r>
     </w:p>
     <w:p>
@@ -9115,7 +12562,7 @@
           <w:sz w:val="19"/>
           <w:szCs w:val="19"/>
         </w:rPr>
-        <w:t xml:space="preserve">Harvey, C. R. (2017). Presidential address: The scientific outlook in financial economics. </w:t>
+        <w:t xml:space="preserve">Elkamhi, R., Ericsson, J., &amp; Wang, H. (2012). What risks do corporate bond put features insure against? </w:t>
       </w:r>
       <w:r>
         <w:rPr>
@@ -9124,14 +12571,14 @@
           <w:sz w:val="19"/>
           <w:szCs w:val="19"/>
         </w:rPr>
-        <w:t xml:space="preserve">The Journal of Finance, 72</w:t>
+        <w:t xml:space="preserve">Journal of Futures Markets, 32</w:t>
       </w:r>
       <w:r>
         <w:rPr>
           <w:sz w:val="19"/>
           <w:szCs w:val="19"/>
         </w:rPr>
-        <w:t xml:space="preserve">(4), 1399–1440. https://doi.org/10.1111/jofi.12530</w:t>
+        <w:t xml:space="preserve">(11), 1060–1090. https://doi.org/10.1002/fut.20546</w:t>
       </w:r>
     </w:p>
     <w:p>
@@ -9144,7 +12591,7 @@
           <w:sz w:val="19"/>
           <w:szCs w:val="19"/>
         </w:rPr>
-        <w:t xml:space="preserve">Hoenig, J. M., &amp; Heisey, D. M. (2001). The abuse of power: The pervasive fallacy of power calculations for data analysis. </w:t>
+        <w:t xml:space="preserve">Fama, E. F. (1970). Efficient capital markets: A review of theory and empirical work. </w:t>
       </w:r>
       <w:r>
         <w:rPr>
@@ -9153,14 +12600,14 @@
           <w:sz w:val="19"/>
           <w:szCs w:val="19"/>
         </w:rPr>
-        <w:t xml:space="preserve">The American Statistician, 55</w:t>
+        <w:t xml:space="preserve">The Journal of Finance, 25</w:t>
       </w:r>
       <w:r>
         <w:rPr>
           <w:sz w:val="19"/>
           <w:szCs w:val="19"/>
         </w:rPr>
-        <w:t xml:space="preserve">(1), 19–24. https://doi.org/10.1198/000313001300339897</w:t>
+        <w:t xml:space="preserve">(2), 383–417. https://doi.org/10.2307/2325486</w:t>
       </w:r>
     </w:p>
     <w:p>
@@ -9173,7 +12620,7 @@
           <w:sz w:val="19"/>
           <w:szCs w:val="19"/>
         </w:rPr>
-        <w:t xml:space="preserve">Ivashchenko, A., &amp; Rockinger, M. (2026). Call me maybe: Corporate bond prices upon missed call opportunities. </w:t>
+        <w:t xml:space="preserve">Fandella, P., &amp; Cociancich, V. (2024). Uncovering the greenium: Investigating the yield spread between green and conventional bonds. </w:t>
       </w:r>
       <w:r>
         <w:rPr>
@@ -9182,14 +12629,14 @@
           <w:sz w:val="19"/>
           <w:szCs w:val="19"/>
         </w:rPr>
-        <w:t xml:space="preserve">Financial Management, 55</w:t>
+        <w:t xml:space="preserve">Investment Management and Financial Innovations, 21</w:t>
       </w:r>
       <w:r>
         <w:rPr>
           <w:sz w:val="19"/>
           <w:szCs w:val="19"/>
         </w:rPr>
-        <w:t xml:space="preserve">(1), 49–65. https://doi.org/10.1111/fima.12503</w:t>
+        <w:t xml:space="preserve">(2), 56–69. https://doi.org/10.21511/imfi.21(2).2024.05</w:t>
       </w:r>
     </w:p>
     <w:p>
@@ -9202,7 +12649,7 @@
           <w:sz w:val="19"/>
           <w:szCs w:val="19"/>
         </w:rPr>
-        <w:t xml:space="preserve">Kalotay, A. J., Williams, G. O., &amp; Fabozzi, F. J. (1993). A model for valuing bonds and embedded options. </w:t>
+        <w:t xml:space="preserve">Fatica, S., Panzica, R., &amp; Rancan, M. (2021). The pricing of green bonds: Are financial institutions special? </w:t>
       </w:r>
       <w:r>
         <w:rPr>
@@ -9211,14 +12658,14 @@
           <w:sz w:val="19"/>
           <w:szCs w:val="19"/>
         </w:rPr>
-        <w:t xml:space="preserve">Financial Analysts Journal, 49</w:t>
+        <w:t xml:space="preserve">Journal of Financial Stability, 54</w:t>
       </w:r>
       <w:r>
         <w:rPr>
           <w:sz w:val="19"/>
           <w:szCs w:val="19"/>
         </w:rPr>
-        <w:t xml:space="preserve">(3), 35–46. https://doi.org/10.2469/faj.v49.n3.35</w:t>
+        <w:t xml:space="preserve">, 100873. https://doi.org/10.1016/j.jfs.2021.100873</w:t>
       </w:r>
     </w:p>
     <w:p>
@@ -9231,7 +12678,7 @@
           <w:sz w:val="19"/>
           <w:szCs w:val="19"/>
         </w:rPr>
-        <w:t xml:space="preserve">Kind, A., Oster, P., &amp; Peter, F. J. (2022). The determinants of banks’ AT1 CoCo spreads. </w:t>
+        <w:t xml:space="preserve">Harvey, C. R. (2017). Presidential address: The scientific outlook in financial economics. </w:t>
       </w:r>
       <w:r>
         <w:rPr>
@@ -9240,14 +12687,14 @@
           <w:sz w:val="19"/>
           <w:szCs w:val="19"/>
         </w:rPr>
-        <w:t xml:space="preserve">European Financial Management, 28</w:t>
+        <w:t xml:space="preserve">The Journal of Finance, 72</w:t>
       </w:r>
       <w:r>
         <w:rPr>
           <w:sz w:val="19"/>
           <w:szCs w:val="19"/>
         </w:rPr>
-        <w:t xml:space="preserve">(2), 567–604. https://doi.org/10.1111/eufm.12314</w:t>
+        <w:t xml:space="preserve">(4), 1399–1440. https://doi.org/10.1111/jofi.12530</w:t>
       </w:r>
     </w:p>
     <w:p>
@@ -9260,7 +12707,7 @@
           <w:sz w:val="19"/>
           <w:szCs w:val="19"/>
         </w:rPr>
-        <w:t xml:space="preserve">Larcker, D. F., &amp; Watts, E. M. (2020). Where’s the greenium? </w:t>
+        <w:t xml:space="preserve">Hoenig, J. M., &amp; Heisey, D. M. (2001). The abuse of power: The pervasive fallacy of power calculations for data analysis. </w:t>
       </w:r>
       <w:r>
         <w:rPr>
@@ -9269,14 +12716,14 @@
           <w:sz w:val="19"/>
           <w:szCs w:val="19"/>
         </w:rPr>
-        <w:t xml:space="preserve">Journal of Accounting and Economics, 69</w:t>
+        <w:t xml:space="preserve">The American Statistician, 55</w:t>
       </w:r>
       <w:r>
         <w:rPr>
           <w:sz w:val="19"/>
           <w:szCs w:val="19"/>
         </w:rPr>
-        <w:t xml:space="preserve">(2–3), 101312. https://doi.org/10.1016/j.jacceco.2020.101312</w:t>
+        <w:t xml:space="preserve">(1), 19–24. https://doi.org/10.1198/000313001300339897</w:t>
       </w:r>
     </w:p>
     <w:p>
@@ -9289,20 +12736,7 @@
           <w:sz w:val="19"/>
           <w:szCs w:val="19"/>
         </w:rPr>
-        <w:t xml:space="preserve">Latif, A., Husodo, Z., &amp; Hendranastiti, N. D. (2026). Green sukuk and climate finance: Evidence from Indonesia [Working paper]. SSRN. https://doi.org/10.2139/ssrn.6169811</w:t>
-      </w:r>
-    </w:p>
-    <w:p>
-      <w:pPr>
-        <w:spacing w:after="70"/>
-        <w:ind w:left="567" w:hanging="567"/>
-      </w:pPr>
-      <w:r>
-        <w:rPr>
-          <w:sz w:val="19"/>
-          <w:szCs w:val="19"/>
-        </w:rPr>
-        <w:t xml:space="preserve">Löffler, K. U., Petreski, A., &amp; Stephan, A. (2021). Drivers of green bond issuance and new evidence on the “greenium”. </w:t>
+        <w:t xml:space="preserve">Ivashchenko, A., &amp; Rockinger, M. (2026). Call me maybe: Corporate bond prices upon missed call opportunities. </w:t>
       </w:r>
       <w:r>
         <w:rPr>
@@ -9311,14 +12745,14 @@
           <w:sz w:val="19"/>
           <w:szCs w:val="19"/>
         </w:rPr>
-        <w:t xml:space="preserve">Eurasian Economic Review, 11</w:t>
+        <w:t xml:space="preserve">Financial Management, 55</w:t>
       </w:r>
       <w:r>
         <w:rPr>
           <w:sz w:val="19"/>
           <w:szCs w:val="19"/>
         </w:rPr>
-        <w:t xml:space="preserve">(1), 1–24. https://doi.org/10.1007/s40822-020-00165-y</w:t>
+        <w:t xml:space="preserve">(1), 49–65. https://doi.org/10.1111/fima.12503</w:t>
       </w:r>
     </w:p>
     <w:p>
@@ -9331,7 +12765,7 @@
           <w:sz w:val="19"/>
           <w:szCs w:val="19"/>
         </w:rPr>
-        <w:t xml:space="preserve">Nasr, W. M. A., &amp; Hasan, A. (2024). Examining preference shares from the Shari’ah perspective: A systematic literature review. </w:t>
+        <w:t xml:space="preserve">Kalotay, A. J., Williams, G. O., &amp; Fabozzi, F. J. (1993). A model for valuing bonds and embedded options. </w:t>
       </w:r>
       <w:r>
         <w:rPr>
@@ -9340,14 +12774,14 @@
           <w:sz w:val="19"/>
           <w:szCs w:val="19"/>
         </w:rPr>
-        <w:t xml:space="preserve">International Journal of Islamic and Middle Eastern Finance and Management, 17</w:t>
+        <w:t xml:space="preserve">Financial Analysts Journal, 49</w:t>
       </w:r>
       <w:r>
         <w:rPr>
           <w:sz w:val="19"/>
           <w:szCs w:val="19"/>
         </w:rPr>
-        <w:t xml:space="preserve">(4), 621–635. https://doi.org/10.1108/IMEFM-08-2023-0302</w:t>
+        <w:t xml:space="preserve">(3), 35–46. https://doi.org/10.2469/faj.v49.n3.35</w:t>
       </w:r>
     </w:p>
     <w:p>
@@ -9360,7 +12794,7 @@
           <w:sz w:val="19"/>
           <w:szCs w:val="19"/>
         </w:rPr>
-        <w:t xml:space="preserve">Oster, P. (2020). When all concern is gone: The impact of call provisions on gone-concern Tier 2 bond spreads in Europe. </w:t>
+        <w:t xml:space="preserve">Kind, A., Oster, P., &amp; Peter, F. J. (2022). The determinants of banks’ AT1 CoCo spreads. </w:t>
       </w:r>
       <w:r>
         <w:rPr>
@@ -9369,14 +12803,14 @@
           <w:sz w:val="19"/>
           <w:szCs w:val="19"/>
         </w:rPr>
-        <w:t xml:space="preserve">The European Journal of Finance, 26</w:t>
+        <w:t xml:space="preserve">European Financial Management, 28</w:t>
       </w:r>
       <w:r>
         <w:rPr>
           <w:sz w:val="19"/>
           <w:szCs w:val="19"/>
         </w:rPr>
-        <w:t xml:space="preserve">(15), 1529–1568. https://doi.org/10.1080/1351847X.2020.1750449</w:t>
+        <w:t xml:space="preserve">(2), 567–604. https://doi.org/10.1111/eufm.12314</w:t>
       </w:r>
     </w:p>
     <w:p>
@@ -9389,7 +12823,20 @@
           <w:sz w:val="19"/>
           <w:szCs w:val="19"/>
         </w:rPr>
-        <w:t xml:space="preserve">Rubin, D. B. (2001). Using propensity scores to help design observational studies: Application to the tobacco litigation. </w:t>
+        <w:t xml:space="preserve">Lai, W. N., &amp; Lu, X. (2026). The green bond premium: Evidence from disclosure and synthetic counterfactuals [Working paper]. SSRN. https://doi.org/10.2139/ssrn.6501665</w:t>
+      </w:r>
+    </w:p>
+    <w:p>
+      <w:pPr>
+        <w:spacing w:after="70"/>
+        <w:ind w:left="567" w:hanging="567"/>
+      </w:pPr>
+      <w:r>
+        <w:rPr>
+          <w:sz w:val="19"/>
+          <w:szCs w:val="19"/>
+        </w:rPr>
+        <w:t xml:space="preserve">Larcker, D. F., &amp; Watts, E. M. (2020). Where’s the greenium? </w:t>
       </w:r>
       <w:r>
         <w:rPr>
@@ -9398,14 +12845,14 @@
           <w:sz w:val="19"/>
           <w:szCs w:val="19"/>
         </w:rPr>
-        <w:t xml:space="preserve">Health Services and Outcomes Research Methodology, 2</w:t>
+        <w:t xml:space="preserve">Journal of Accounting and Economics, 69</w:t>
       </w:r>
       <w:r>
         <w:rPr>
           <w:sz w:val="19"/>
           <w:szCs w:val="19"/>
         </w:rPr>
-        <w:t xml:space="preserve">(3–4), 169–188. https://doi.org/10.1023/A:1020363010465</w:t>
+        <w:t xml:space="preserve">(2–3), 101312. https://doi.org/10.1016/j.jacceco.2020.101312</w:t>
       </w:r>
     </w:p>
     <w:p>
@@ -9418,7 +12865,33 @@
           <w:sz w:val="19"/>
           <w:szCs w:val="19"/>
         </w:rPr>
-        <w:t xml:space="preserve">Salhani, A., &amp; Mouselli, S. (2022). The impact of Tier 1 sukuk (Islamic bonds) on the profitability of UAE Islamic banks. </w:t>
+        <w:t xml:space="preserve">Latif, A., Husodo, Z., &amp; Hendranastiti, N. D. (2026). Green sukuk and climate finance: Evidence from Indonesia [Working paper]. SSRN. https://doi.org/10.2139/ssrn.6169811</w:t>
+      </w:r>
+    </w:p>
+    <w:p>
+      <w:pPr>
+        <w:spacing w:after="70"/>
+        <w:ind w:left="567" w:hanging="567"/>
+      </w:pPr>
+      <w:r>
+        <w:rPr>
+          <w:sz w:val="19"/>
+          <w:szCs w:val="19"/>
+        </w:rPr>
+        <w:t xml:space="preserve">Lehkonen, H., Heimonen, K., &amp; Simola, J. (2025). Dissipating green bond premium [Working paper]. SSRN. https://doi.org/10.2139/ssrn.5267279</w:t>
+      </w:r>
+    </w:p>
+    <w:p>
+      <w:pPr>
+        <w:spacing w:after="70"/>
+        <w:ind w:left="567" w:hanging="567"/>
+      </w:pPr>
+      <w:r>
+        <w:rPr>
+          <w:sz w:val="19"/>
+          <w:szCs w:val="19"/>
+        </w:rPr>
+        <w:t xml:space="preserve">Löffler, K. U., Petreski, A., &amp; Stephan, A. (2021). Drivers of green bond issuance and new evidence on the “greenium”. </w:t>
       </w:r>
       <w:r>
         <w:rPr>
@@ -9427,14 +12900,14 @@
           <w:sz w:val="19"/>
           <w:szCs w:val="19"/>
         </w:rPr>
-        <w:t xml:space="preserve">Journal of Financial Reporting and Accounting, 22</w:t>
+        <w:t xml:space="preserve">Eurasian Economic Review, 11</w:t>
       </w:r>
       <w:r>
         <w:rPr>
           <w:sz w:val="19"/>
           <w:szCs w:val="19"/>
         </w:rPr>
-        <w:t xml:space="preserve">(4), 796–810. https://doi.org/10.1108/JFRA-12-2021-0461</w:t>
+        <w:t xml:space="preserve">(1), 1–24. https://doi.org/10.1007/s40822-020-00165-y</w:t>
       </w:r>
     </w:p>
     <w:p>
@@ -9447,7 +12920,7 @@
           <w:sz w:val="19"/>
           <w:szCs w:val="19"/>
         </w:rPr>
-        <w:t xml:space="preserve">Samet, A., &amp; Obay, L. (2014). Call feature and corporate bond yield spreads. </w:t>
+        <w:t xml:space="preserve">Mundlak, Y. (1978). On the pooling of time series and cross section data. </w:t>
       </w:r>
       <w:r>
         <w:rPr>
@@ -9456,14 +12929,14 @@
           <w:sz w:val="19"/>
           <w:szCs w:val="19"/>
         </w:rPr>
-        <w:t xml:space="preserve">Journal of Multinational Financial Management, 25–26</w:t>
+        <w:t xml:space="preserve">Econometrica, 46</w:t>
       </w:r>
       <w:r>
         <w:rPr>
           <w:sz w:val="19"/>
           <w:szCs w:val="19"/>
         </w:rPr>
-        <w:t xml:space="preserve">, 1–20. https://doi.org/10.1016/j.mulfin.2014.06.004</w:t>
+        <w:t xml:space="preserve">(1), 69–85. https://doi.org/10.2307/1913646</w:t>
       </w:r>
     </w:p>
     <w:p>
@@ -9476,7 +12949,7 @@
           <w:sz w:val="19"/>
           <w:szCs w:val="19"/>
         </w:rPr>
-        <w:t xml:space="preserve">Simmons, J. P., Nelson, L. D., &amp; Simonsohn, U. (2011). False-positive psychology: Undisclosed flexibility in data collection and analysis allows presenting anything as significant. </w:t>
+        <w:t xml:space="preserve">Nasr, W. M. A., &amp; Hasan, A. (2024). Examining preference shares from the Shari’ah perspective: A systematic literature review. </w:t>
       </w:r>
       <w:r>
         <w:rPr>
@@ -9485,14 +12958,14 @@
           <w:sz w:val="19"/>
           <w:szCs w:val="19"/>
         </w:rPr>
-        <w:t xml:space="preserve">Psychological Science, 22</w:t>
+        <w:t xml:space="preserve">International Journal of Islamic and Middle Eastern Finance and Management, 17</w:t>
       </w:r>
       <w:r>
         <w:rPr>
           <w:sz w:val="19"/>
           <w:szCs w:val="19"/>
         </w:rPr>
-        <w:t xml:space="preserve">(11), 1359–1366. https://doi.org/10.1177/0956797611417632</w:t>
+        <w:t xml:space="preserve">(4), 621–635. https://doi.org/10.1108/IMEFM-08-2023-0302</w:t>
       </w:r>
     </w:p>
     <w:p>
@@ -9505,7 +12978,7 @@
           <w:sz w:val="19"/>
           <w:szCs w:val="19"/>
         </w:rPr>
-        <w:t xml:space="preserve">Solon, G., Haider, S. J., &amp; Wooldridge, J. M. (2015). What are we weighting for? </w:t>
+        <w:t xml:space="preserve">Oktavio, L., &amp; Riyanti, R. S. (2021). Determinants of green bond premium in the ASEAN market amidst the COVID-19 pandemic. </w:t>
       </w:r>
       <w:r>
         <w:rPr>
@@ -9514,14 +12987,14 @@
           <w:sz w:val="19"/>
           <w:szCs w:val="19"/>
         </w:rPr>
-        <w:t xml:space="preserve">Journal of Human Resources, 50</w:t>
+        <w:t xml:space="preserve">Jurnal Keuangan dan Perbankan, 25</w:t>
       </w:r>
       <w:r>
         <w:rPr>
           <w:sz w:val="19"/>
           <w:szCs w:val="19"/>
         </w:rPr>
-        <w:t xml:space="preserve">(2), 301–316. https://doi.org/10.3368/jhr.50.2.301</w:t>
+        <w:t xml:space="preserve">(4), 734–753. https://doi.org/10.26905/jkdp.v25i4.6356</w:t>
       </w:r>
     </w:p>
     <w:p>
@@ -9534,7 +13007,7 @@
           <w:sz w:val="19"/>
           <w:szCs w:val="19"/>
         </w:rPr>
-        <w:t xml:space="preserve">Stuart, E. A. (2010). Matching methods for causal inference: A review and a look forward. </w:t>
+        <w:t xml:space="preserve">Oster, P. (2020). When all concern is gone: The impact of call provisions on gone-concern Tier 2 bond spreads in Europe. </w:t>
       </w:r>
       <w:r>
         <w:rPr>
@@ -9543,14 +13016,375 @@
           <w:sz w:val="19"/>
           <w:szCs w:val="19"/>
         </w:rPr>
-        <w:t xml:space="preserve">Statistical Science, 25</w:t>
+        <w:t xml:space="preserve">The European Journal of Finance, 26</w:t>
       </w:r>
       <w:r>
         <w:rPr>
           <w:sz w:val="19"/>
           <w:szCs w:val="19"/>
         </w:rPr>
+        <w:t xml:space="preserve">(15), 1529–1568. https://doi.org/10.1080/1351847X.2020.1750449</w:t>
+      </w:r>
+    </w:p>
+    <w:p>
+      <w:pPr>
+        <w:spacing w:after="70"/>
+        <w:ind w:left="567" w:hanging="567"/>
+      </w:pPr>
+      <w:r>
+        <w:rPr>
+          <w:sz w:val="19"/>
+          <w:szCs w:val="19"/>
+        </w:rPr>
+        <w:t xml:space="preserve">Oude Lansink, A., &amp; Kapelko, M. (2025). Do sustainability-linked bonds pay lower interest rates? </w:t>
+      </w:r>
+      <w:r>
+        <w:rPr>
+          <w:i/>
+          <w:iCs/>
+          <w:sz w:val="19"/>
+          <w:szCs w:val="19"/>
+        </w:rPr>
+        <w:t xml:space="preserve">Corporate Social Responsibility and Environmental Management, 32</w:t>
+      </w:r>
+      <w:r>
+        <w:rPr>
+          <w:sz w:val="19"/>
+          <w:szCs w:val="19"/>
+        </w:rPr>
+        <w:t xml:space="preserve">(4), 5337–5347. https://doi.org/10.1002/csr.3246</w:t>
+      </w:r>
+    </w:p>
+    <w:p>
+      <w:pPr>
+        <w:spacing w:after="70"/>
+        <w:ind w:left="567" w:hanging="567"/>
+      </w:pPr>
+      <w:r>
+        <w:rPr>
+          <w:sz w:val="19"/>
+          <w:szCs w:val="19"/>
+        </w:rPr>
+        <w:t xml:space="preserve">Powers, E. A., &amp; Tsyplakov, S. (2008). What is the cost of financial flexibility? Theory and evidence for make-whole call provisions. </w:t>
+      </w:r>
+      <w:r>
+        <w:rPr>
+          <w:i/>
+          <w:iCs/>
+          <w:sz w:val="19"/>
+          <w:szCs w:val="19"/>
+        </w:rPr>
+        <w:t xml:space="preserve">Financial Management, 37</w:t>
+      </w:r>
+      <w:r>
+        <w:rPr>
+          <w:sz w:val="19"/>
+          <w:szCs w:val="19"/>
+        </w:rPr>
+        <w:t xml:space="preserve">(3), 485–512. https://doi.org/10.1111/j.1755-053X.2008.00022.x</w:t>
+      </w:r>
+    </w:p>
+    <w:p>
+      <w:pPr>
+        <w:spacing w:after="70"/>
+        <w:ind w:left="567" w:hanging="567"/>
+      </w:pPr>
+      <w:r>
+        <w:rPr>
+          <w:sz w:val="19"/>
+          <w:szCs w:val="19"/>
+        </w:rPr>
+        <w:t xml:space="preserve">Rubin, D. B. (2001). Using propensity scores to help design observational studies: Application to the tobacco litigation. </w:t>
+      </w:r>
+      <w:r>
+        <w:rPr>
+          <w:i/>
+          <w:iCs/>
+          <w:sz w:val="19"/>
+          <w:szCs w:val="19"/>
+        </w:rPr>
+        <w:t xml:space="preserve">Health Services and Outcomes Research Methodology, 2</w:t>
+      </w:r>
+      <w:r>
+        <w:rPr>
+          <w:sz w:val="19"/>
+          <w:szCs w:val="19"/>
+        </w:rPr>
+        <w:t xml:space="preserve">(3–4), 169–188. https://doi.org/10.1023/A:1020363010465</w:t>
+      </w:r>
+    </w:p>
+    <w:p>
+      <w:pPr>
+        <w:spacing w:after="70"/>
+        <w:ind w:left="567" w:hanging="567"/>
+      </w:pPr>
+      <w:r>
+        <w:rPr>
+          <w:sz w:val="19"/>
+          <w:szCs w:val="19"/>
+        </w:rPr>
+        <w:t xml:space="preserve">Salhani, A., &amp; Mouselli, S. (2022). The impact of Tier 1 sukuk (Islamic bonds) on the profitability of UAE Islamic banks. </w:t>
+      </w:r>
+      <w:r>
+        <w:rPr>
+          <w:i/>
+          <w:iCs/>
+          <w:sz w:val="19"/>
+          <w:szCs w:val="19"/>
+        </w:rPr>
+        <w:t xml:space="preserve">Journal of Financial Reporting and Accounting, 22</w:t>
+      </w:r>
+      <w:r>
+        <w:rPr>
+          <w:sz w:val="19"/>
+          <w:szCs w:val="19"/>
+        </w:rPr>
+        <w:t xml:space="preserve">(4), 796–810. https://doi.org/10.1108/JFRA-12-2021-0461</w:t>
+      </w:r>
+    </w:p>
+    <w:p>
+      <w:pPr>
+        <w:spacing w:after="70"/>
+        <w:ind w:left="567" w:hanging="567"/>
+      </w:pPr>
+      <w:r>
+        <w:rPr>
+          <w:sz w:val="19"/>
+          <w:szCs w:val="19"/>
+        </w:rPr>
+        <w:t xml:space="preserve">Samet, A., &amp; Obay, L. (2014). Call feature and corporate bond yield spreads. </w:t>
+      </w:r>
+      <w:r>
+        <w:rPr>
+          <w:i/>
+          <w:iCs/>
+          <w:sz w:val="19"/>
+          <w:szCs w:val="19"/>
+        </w:rPr>
+        <w:t xml:space="preserve">Journal of Multinational Financial Management, 25–26</w:t>
+      </w:r>
+      <w:r>
+        <w:rPr>
+          <w:sz w:val="19"/>
+          <w:szCs w:val="19"/>
+        </w:rPr>
+        <w:t xml:space="preserve">, 1–20. https://doi.org/10.1016/j.mulfin.2014.06.004</w:t>
+      </w:r>
+    </w:p>
+    <w:p>
+      <w:pPr>
+        <w:spacing w:after="70"/>
+        <w:ind w:left="567" w:hanging="567"/>
+      </w:pPr>
+      <w:r>
+        <w:rPr>
+          <w:sz w:val="19"/>
+          <w:szCs w:val="19"/>
+        </w:rPr>
+        <w:t xml:space="preserve">Sheng, Q., Zheng, X., &amp; Zhong, N. (2021). Financing for sustainability: Empirical analysis of green bond premium and issuer heterogeneity. </w:t>
+      </w:r>
+      <w:r>
+        <w:rPr>
+          <w:i/>
+          <w:iCs/>
+          <w:sz w:val="19"/>
+          <w:szCs w:val="19"/>
+        </w:rPr>
+        <w:t xml:space="preserve">Natural Hazards, 107</w:t>
+      </w:r>
+      <w:r>
+        <w:rPr>
+          <w:sz w:val="19"/>
+          <w:szCs w:val="19"/>
+        </w:rPr>
+        <w:t xml:space="preserve">(3), 2641–2651. https://doi.org/10.1007/s11069-021-04540-z</w:t>
+      </w:r>
+    </w:p>
+    <w:p>
+      <w:pPr>
+        <w:spacing w:after="70"/>
+        <w:ind w:left="567" w:hanging="567"/>
+      </w:pPr>
+      <w:r>
+        <w:rPr>
+          <w:sz w:val="19"/>
+          <w:szCs w:val="19"/>
+        </w:rPr>
+        <w:t xml:space="preserve">Simmons, J. P., Nelson, L. D., &amp; Simonsohn, U. (2011). False-positive psychology: Undisclosed flexibility in data collection and analysis allows presenting anything as significant. </w:t>
+      </w:r>
+      <w:r>
+        <w:rPr>
+          <w:i/>
+          <w:iCs/>
+          <w:sz w:val="19"/>
+          <w:szCs w:val="19"/>
+        </w:rPr>
+        <w:t xml:space="preserve">Psychological Science, 22</w:t>
+      </w:r>
+      <w:r>
+        <w:rPr>
+          <w:sz w:val="19"/>
+          <w:szCs w:val="19"/>
+        </w:rPr>
+        <w:t xml:space="preserve">(11), 1359–1366. https://doi.org/10.1177/0956797611417632</w:t>
+      </w:r>
+    </w:p>
+    <w:p>
+      <w:pPr>
+        <w:spacing w:after="70"/>
+        <w:ind w:left="567" w:hanging="567"/>
+      </w:pPr>
+      <w:r>
+        <w:rPr>
+          <w:sz w:val="19"/>
+          <w:szCs w:val="19"/>
+        </w:rPr>
+        <w:t xml:space="preserve">Solon, G., Haider, S. J., &amp; Wooldridge, J. M. (2015). What are we weighting for? </w:t>
+      </w:r>
+      <w:r>
+        <w:rPr>
+          <w:i/>
+          <w:iCs/>
+          <w:sz w:val="19"/>
+          <w:szCs w:val="19"/>
+        </w:rPr>
+        <w:t xml:space="preserve">Journal of Human Resources, 50</w:t>
+      </w:r>
+      <w:r>
+        <w:rPr>
+          <w:sz w:val="19"/>
+          <w:szCs w:val="19"/>
+        </w:rPr>
+        <w:t xml:space="preserve">(2), 301–316. https://doi.org/10.3368/jhr.50.2.301</w:t>
+      </w:r>
+    </w:p>
+    <w:p>
+      <w:pPr>
+        <w:spacing w:after="70"/>
+        <w:ind w:left="567" w:hanging="567"/>
+      </w:pPr>
+      <w:r>
+        <w:rPr>
+          <w:sz w:val="19"/>
+          <w:szCs w:val="19"/>
+        </w:rPr>
+        <w:t xml:space="preserve">Spivey, M. F. (1989). The cost of including a call provision in municipal debt contracts. </w:t>
+      </w:r>
+      <w:r>
+        <w:rPr>
+          <w:i/>
+          <w:iCs/>
+          <w:sz w:val="19"/>
+          <w:szCs w:val="19"/>
+        </w:rPr>
+        <w:t xml:space="preserve">Journal of Financial Research, 12</w:t>
+      </w:r>
+      <w:r>
+        <w:rPr>
+          <w:sz w:val="19"/>
+          <w:szCs w:val="19"/>
+        </w:rPr>
+        <w:t xml:space="preserve">(3), 203–216. https://doi.org/10.1111/j.1475-6803.1989.tb00514.x</w:t>
+      </w:r>
+    </w:p>
+    <w:p>
+      <w:pPr>
+        <w:spacing w:after="70"/>
+        <w:ind w:left="567" w:hanging="567"/>
+      </w:pPr>
+      <w:r>
+        <w:rPr>
+          <w:sz w:val="19"/>
+          <w:szCs w:val="19"/>
+        </w:rPr>
+        <w:t xml:space="preserve">Stuart, E. A. (2010). Matching methods for causal inference: A review and a look forward. </w:t>
+      </w:r>
+      <w:r>
+        <w:rPr>
+          <w:i/>
+          <w:iCs/>
+          <w:sz w:val="19"/>
+          <w:szCs w:val="19"/>
+        </w:rPr>
+        <w:t xml:space="preserve">Statistical Science, 25</w:t>
+      </w:r>
+      <w:r>
+        <w:rPr>
+          <w:sz w:val="19"/>
+          <w:szCs w:val="19"/>
+        </w:rPr>
         <w:t xml:space="preserve">(1), 1–21. https://doi.org/10.1214/09-STS313</w:t>
+      </w:r>
+    </w:p>
+    <w:p>
+      <w:pPr>
+        <w:spacing w:after="70"/>
+        <w:ind w:left="567" w:hanging="567"/>
+      </w:pPr>
+      <w:r>
+        <w:rPr>
+          <w:sz w:val="19"/>
+          <w:szCs w:val="19"/>
+        </w:rPr>
+        <w:t xml:space="preserve">Sun, Z., Feng, J., &amp; Zhou, R. (2022). Can labeled green bonds reduce financing cost in China? </w:t>
+      </w:r>
+      <w:r>
+        <w:rPr>
+          <w:i/>
+          <w:iCs/>
+          <w:sz w:val="19"/>
+          <w:szCs w:val="19"/>
+        </w:rPr>
+        <w:t xml:space="preserve">Sustainability, 14</w:t>
+      </w:r>
+      <w:r>
+        <w:rPr>
+          <w:sz w:val="19"/>
+          <w:szCs w:val="19"/>
+        </w:rPr>
+        <w:t xml:space="preserve">(20), 13510. https://doi.org/10.3390/su142013510</w:t>
+      </w:r>
+    </w:p>
+    <w:p>
+      <w:pPr>
+        <w:spacing w:after="70"/>
+        <w:ind w:left="567" w:hanging="567"/>
+      </w:pPr>
+      <w:r>
+        <w:rPr>
+          <w:sz w:val="19"/>
+          <w:szCs w:val="19"/>
+        </w:rPr>
+        <w:t xml:space="preserve">Tewari, M., &amp; Ramanlal, P. (2022). Risk management and agency theory: Role of the put option in corporate bonds. </w:t>
+      </w:r>
+      <w:r>
+        <w:rPr>
+          <w:i/>
+          <w:iCs/>
+          <w:sz w:val="19"/>
+          <w:szCs w:val="19"/>
+        </w:rPr>
+        <w:t xml:space="preserve">Journal of Risk and Financial Management, 15</w:t>
+      </w:r>
+      <w:r>
+        <w:rPr>
+          <w:sz w:val="19"/>
+          <w:szCs w:val="19"/>
+        </w:rPr>
+        <w:t xml:space="preserve">(2), 61. https://doi.org/10.3390/jrfm15020061</w:t>
+      </w:r>
+    </w:p>
+    <w:p>
+      <w:pPr>
+        <w:spacing w:after="70"/>
+        <w:ind w:left="567" w:hanging="567"/>
+      </w:pPr>
+      <w:r>
+        <w:rPr>
+          <w:sz w:val="19"/>
+          <w:szCs w:val="19"/>
+        </w:rPr>
+        <w:t xml:space="preserve">Wollny, L., Derwall, J., &amp; Galema, R. (2026). The reversal of the green bond premium [Working paper]. SSRN. https://doi.org/10.2139/ssrn.7064982</w:t>
       </w:r>
     </w:p>
     <w:p>

</xml_diff>

<commit_message>
Add recommended determinants model (Part 5) to supervisory review
Sets out a two-step and hybrid panel design, current sample sizes with
page references, comparison with prior studies, and expected signs.

Co-Authored-By: Claude Opus 5.5 <noreply@anthropic.com>
Claude-Session: https://claude.ai/code/session_01WM787U75sCAxndSxcQWdj4
</commit_message>
<xml_diff>
--- a/supervision/Supervisory_Review_Ch3-5.docx
+++ b/supervision/Supervisory_Review_Ch3-5.docx
@@ -128,7 +128,17 @@
         <w:t xml:space="preserve">Part 4</w:t>
       </w:r>
       <w:r>
-        <w:t xml:space="preserve"> lists the most important literature you have not yet cited, why it matters and where to use it.</w:t>
+        <w:t xml:space="preserve"> lists the most important literature you have not yet cited. </w:t>
+      </w:r>
+      <w:r>
+        <w:rPr>
+          <w:b/>
+          <w:bCs/>
+        </w:rPr>
+        <w:t xml:space="preserve">Part 5</w:t>
+      </w:r>
+      <w:r>
+        <w:t xml:space="preserve"> sets out the determinants model I recommend for objective (b).</w:t>
       </w:r>
     </w:p>
     <w:p>
@@ -321,6 +331,19 @@
       </w:pPr>
       <w:r>
         <w:t xml:space="preserve">Remove all references to a “supervisory decision”. Examiners will not see that note.</w:t>
+      </w:r>
+    </w:p>
+    <w:p>
+      <w:pPr>
+        <w:pStyle w:val="ListParagraph"/>
+        <w:numPr>
+          <w:ilvl w:val="0"/>
+          <w:numId w:val="2"/>
+        </w:numPr>
+        <w:spacing w:after="80" w:line="264"/>
+      </w:pPr>
+      <w:r>
+        <w:t xml:space="preserve">Part 5 sets out the recommended model, sample, variables and expected signs.</w:t>
       </w:r>
     </w:p>
     <w:p>
@@ -6151,6 +6174,127 @@
           </w:p>
         </w:tc>
       </w:tr>
+      <w:tr>
+        <w:trPr>
+          <w:cantSplit w:val="off"/>
+        </w:trPr>
+        <w:tc>
+          <w:tcPr>
+            <w:tcW w:type="dxa" w:w="729"/>
+            <w:tcMar>
+              <w:top w:type="dxa" w:w="60"/>
+              <w:left w:type="dxa" w:w="90"/>
+              <w:bottom w:type="dxa" w:w="60"/>
+              <w:right w:type="dxa" w:w="90"/>
+            </w:tcMar>
+          </w:tcPr>
+          <w:p>
+            <w:pPr>
+              <w:spacing w:after="40"/>
+            </w:pPr>
+            <w:r>
+              <w:rPr>
+                <w:sz w:val="18"/>
+                <w:szCs w:val="18"/>
+              </w:rPr>
+              <w:t xml:space="preserve">4.21</w:t>
+            </w:r>
+          </w:p>
+        </w:tc>
+        <w:tc>
+          <w:tcPr>
+            <w:tcW w:type="dxa" w:w="3934"/>
+            <w:tcMar>
+              <w:top w:type="dxa" w:w="60"/>
+              <w:left w:type="dxa" w:w="90"/>
+              <w:bottom w:type="dxa" w:w="60"/>
+              <w:right w:type="dxa" w:w="90"/>
+            </w:tcMar>
+          </w:tcPr>
+          <w:p>
+            <w:pPr>
+              <w:spacing w:after="40"/>
+            </w:pPr>
+            <w:r>
+              <w:rPr>
+                <w:sz w:val="18"/>
+                <w:szCs w:val="18"/>
+              </w:rPr>
+              <w:t xml:space="preserve">The AT1 window sample is 23 pairs in §4.2 (p. 30) but 21 in Table 4.1 (p. 35) and §4.4 (p. 33).</w:t>
+            </w:r>
+          </w:p>
+        </w:tc>
+        <w:tc>
+          <w:tcPr>
+            <w:tcW w:type="dxa" w:w="1166"/>
+            <w:shd w:fill="E2EFDA" w:color="auto" w:val="clear"/>
+            <w:tcMar>
+              <w:top w:type="dxa" w:w="60"/>
+              <w:left w:type="dxa" w:w="90"/>
+              <w:bottom w:type="dxa" w:w="60"/>
+              <w:right w:type="dxa" w:w="90"/>
+            </w:tcMar>
+          </w:tcPr>
+          <w:p>
+            <w:pPr>
+              <w:spacing w:after="40"/>
+            </w:pPr>
+            <w:r>
+              <w:rPr>
+                <w:sz w:val="18"/>
+                <w:szCs w:val="18"/>
+              </w:rPr>
+              <w:t xml:space="preserve">Minor</w:t>
+            </w:r>
+          </w:p>
+        </w:tc>
+        <w:tc>
+          <w:tcPr>
+            <w:tcW w:type="dxa" w:w="4662"/>
+            <w:tcMar>
+              <w:top w:type="dxa" w:w="60"/>
+              <w:left w:type="dxa" w:w="90"/>
+              <w:bottom w:type="dxa" w:w="60"/>
+              <w:right w:type="dxa" w:w="90"/>
+            </w:tcMar>
+          </w:tcPr>
+          <w:p>
+            <w:pPr>
+              <w:spacing w:after="40"/>
+            </w:pPr>
+            <w:r>
+              <w:rPr>
+                <w:sz w:val="18"/>
+                <w:szCs w:val="18"/>
+              </w:rPr>
+              <w:t xml:space="preserve">Inconsistent sample size.</w:t>
+            </w:r>
+          </w:p>
+        </w:tc>
+        <w:tc>
+          <w:tcPr>
+            <w:tcW w:type="dxa" w:w="4079"/>
+            <w:tcMar>
+              <w:top w:type="dxa" w:w="60"/>
+              <w:left w:type="dxa" w:w="90"/>
+              <w:bottom w:type="dxa" w:w="60"/>
+              <w:right w:type="dxa" w:w="90"/>
+            </w:tcMar>
+          </w:tcPr>
+          <w:p>
+            <w:pPr>
+              <w:spacing w:after="40"/>
+            </w:pPr>
+            <w:r>
+              <w:rPr>
+                <w:sz w:val="18"/>
+                <w:szCs w:val="18"/>
+              </w:rPr>
+              <w:t xml:space="preserve">Reconcile.</w:t>
+            </w:r>
+          </w:p>
+        </w:tc>
+      </w:tr>
     </w:tbl>
     <w:p>
       <w:pPr>
@@ -12169,6 +12313,2915 @@
     </w:p>
     <w:p>
       <w:pPr>
+        <w:pStyle w:val="Heading1"/>
+      </w:pPr>
+      <w:r>
+        <w:t xml:space="preserve">Part 5. Recommended determinants model (objective b)</w:t>
+      </w:r>
+    </w:p>
+    <w:p>
+      <w:pPr>
+        <w:spacing w:after="120" w:line="276"/>
+      </w:pPr>
+      <w:r>
+        <w:t xml:space="preserve">This part sets out the model I suggest for MI-1. Keep it small and decide it before you run it.</w:t>
+      </w:r>
+    </w:p>
+    <w:p>
+      <w:pPr>
+        <w:pStyle w:val="Heading2"/>
+      </w:pPr>
+      <w:r>
+        <w:t xml:space="preserve">5.1 Method</w:t>
+      </w:r>
+    </w:p>
+    <w:p>
+      <w:pPr>
+        <w:spacing w:after="120" w:line="276"/>
+      </w:pPr>
+      <w:r>
+        <w:t xml:space="preserve">Use two steps. This follows Oktavio and Riyanti (2021), who estimate the premium first and then explain it.</w:t>
+      </w:r>
+    </w:p>
+    <w:tbl>
+      <w:tblPr>
+        <w:tblW w:type="dxa" w:w="9638"/>
+        <w:tblBorders>
+          <w:top w:val="single" w:color="auto" w:sz="4"/>
+          <w:left w:val="single" w:color="auto" w:sz="4"/>
+          <w:bottom w:val="single" w:color="auto" w:sz="4"/>
+          <w:right w:val="single" w:color="auto" w:sz="4"/>
+          <w:insideH w:val="single" w:color="auto" w:sz="4"/>
+          <w:insideV w:val="single" w:color="auto" w:sz="4"/>
+        </w:tblBorders>
+      </w:tblPr>
+      <w:tblGrid>
+        <w:gridCol w:w="1928"/>
+        <w:gridCol w:w="4337"/>
+        <w:gridCol w:w="3373"/>
+      </w:tblGrid>
+      <w:tr>
+        <w:trPr>
+          <w:tblHeader/>
+        </w:trPr>
+        <w:tc>
+          <w:tcPr>
+            <w:tcW w:type="dxa" w:w="1928"/>
+            <w:shd w:fill="1F3864" w:color="auto" w:val="clear"/>
+            <w:tcMar>
+              <w:top w:type="dxa" w:w="60"/>
+              <w:left w:type="dxa" w:w="90"/>
+              <w:bottom w:type="dxa" w:w="60"/>
+              <w:right w:type="dxa" w:w="90"/>
+            </w:tcMar>
+          </w:tcPr>
+          <w:p>
+            <w:pPr>
+              <w:spacing w:after="40"/>
+            </w:pPr>
+            <w:r>
+              <w:rPr>
+                <w:b/>
+                <w:bCs/>
+                <w:color w:val="FFFFFF"/>
+                <w:sz w:val="18"/>
+                <w:szCs w:val="18"/>
+              </w:rPr>
+              <w:t xml:space="preserve">Step</w:t>
+            </w:r>
+          </w:p>
+        </w:tc>
+        <w:tc>
+          <w:tcPr>
+            <w:tcW w:type="dxa" w:w="4337"/>
+            <w:shd w:fill="1F3864" w:color="auto" w:val="clear"/>
+            <w:tcMar>
+              <w:top w:type="dxa" w:w="60"/>
+              <w:left w:type="dxa" w:w="90"/>
+              <w:bottom w:type="dxa" w:w="60"/>
+              <w:right w:type="dxa" w:w="90"/>
+            </w:tcMar>
+          </w:tcPr>
+          <w:p>
+            <w:pPr>
+              <w:spacing w:after="40"/>
+            </w:pPr>
+            <w:r>
+              <w:rPr>
+                <w:b/>
+                <w:bCs/>
+                <w:color w:val="FFFFFF"/>
+                <w:sz w:val="18"/>
+                <w:szCs w:val="18"/>
+              </w:rPr>
+              <w:t xml:space="preserve">Model</w:t>
+            </w:r>
+          </w:p>
+        </w:tc>
+        <w:tc>
+          <w:tcPr>
+            <w:tcW w:type="dxa" w:w="3373"/>
+            <w:shd w:fill="1F3864" w:color="auto" w:val="clear"/>
+            <w:tcMar>
+              <w:top w:type="dxa" w:w="60"/>
+              <w:left w:type="dxa" w:w="90"/>
+              <w:bottom w:type="dxa" w:w="60"/>
+              <w:right w:type="dxa" w:w="90"/>
+            </w:tcMar>
+          </w:tcPr>
+          <w:p>
+            <w:pPr>
+              <w:spacing w:after="40"/>
+            </w:pPr>
+            <w:r>
+              <w:rPr>
+                <w:b/>
+                <w:bCs/>
+                <w:color w:val="FFFFFF"/>
+                <w:sz w:val="18"/>
+                <w:szCs w:val="18"/>
+              </w:rPr>
+              <w:t xml:space="preserve">What it answers</w:t>
+            </w:r>
+          </w:p>
+        </w:tc>
+      </w:tr>
+      <w:tr>
+        <w:trPr>
+          <w:cantSplit w:val="off"/>
+        </w:trPr>
+        <w:tc>
+          <w:tcPr>
+            <w:tcW w:type="dxa" w:w="1928"/>
+            <w:tcMar>
+              <w:top w:type="dxa" w:w="60"/>
+              <w:left w:type="dxa" w:w="90"/>
+              <w:bottom w:type="dxa" w:w="60"/>
+              <w:right w:type="dxa" w:w="90"/>
+            </w:tcMar>
+          </w:tcPr>
+          <w:p>
+            <w:pPr>
+              <w:spacing w:after="40"/>
+            </w:pPr>
+            <w:r>
+              <w:rPr>
+                <w:sz w:val="18"/>
+                <w:szCs w:val="18"/>
+              </w:rPr>
+              <w:t xml:space="preserve">1. Pair-level cross-section</w:t>
+            </w:r>
+          </w:p>
+        </w:tc>
+        <w:tc>
+          <w:tcPr>
+            <w:tcW w:type="dxa" w:w="4337"/>
+            <w:tcMar>
+              <w:top w:type="dxa" w:w="60"/>
+              <w:left w:type="dxa" w:w="90"/>
+              <w:bottom w:type="dxa" w:w="60"/>
+              <w:right w:type="dxa" w:w="90"/>
+            </w:tcMar>
+          </w:tcPr>
+          <w:p>
+            <w:pPr>
+              <w:spacing w:after="40"/>
+            </w:pPr>
+            <w:r>
+              <w:rPr>
+                <w:sz w:val="18"/>
+                <w:szCs w:val="18"/>
+              </w:rPr>
+              <w:t xml:space="preserve">D̄g = α + class dummies + β′Zg + εg</w:t>
+            </w:r>
+          </w:p>
+          <w:p>
+            <w:pPr>
+              <w:spacing w:after="40"/>
+            </w:pPr>
+            <w:r>
+              <w:rPr>
+                <w:sz w:val="18"/>
+                <w:szCs w:val="18"/>
+              </w:rPr>
+              <w:t xml:space="preserve">D̄g = mean yield differential of pair g (bp), one value per pair.</w:t>
+            </w:r>
+          </w:p>
+          <w:p>
+            <w:pPr>
+              <w:spacing w:after="40"/>
+            </w:pPr>
+            <w:r>
+              <w:rPr>
+                <w:sz w:val="18"/>
+                <w:szCs w:val="18"/>
+              </w:rPr>
+              <w:t xml:space="preserve">Zg = gaps between the two legs that do not change over time.</w:t>
+            </w:r>
+          </w:p>
+        </w:tc>
+        <w:tc>
+          <w:tcPr>
+            <w:tcW w:type="dxa" w:w="3373"/>
+            <w:tcMar>
+              <w:top w:type="dxa" w:w="60"/>
+              <w:left w:type="dxa" w:w="90"/>
+              <w:bottom w:type="dxa" w:w="60"/>
+              <w:right w:type="dxa" w:w="90"/>
+            </w:tcMar>
+          </w:tcPr>
+          <w:p>
+            <w:pPr>
+              <w:spacing w:after="40"/>
+            </w:pPr>
+            <w:r>
+              <w:rPr>
+                <w:sz w:val="18"/>
+                <w:szCs w:val="18"/>
+              </w:rPr>
+              <w:t xml:space="preserve">Which pair characteristics explain why some pairs have larger differentials.</w:t>
+            </w:r>
+          </w:p>
+        </w:tc>
+      </w:tr>
+      <w:tr>
+        <w:trPr>
+          <w:cantSplit w:val="off"/>
+        </w:trPr>
+        <w:tc>
+          <w:tcPr>
+            <w:tcW w:type="dxa" w:w="1928"/>
+            <w:tcMar>
+              <w:top w:type="dxa" w:w="60"/>
+              <w:left w:type="dxa" w:w="90"/>
+              <w:bottom w:type="dxa" w:w="60"/>
+              <w:right w:type="dxa" w:w="90"/>
+            </w:tcMar>
+          </w:tcPr>
+          <w:p>
+            <w:pPr>
+              <w:spacing w:after="40"/>
+            </w:pPr>
+            <w:r>
+              <w:rPr>
+                <w:sz w:val="18"/>
+                <w:szCs w:val="18"/>
+              </w:rPr>
+              <w:t xml:space="preserve">2. Within-pair panel</w:t>
+            </w:r>
+          </w:p>
+        </w:tc>
+        <w:tc>
+          <w:tcPr>
+            <w:tcW w:type="dxa" w:w="4337"/>
+            <w:tcMar>
+              <w:top w:type="dxa" w:w="60"/>
+              <w:left w:type="dxa" w:w="90"/>
+              <w:bottom w:type="dxa" w:w="60"/>
+              <w:right w:type="dxa" w:w="90"/>
+            </w:tcMar>
+          </w:tcPr>
+          <w:p>
+            <w:pPr>
+              <w:spacing w:after="40"/>
+            </w:pPr>
+            <w:r>
+              <w:rPr>
+                <w:sz w:val="18"/>
+                <w:szCs w:val="18"/>
+              </w:rPr>
+              <w:t xml:space="preserve">Δg,t = αg + λt + δ′Xg,t + γ(AT1 × Stresst) + εg,t</w:t>
+            </w:r>
+          </w:p>
+          <w:p>
+            <w:pPr>
+              <w:spacing w:after="40"/>
+            </w:pPr>
+            <w:r>
+              <w:rPr>
+                <w:sz w:val="18"/>
+                <w:szCs w:val="18"/>
+              </w:rPr>
+              <w:t xml:space="preserve">αg = pair fixed effect; λt = month effect.</w:t>
+            </w:r>
+          </w:p>
+          <w:p>
+            <w:pPr>
+              <w:spacing w:after="40"/>
+            </w:pPr>
+            <w:r>
+              <w:rPr>
+                <w:sz w:val="18"/>
+                <w:szCs w:val="18"/>
+              </w:rPr>
+              <w:t xml:space="preserve">Xg,t = gaps that change over time.</w:t>
+            </w:r>
+          </w:p>
+        </w:tc>
+        <w:tc>
+          <w:tcPr>
+            <w:tcW w:type="dxa" w:w="3373"/>
+            <w:tcMar>
+              <w:top w:type="dxa" w:w="60"/>
+              <w:left w:type="dxa" w:w="90"/>
+              <w:bottom w:type="dxa" w:w="60"/>
+              <w:right w:type="dxa" w:w="90"/>
+            </w:tcMar>
+          </w:tcPr>
+          <w:p>
+            <w:pPr>
+              <w:spacing w:after="40"/>
+            </w:pPr>
+            <w:r>
+              <w:rPr>
+                <w:sz w:val="18"/>
+                <w:szCs w:val="18"/>
+              </w:rPr>
+              <w:t xml:space="preserve">What makes a pair’s differential move over time.</w:t>
+            </w:r>
+          </w:p>
+        </w:tc>
+      </w:tr>
+      <w:tr>
+        <w:trPr>
+          <w:cantSplit w:val="off"/>
+        </w:trPr>
+        <w:tc>
+          <w:tcPr>
+            <w:tcW w:type="dxa" w:w="1928"/>
+            <w:tcMar>
+              <w:top w:type="dxa" w:w="60"/>
+              <w:left w:type="dxa" w:w="90"/>
+              <w:bottom w:type="dxa" w:w="60"/>
+              <w:right w:type="dxa" w:w="90"/>
+            </w:tcMar>
+          </w:tcPr>
+          <w:p>
+            <w:pPr>
+              <w:spacing w:after="40"/>
+            </w:pPr>
+            <w:r>
+              <w:rPr>
+                <w:sz w:val="18"/>
+                <w:szCs w:val="18"/>
+              </w:rPr>
+              <w:t xml:space="preserve">3. Combined (hybrid) panel</w:t>
+            </w:r>
+          </w:p>
+        </w:tc>
+        <w:tc>
+          <w:tcPr>
+            <w:tcW w:type="dxa" w:w="4337"/>
+            <w:tcMar>
+              <w:top w:type="dxa" w:w="60"/>
+              <w:left w:type="dxa" w:w="90"/>
+              <w:bottom w:type="dxa" w:w="60"/>
+              <w:right w:type="dxa" w:w="90"/>
+            </w:tcMar>
+          </w:tcPr>
+          <w:p>
+            <w:pPr>
+              <w:spacing w:after="40"/>
+            </w:pPr>
+            <w:r>
+              <w:rPr>
+                <w:sz w:val="18"/>
+                <w:szCs w:val="18"/>
+              </w:rPr>
+              <w:t xml:space="preserve">Step 2 plus the pair averages of Xg,t and the fixed traits Zg (Mundlak, 1978).</w:t>
+            </w:r>
+          </w:p>
+        </w:tc>
+        <w:tc>
+          <w:tcPr>
+            <w:tcW w:type="dxa" w:w="3373"/>
+            <w:tcMar>
+              <w:top w:type="dxa" w:w="60"/>
+              <w:left w:type="dxa" w:w="90"/>
+              <w:bottom w:type="dxa" w:w="60"/>
+              <w:right w:type="dxa" w:w="90"/>
+            </w:tcMar>
+          </w:tcPr>
+          <w:p>
+            <w:pPr>
+              <w:spacing w:after="40"/>
+            </w:pPr>
+            <w:r>
+              <w:rPr>
+                <w:sz w:val="18"/>
+                <w:szCs w:val="18"/>
+              </w:rPr>
+              <w:t xml:space="preserve">Estimates fixed traits and time-varying drivers in one model. This solves the problem in §3.13 (p. 22) that pair fixed effects absorb static variables.</w:t>
+            </w:r>
+          </w:p>
+        </w:tc>
+      </w:tr>
+    </w:tbl>
+    <w:p>
+      <w:pPr>
+        <w:spacing w:after="60"/>
+      </w:pPr>
+    </w:p>
+    <w:p>
+      <w:pPr>
+        <w:pStyle w:val="ListParagraph"/>
+        <w:numPr>
+          <w:ilvl w:val="0"/>
+          <w:numId w:val="2"/>
+        </w:numPr>
+        <w:spacing w:after="80" w:line="264"/>
+      </w:pPr>
+      <w:r>
+        <w:rPr>
+          <w:b/>
+          <w:bCs/>
+        </w:rPr>
+        <w:t xml:space="preserve">Inference:</w:t>
+      </w:r>
+      <w:r>
+        <w:t xml:space="preserve"> wild cluster bootstrap, clustered by issuer group, not by pair (Cameron, Gelbach &amp; Miller, 2008; MacKinnon &amp; Webb, 2017). Pairs that share an issuer are not independent.</w:t>
+      </w:r>
+    </w:p>
+    <w:p>
+      <w:pPr>
+        <w:pStyle w:val="ListParagraph"/>
+        <w:numPr>
+          <w:ilvl w:val="0"/>
+          <w:numId w:val="2"/>
+        </w:numPr>
+        <w:spacing w:after="80" w:line="264"/>
+      </w:pPr>
+      <w:r>
+        <w:rPr>
+          <w:b/>
+          <w:bCs/>
+        </w:rPr>
+        <w:t xml:space="preserve">Size:</w:t>
+      </w:r>
+      <w:r>
+        <w:t xml:space="preserve"> limit Step 1 to about five regressors (roughly ten pairs per regressor), and Step 2 to two to four. Pool all classes, and use class interactions only for the key variables.</w:t>
+      </w:r>
+    </w:p>
+    <w:p>
+      <w:pPr>
+        <w:pStyle w:val="ListParagraph"/>
+        <w:numPr>
+          <w:ilvl w:val="0"/>
+          <w:numId w:val="2"/>
+        </w:numPr>
+        <w:spacing w:after="80" w:line="264"/>
+      </w:pPr>
+      <w:r>
+        <w:rPr>
+          <w:b/>
+          <w:bCs/>
+        </w:rPr>
+        <w:t xml:space="preserve">Checks:</w:t>
+      </w:r>
+      <w:r>
+        <w:t xml:space="preserve"> run the model with and without the Turkish lines and the Indonesian sovereign pairs, and on both horizons.</w:t>
+      </w:r>
+    </w:p>
+    <w:p>
+      <w:pPr>
+        <w:pStyle w:val="Heading2"/>
+      </w:pPr>
+      <w:r>
+        <w:t xml:space="preserve">5.2 Current sample size (from your draft)</w:t>
+      </w:r>
+    </w:p>
+    <w:tbl>
+      <w:tblPr>
+        <w:tblW w:type="dxa" w:w="9638"/>
+        <w:tblBorders>
+          <w:top w:val="single" w:color="auto" w:sz="4"/>
+          <w:left w:val="single" w:color="auto" w:sz="4"/>
+          <w:bottom w:val="single" w:color="auto" w:sz="4"/>
+          <w:right w:val="single" w:color="auto" w:sz="4"/>
+          <w:insideH w:val="single" w:color="auto" w:sz="4"/>
+          <w:insideV w:val="single" w:color="auto" w:sz="4"/>
+        </w:tblBorders>
+      </w:tblPr>
+      <w:tblGrid>
+        <w:gridCol w:w="2891"/>
+        <w:gridCol w:w="3662"/>
+        <w:gridCol w:w="3085"/>
+      </w:tblGrid>
+      <w:tr>
+        <w:trPr>
+          <w:tblHeader/>
+        </w:trPr>
+        <w:tc>
+          <w:tcPr>
+            <w:tcW w:type="dxa" w:w="2891"/>
+            <w:shd w:fill="1F3864" w:color="auto" w:val="clear"/>
+            <w:tcMar>
+              <w:top w:type="dxa" w:w="60"/>
+              <w:left w:type="dxa" w:w="90"/>
+              <w:bottom w:type="dxa" w:w="60"/>
+              <w:right w:type="dxa" w:w="90"/>
+            </w:tcMar>
+          </w:tcPr>
+          <w:p>
+            <w:pPr>
+              <w:spacing w:after="40"/>
+            </w:pPr>
+            <w:r>
+              <w:rPr>
+                <w:b/>
+                <w:bCs/>
+                <w:color w:val="FFFFFF"/>
+                <w:sz w:val="18"/>
+                <w:szCs w:val="18"/>
+              </w:rPr>
+              <w:t xml:space="preserve">Item</w:t>
+            </w:r>
+          </w:p>
+        </w:tc>
+        <w:tc>
+          <w:tcPr>
+            <w:tcW w:type="dxa" w:w="3662"/>
+            <w:shd w:fill="1F3864" w:color="auto" w:val="clear"/>
+            <w:tcMar>
+              <w:top w:type="dxa" w:w="60"/>
+              <w:left w:type="dxa" w:w="90"/>
+              <w:bottom w:type="dxa" w:w="60"/>
+              <w:right w:type="dxa" w:w="90"/>
+            </w:tcMar>
+          </w:tcPr>
+          <w:p>
+            <w:pPr>
+              <w:spacing w:after="40"/>
+            </w:pPr>
+            <w:r>
+              <w:rPr>
+                <w:b/>
+                <w:bCs/>
+                <w:color w:val="FFFFFF"/>
+                <w:sz w:val="18"/>
+                <w:szCs w:val="18"/>
+              </w:rPr>
+              <w:t xml:space="preserve">Size</w:t>
+            </w:r>
+          </w:p>
+        </w:tc>
+        <w:tc>
+          <w:tcPr>
+            <w:tcW w:type="dxa" w:w="3085"/>
+            <w:shd w:fill="1F3864" w:color="auto" w:val="clear"/>
+            <w:tcMar>
+              <w:top w:type="dxa" w:w="60"/>
+              <w:left w:type="dxa" w:w="90"/>
+              <w:bottom w:type="dxa" w:w="60"/>
+              <w:right w:type="dxa" w:w="90"/>
+            </w:tcMar>
+          </w:tcPr>
+          <w:p>
+            <w:pPr>
+              <w:spacing w:after="40"/>
+            </w:pPr>
+            <w:r>
+              <w:rPr>
+                <w:b/>
+                <w:bCs/>
+                <w:color w:val="FFFFFF"/>
+                <w:sz w:val="18"/>
+                <w:szCs w:val="18"/>
+              </w:rPr>
+              <w:t xml:space="preserve">Where in the draft</w:t>
+            </w:r>
+          </w:p>
+        </w:tc>
+      </w:tr>
+      <w:tr>
+        <w:trPr>
+          <w:cantSplit w:val="off"/>
+        </w:trPr>
+        <w:tc>
+          <w:tcPr>
+            <w:tcW w:type="dxa" w:w="2891"/>
+            <w:tcMar>
+              <w:top w:type="dxa" w:w="60"/>
+              <w:left w:type="dxa" w:w="90"/>
+              <w:bottom w:type="dxa" w:w="60"/>
+              <w:right w:type="dxa" w:w="90"/>
+            </w:tcMar>
+          </w:tcPr>
+          <w:p>
+            <w:pPr>
+              <w:spacing w:after="40"/>
+            </w:pPr>
+            <w:r>
+              <w:rPr>
+                <w:sz w:val="18"/>
+                <w:szCs w:val="18"/>
+              </w:rPr>
+              <w:t xml:space="preserve">Matched pairs, full horizon</w:t>
+            </w:r>
+          </w:p>
+        </w:tc>
+        <w:tc>
+          <w:tcPr>
+            <w:tcW w:type="dxa" w:w="3662"/>
+            <w:tcMar>
+              <w:top w:type="dxa" w:w="60"/>
+              <w:left w:type="dxa" w:w="90"/>
+              <w:bottom w:type="dxa" w:w="60"/>
+              <w:right w:type="dxa" w:w="90"/>
+            </w:tcMar>
+          </w:tcPr>
+          <w:p>
+            <w:pPr>
+              <w:spacing w:after="40"/>
+            </w:pPr>
+            <w:r>
+              <w:rPr>
+                <w:sz w:val="18"/>
+                <w:szCs w:val="18"/>
+              </w:rPr>
+              <w:t xml:space="preserve">72 (17 callable, 25 AT1, 30 labelled)</w:t>
+            </w:r>
+          </w:p>
+        </w:tc>
+        <w:tc>
+          <w:tcPr>
+            <w:tcW w:type="dxa" w:w="3085"/>
+            <w:tcMar>
+              <w:top w:type="dxa" w:w="60"/>
+              <w:left w:type="dxa" w:w="90"/>
+              <w:bottom w:type="dxa" w:w="60"/>
+              <w:right w:type="dxa" w:w="90"/>
+            </w:tcMar>
+          </w:tcPr>
+          <w:p>
+            <w:pPr>
+              <w:spacing w:after="40"/>
+            </w:pPr>
+            <w:r>
+              <w:rPr>
+                <w:sz w:val="18"/>
+                <w:szCs w:val="18"/>
+              </w:rPr>
+              <w:t xml:space="preserve">§3.16, p. 27; §4.2, p. 30; Table 4.1, p. 35</w:t>
+            </w:r>
+          </w:p>
+        </w:tc>
+      </w:tr>
+      <w:tr>
+        <w:trPr>
+          <w:cantSplit w:val="off"/>
+        </w:trPr>
+        <w:tc>
+          <w:tcPr>
+            <w:tcW w:type="dxa" w:w="2891"/>
+            <w:tcMar>
+              <w:top w:type="dxa" w:w="60"/>
+              <w:left w:type="dxa" w:w="90"/>
+              <w:bottom w:type="dxa" w:w="60"/>
+              <w:right w:type="dxa" w:w="90"/>
+            </w:tcMar>
+          </w:tcPr>
+          <w:p>
+            <w:pPr>
+              <w:spacing w:after="40"/>
+            </w:pPr>
+            <w:r>
+              <w:rPr>
+                <w:sz w:val="18"/>
+                <w:szCs w:val="18"/>
+              </w:rPr>
+              <w:t xml:space="preserve">Matched pairs, pre-specified window</w:t>
+            </w:r>
+          </w:p>
+        </w:tc>
+        <w:tc>
+          <w:tcPr>
+            <w:tcW w:type="dxa" w:w="3662"/>
+            <w:tcMar>
+              <w:top w:type="dxa" w:w="60"/>
+              <w:left w:type="dxa" w:w="90"/>
+              <w:bottom w:type="dxa" w:w="60"/>
+              <w:right w:type="dxa" w:w="90"/>
+            </w:tcMar>
+          </w:tcPr>
+          <w:p>
+            <w:pPr>
+              <w:spacing w:after="40"/>
+            </w:pPr>
+            <w:r>
+              <w:rPr>
+                <w:sz w:val="18"/>
+                <w:szCs w:val="18"/>
+              </w:rPr>
+              <w:t xml:space="preserve">15 callable, 21 AT1, 25 labelled</w:t>
+            </w:r>
+          </w:p>
+        </w:tc>
+        <w:tc>
+          <w:tcPr>
+            <w:tcW w:type="dxa" w:w="3085"/>
+            <w:tcMar>
+              <w:top w:type="dxa" w:w="60"/>
+              <w:left w:type="dxa" w:w="90"/>
+              <w:bottom w:type="dxa" w:w="60"/>
+              <w:right w:type="dxa" w:w="90"/>
+            </w:tcMar>
+          </w:tcPr>
+          <w:p>
+            <w:pPr>
+              <w:spacing w:after="40"/>
+            </w:pPr>
+            <w:r>
+              <w:rPr>
+                <w:sz w:val="18"/>
+                <w:szCs w:val="18"/>
+              </w:rPr>
+              <w:t xml:space="preserve">Table 4.1, p. 35. Note: §4.2 (p. 30) says 23 AT1 pairs; please reconcile.</w:t>
+            </w:r>
+          </w:p>
+        </w:tc>
+      </w:tr>
+      <w:tr>
+        <w:trPr>
+          <w:cantSplit w:val="off"/>
+        </w:trPr>
+        <w:tc>
+          <w:tcPr>
+            <w:tcW w:type="dxa" w:w="2891"/>
+            <w:tcMar>
+              <w:top w:type="dxa" w:w="60"/>
+              <w:left w:type="dxa" w:w="90"/>
+              <w:bottom w:type="dxa" w:w="60"/>
+              <w:right w:type="dxa" w:w="90"/>
+            </w:tcMar>
+          </w:tcPr>
+          <w:p>
+            <w:pPr>
+              <w:spacing w:after="40"/>
+            </w:pPr>
+            <w:r>
+              <w:rPr>
+                <w:sz w:val="18"/>
+                <w:szCs w:val="18"/>
+              </w:rPr>
+              <w:t xml:space="preserve">Pair-months</w:t>
+            </w:r>
+          </w:p>
+        </w:tc>
+        <w:tc>
+          <w:tcPr>
+            <w:tcW w:type="dxa" w:w="3662"/>
+            <w:tcMar>
+              <w:top w:type="dxa" w:w="60"/>
+              <w:left w:type="dxa" w:w="90"/>
+              <w:bottom w:type="dxa" w:w="60"/>
+              <w:right w:type="dxa" w:w="90"/>
+            </w:tcMar>
+          </w:tcPr>
+          <w:p>
+            <w:pPr>
+              <w:spacing w:after="40"/>
+            </w:pPr>
+            <w:r>
+              <w:rPr>
+                <w:sz w:val="18"/>
+                <w:szCs w:val="18"/>
+              </w:rPr>
+              <w:t xml:space="preserve">1,896 full horizon; 1,122 window</w:t>
+            </w:r>
+          </w:p>
+        </w:tc>
+        <w:tc>
+          <w:tcPr>
+            <w:tcW w:type="dxa" w:w="3085"/>
+            <w:tcMar>
+              <w:top w:type="dxa" w:w="60"/>
+              <w:left w:type="dxa" w:w="90"/>
+              <w:bottom w:type="dxa" w:w="60"/>
+              <w:right w:type="dxa" w:w="90"/>
+            </w:tcMar>
+          </w:tcPr>
+          <w:p>
+            <w:pPr>
+              <w:spacing w:after="40"/>
+            </w:pPr>
+            <w:r>
+              <w:rPr>
+                <w:sz w:val="18"/>
+                <w:szCs w:val="18"/>
+              </w:rPr>
+              <w:t xml:space="preserve">§3.16, p. 27</w:t>
+            </w:r>
+          </w:p>
+        </w:tc>
+      </w:tr>
+      <w:tr>
+        <w:trPr>
+          <w:cantSplit w:val="off"/>
+        </w:trPr>
+        <w:tc>
+          <w:tcPr>
+            <w:tcW w:type="dxa" w:w="2891"/>
+            <w:tcMar>
+              <w:top w:type="dxa" w:w="60"/>
+              <w:left w:type="dxa" w:w="90"/>
+              <w:bottom w:type="dxa" w:w="60"/>
+              <w:right w:type="dxa" w:w="90"/>
+            </w:tcMar>
+          </w:tcPr>
+          <w:p>
+            <w:pPr>
+              <w:spacing w:after="40"/>
+            </w:pPr>
+            <w:r>
+              <w:rPr>
+                <w:sz w:val="18"/>
+                <w:szCs w:val="18"/>
+              </w:rPr>
+              <w:t xml:space="preserve">Independent issuer groups</w:t>
+            </w:r>
+          </w:p>
+        </w:tc>
+        <w:tc>
+          <w:tcPr>
+            <w:tcW w:type="dxa" w:w="3662"/>
+            <w:tcMar>
+              <w:top w:type="dxa" w:w="60"/>
+              <w:left w:type="dxa" w:w="90"/>
+              <w:bottom w:type="dxa" w:w="60"/>
+              <w:right w:type="dxa" w:w="90"/>
+            </w:tcMar>
+          </w:tcPr>
+          <w:p>
+            <w:pPr>
+              <w:spacing w:after="40"/>
+            </w:pPr>
+            <w:r>
+              <w:rPr>
+                <w:sz w:val="18"/>
+                <w:szCs w:val="18"/>
+              </w:rPr>
+              <w:t xml:space="preserve">20 structural + 10 labelled = 30</w:t>
+            </w:r>
+          </w:p>
+        </w:tc>
+        <w:tc>
+          <w:tcPr>
+            <w:tcW w:type="dxa" w:w="3085"/>
+            <w:tcMar>
+              <w:top w:type="dxa" w:w="60"/>
+              <w:left w:type="dxa" w:w="90"/>
+              <w:bottom w:type="dxa" w:w="60"/>
+              <w:right w:type="dxa" w:w="90"/>
+            </w:tcMar>
+          </w:tcPr>
+          <w:p>
+            <w:pPr>
+              <w:spacing w:after="40"/>
+            </w:pPr>
+            <w:r>
+              <w:rPr>
+                <w:sz w:val="18"/>
+                <w:szCs w:val="18"/>
+              </w:rPr>
+              <w:t xml:space="preserve">§4.2, p. 30</w:t>
+            </w:r>
+          </w:p>
+        </w:tc>
+      </w:tr>
+      <w:tr>
+        <w:trPr>
+          <w:cantSplit w:val="off"/>
+        </w:trPr>
+        <w:tc>
+          <w:tcPr>
+            <w:tcW w:type="dxa" w:w="2891"/>
+            <w:tcMar>
+              <w:top w:type="dxa" w:w="60"/>
+              <w:left w:type="dxa" w:w="90"/>
+              <w:bottom w:type="dxa" w:w="60"/>
+              <w:right w:type="dxa" w:w="90"/>
+            </w:tcMar>
+          </w:tcPr>
+          <w:p>
+            <w:pPr>
+              <w:spacing w:after="40"/>
+            </w:pPr>
+            <w:r>
+              <w:rPr>
+                <w:sz w:val="18"/>
+                <w:szCs w:val="18"/>
+              </w:rPr>
+              <w:t xml:space="preserve">Security-level panel</w:t>
+            </w:r>
+          </w:p>
+        </w:tc>
+        <w:tc>
+          <w:tcPr>
+            <w:tcW w:type="dxa" w:w="3662"/>
+            <w:tcMar>
+              <w:top w:type="dxa" w:w="60"/>
+              <w:left w:type="dxa" w:w="90"/>
+              <w:bottom w:type="dxa" w:w="60"/>
+              <w:right w:type="dxa" w:w="90"/>
+            </w:tcMar>
+          </w:tcPr>
+          <w:p>
+            <w:pPr>
+              <w:spacing w:after="40"/>
+            </w:pPr>
+            <w:r>
+              <w:rPr>
+                <w:sz w:val="18"/>
+                <w:szCs w:val="18"/>
+              </w:rPr>
+              <w:t xml:space="preserve">283 securities; 8,284 security-months</w:t>
+            </w:r>
+          </w:p>
+        </w:tc>
+        <w:tc>
+          <w:tcPr>
+            <w:tcW w:type="dxa" w:w="3085"/>
+            <w:tcMar>
+              <w:top w:type="dxa" w:w="60"/>
+              <w:left w:type="dxa" w:w="90"/>
+              <w:bottom w:type="dxa" w:w="60"/>
+              <w:right w:type="dxa" w:w="90"/>
+            </w:tcMar>
+          </w:tcPr>
+          <w:p>
+            <w:pPr>
+              <w:spacing w:after="40"/>
+            </w:pPr>
+            <w:r>
+              <w:rPr>
+                <w:sz w:val="18"/>
+                <w:szCs w:val="18"/>
+              </w:rPr>
+              <w:t xml:space="preserve">§3.16, p. 28</w:t>
+            </w:r>
+          </w:p>
+        </w:tc>
+      </w:tr>
+      <w:tr>
+        <w:trPr>
+          <w:cantSplit w:val="off"/>
+        </w:trPr>
+        <w:tc>
+          <w:tcPr>
+            <w:tcW w:type="dxa" w:w="2891"/>
+            <w:tcMar>
+              <w:top w:type="dxa" w:w="60"/>
+              <w:left w:type="dxa" w:w="90"/>
+              <w:bottom w:type="dxa" w:w="60"/>
+              <w:right w:type="dxa" w:w="90"/>
+            </w:tcMar>
+          </w:tcPr>
+          <w:p>
+            <w:pPr>
+              <w:spacing w:after="40"/>
+            </w:pPr>
+            <w:r>
+              <w:rPr>
+                <w:sz w:val="18"/>
+                <w:szCs w:val="18"/>
+              </w:rPr>
+              <w:t xml:space="preserve">Time-varying covariates available</w:t>
+            </w:r>
+          </w:p>
+        </w:tc>
+        <w:tc>
+          <w:tcPr>
+            <w:tcW w:type="dxa" w:w="3662"/>
+            <w:tcMar>
+              <w:top w:type="dxa" w:w="60"/>
+              <w:left w:type="dxa" w:w="90"/>
+              <w:bottom w:type="dxa" w:w="60"/>
+              <w:right w:type="dxa" w:w="90"/>
+            </w:tcMar>
+          </w:tcPr>
+          <w:p>
+            <w:pPr>
+              <w:spacing w:after="40"/>
+            </w:pPr>
+            <w:r>
+              <w:rPr>
+                <w:sz w:val="18"/>
+                <w:szCs w:val="18"/>
+              </w:rPr>
+              <w:t xml:space="preserve">Quoted spreads for 128 of 130 legs; option-adjusted spreads for all 130 legs; quarter-end liquidity scores from Sep 2022 only; no rating history</w:t>
+            </w:r>
+          </w:p>
+        </w:tc>
+        <w:tc>
+          <w:tcPr>
+            <w:tcW w:type="dxa" w:w="3085"/>
+            <w:tcMar>
+              <w:top w:type="dxa" w:w="60"/>
+              <w:left w:type="dxa" w:w="90"/>
+              <w:bottom w:type="dxa" w:w="60"/>
+              <w:right w:type="dxa" w:w="90"/>
+            </w:tcMar>
+          </w:tcPr>
+          <w:p>
+            <w:pPr>
+              <w:spacing w:after="40"/>
+            </w:pPr>
+            <w:r>
+              <w:rPr>
+                <w:sz w:val="18"/>
+                <w:szCs w:val="18"/>
+              </w:rPr>
+              <w:t xml:space="preserve">§4.8, pp. 44–45; §3.13, p. 21; App. D.4, pp. 111–112</w:t>
+            </w:r>
+          </w:p>
+        </w:tc>
+      </w:tr>
+      <w:tr>
+        <w:trPr>
+          <w:cantSplit w:val="off"/>
+        </w:trPr>
+        <w:tc>
+          <w:tcPr>
+            <w:tcW w:type="dxa" w:w="2891"/>
+            <w:tcMar>
+              <w:top w:type="dxa" w:w="60"/>
+              <w:left w:type="dxa" w:w="90"/>
+              <w:bottom w:type="dxa" w:w="60"/>
+              <w:right w:type="dxa" w:w="90"/>
+            </w:tcMar>
+          </w:tcPr>
+          <w:p>
+            <w:pPr>
+              <w:spacing w:after="40"/>
+            </w:pPr>
+            <w:r>
+              <w:rPr>
+                <w:sz w:val="18"/>
+                <w:szCs w:val="18"/>
+              </w:rPr>
+              <w:t xml:space="preserve">Current determinants work</w:t>
+            </w:r>
+          </w:p>
+        </w:tc>
+        <w:tc>
+          <w:tcPr>
+            <w:tcW w:type="dxa" w:w="3662"/>
+            <w:tcMar>
+              <w:top w:type="dxa" w:w="60"/>
+              <w:left w:type="dxa" w:w="90"/>
+              <w:bottom w:type="dxa" w:w="60"/>
+              <w:right w:type="dxa" w:w="90"/>
+            </w:tcMar>
+          </w:tcPr>
+          <w:p>
+            <w:pPr>
+              <w:spacing w:after="40"/>
+            </w:pPr>
+            <w:r>
+              <w:rPr>
+                <w:sz w:val="18"/>
+                <w:szCs w:val="18"/>
+              </w:rPr>
+              <w:t xml:space="preserve">15 callable pairs, 5 parameters, 10 residual degrees of freedom (exploratory only)</w:t>
+            </w:r>
+          </w:p>
+        </w:tc>
+        <w:tc>
+          <w:tcPr>
+            <w:tcW w:type="dxa" w:w="3085"/>
+            <w:tcMar>
+              <w:top w:type="dxa" w:w="60"/>
+              <w:left w:type="dxa" w:w="90"/>
+              <w:bottom w:type="dxa" w:w="60"/>
+              <w:right w:type="dxa" w:w="90"/>
+            </w:tcMar>
+          </w:tcPr>
+          <w:p>
+            <w:pPr>
+              <w:spacing w:after="40"/>
+            </w:pPr>
+            <w:r>
+              <w:rPr>
+                <w:sz w:val="18"/>
+                <w:szCs w:val="18"/>
+              </w:rPr>
+              <w:t xml:space="preserve">§3.13, p. 22; App. C.3, p. 108</w:t>
+            </w:r>
+          </w:p>
+        </w:tc>
+      </w:tr>
+    </w:tbl>
+    <w:p>
+      <w:pPr>
+        <w:spacing w:after="60"/>
+      </w:pPr>
+    </w:p>
+    <w:p>
+      <w:pPr>
+        <w:pStyle w:val="Heading2"/>
+      </w:pPr>
+      <w:r>
+        <w:t xml:space="preserve">5.3 Is the sample eligible? Comparison with past research</w:t>
+      </w:r>
+    </w:p>
+    <w:tbl>
+      <w:tblPr>
+        <w:tblW w:type="dxa" w:w="9638"/>
+        <w:tblBorders>
+          <w:top w:val="single" w:color="auto" w:sz="4"/>
+          <w:left w:val="single" w:color="auto" w:sz="4"/>
+          <w:bottom w:val="single" w:color="auto" w:sz="4"/>
+          <w:right w:val="single" w:color="auto" w:sz="4"/>
+          <w:insideH w:val="single" w:color="auto" w:sz="4"/>
+          <w:insideV w:val="single" w:color="auto" w:sz="4"/>
+        </w:tblBorders>
+      </w:tblPr>
+      <w:tblGrid>
+        <w:gridCol w:w="2313"/>
+        <w:gridCol w:w="2891"/>
+        <w:gridCol w:w="2120"/>
+        <w:gridCol w:w="2314"/>
+      </w:tblGrid>
+      <w:tr>
+        <w:trPr>
+          <w:tblHeader/>
+        </w:trPr>
+        <w:tc>
+          <w:tcPr>
+            <w:tcW w:type="dxa" w:w="2313"/>
+            <w:shd w:fill="1F3864" w:color="auto" w:val="clear"/>
+            <w:tcMar>
+              <w:top w:type="dxa" w:w="60"/>
+              <w:left w:type="dxa" w:w="90"/>
+              <w:bottom w:type="dxa" w:w="60"/>
+              <w:right w:type="dxa" w:w="90"/>
+            </w:tcMar>
+          </w:tcPr>
+          <w:p>
+            <w:pPr>
+              <w:spacing w:after="40"/>
+            </w:pPr>
+            <w:r>
+              <w:rPr>
+                <w:b/>
+                <w:bCs/>
+                <w:color w:val="FFFFFF"/>
+                <w:sz w:val="18"/>
+                <w:szCs w:val="18"/>
+              </w:rPr>
+              <w:t xml:space="preserve">Study</w:t>
+            </w:r>
+          </w:p>
+        </w:tc>
+        <w:tc>
+          <w:tcPr>
+            <w:tcW w:type="dxa" w:w="2891"/>
+            <w:shd w:fill="1F3864" w:color="auto" w:val="clear"/>
+            <w:tcMar>
+              <w:top w:type="dxa" w:w="60"/>
+              <w:left w:type="dxa" w:w="90"/>
+              <w:bottom w:type="dxa" w:w="60"/>
+              <w:right w:type="dxa" w:w="90"/>
+            </w:tcMar>
+          </w:tcPr>
+          <w:p>
+            <w:pPr>
+              <w:spacing w:after="40"/>
+            </w:pPr>
+            <w:r>
+              <w:rPr>
+                <w:b/>
+                <w:bCs/>
+                <w:color w:val="FFFFFF"/>
+                <w:sz w:val="18"/>
+                <w:szCs w:val="18"/>
+              </w:rPr>
+              <w:t xml:space="preserve">Design</w:t>
+            </w:r>
+          </w:p>
+        </w:tc>
+        <w:tc>
+          <w:tcPr>
+            <w:tcW w:type="dxa" w:w="2120"/>
+            <w:shd w:fill="1F3864" w:color="auto" w:val="clear"/>
+            <w:tcMar>
+              <w:top w:type="dxa" w:w="60"/>
+              <w:left w:type="dxa" w:w="90"/>
+              <w:bottom w:type="dxa" w:w="60"/>
+              <w:right w:type="dxa" w:w="90"/>
+            </w:tcMar>
+          </w:tcPr>
+          <w:p>
+            <w:pPr>
+              <w:spacing w:after="40"/>
+            </w:pPr>
+            <w:r>
+              <w:rPr>
+                <w:b/>
+                <w:bCs/>
+                <w:color w:val="FFFFFF"/>
+                <w:sz w:val="18"/>
+                <w:szCs w:val="18"/>
+              </w:rPr>
+              <w:t xml:space="preserve">Sample</w:t>
+            </w:r>
+          </w:p>
+        </w:tc>
+        <w:tc>
+          <w:tcPr>
+            <w:tcW w:type="dxa" w:w="2314"/>
+            <w:shd w:fill="1F3864" w:color="auto" w:val="clear"/>
+            <w:tcMar>
+              <w:top w:type="dxa" w:w="60"/>
+              <w:left w:type="dxa" w:w="90"/>
+              <w:bottom w:type="dxa" w:w="60"/>
+              <w:right w:type="dxa" w:w="90"/>
+            </w:tcMar>
+          </w:tcPr>
+          <w:p>
+            <w:pPr>
+              <w:spacing w:after="40"/>
+            </w:pPr>
+            <w:r>
+              <w:rPr>
+                <w:b/>
+                <w:bCs/>
+                <w:color w:val="FFFFFF"/>
+                <w:sz w:val="18"/>
+                <w:szCs w:val="18"/>
+              </w:rPr>
+              <w:t xml:space="preserve">Comparison</w:t>
+            </w:r>
+          </w:p>
+        </w:tc>
+      </w:tr>
+      <w:tr>
+        <w:trPr>
+          <w:cantSplit w:val="off"/>
+        </w:trPr>
+        <w:tc>
+          <w:tcPr>
+            <w:tcW w:type="dxa" w:w="2313"/>
+            <w:tcMar>
+              <w:top w:type="dxa" w:w="60"/>
+              <w:left w:type="dxa" w:w="90"/>
+              <w:bottom w:type="dxa" w:w="60"/>
+              <w:right w:type="dxa" w:w="90"/>
+            </w:tcMar>
+          </w:tcPr>
+          <w:p>
+            <w:pPr>
+              <w:spacing w:after="40"/>
+            </w:pPr>
+            <w:r>
+              <w:rPr>
+                <w:sz w:val="18"/>
+                <w:szCs w:val="18"/>
+              </w:rPr>
+              <w:t xml:space="preserve">Oktavio &amp; Riyanti (2021)</w:t>
+            </w:r>
+          </w:p>
+        </w:tc>
+        <w:tc>
+          <w:tcPr>
+            <w:tcW w:type="dxa" w:w="2891"/>
+            <w:tcMar>
+              <w:top w:type="dxa" w:w="60"/>
+              <w:left w:type="dxa" w:w="90"/>
+              <w:bottom w:type="dxa" w:w="60"/>
+              <w:right w:type="dxa" w:w="90"/>
+            </w:tcMar>
+          </w:tcPr>
+          <w:p>
+            <w:pPr>
+              <w:spacing w:after="40"/>
+            </w:pPr>
+            <w:r>
+              <w:rPr>
+                <w:sz w:val="18"/>
+                <w:szCs w:val="18"/>
+              </w:rPr>
+              <w:t xml:space="preserve">Two-step: fixed-effects panel, then cross-section of determinants</w:t>
+            </w:r>
+          </w:p>
+        </w:tc>
+        <w:tc>
+          <w:tcPr>
+            <w:tcW w:type="dxa" w:w="2120"/>
+            <w:tcMar>
+              <w:top w:type="dxa" w:w="60"/>
+              <w:left w:type="dxa" w:w="90"/>
+              <w:bottom w:type="dxa" w:w="60"/>
+              <w:right w:type="dxa" w:w="90"/>
+            </w:tcMar>
+          </w:tcPr>
+          <w:p>
+            <w:pPr>
+              <w:spacing w:after="40"/>
+            </w:pPr>
+            <w:r>
+              <w:rPr>
+                <w:sz w:val="18"/>
+                <w:szCs w:val="18"/>
+              </w:rPr>
+              <w:t xml:space="preserve">42 ASEAN green bonds</w:t>
+            </w:r>
+          </w:p>
+        </w:tc>
+        <w:tc>
+          <w:tcPr>
+            <w:tcW w:type="dxa" w:w="2314"/>
+            <w:tcMar>
+              <w:top w:type="dxa" w:w="60"/>
+              <w:left w:type="dxa" w:w="90"/>
+              <w:bottom w:type="dxa" w:w="60"/>
+              <w:right w:type="dxa" w:w="90"/>
+            </w:tcMar>
+          </w:tcPr>
+          <w:p>
+            <w:pPr>
+              <w:spacing w:after="40"/>
+            </w:pPr>
+            <w:r>
+              <w:rPr>
+                <w:sz w:val="18"/>
+                <w:szCs w:val="18"/>
+              </w:rPr>
+              <w:t xml:space="preserve">Your 72 pairs exceed this. The same design is feasible.</w:t>
+            </w:r>
+          </w:p>
+        </w:tc>
+      </w:tr>
+      <w:tr>
+        <w:trPr>
+          <w:cantSplit w:val="off"/>
+        </w:trPr>
+        <w:tc>
+          <w:tcPr>
+            <w:tcW w:type="dxa" w:w="2313"/>
+            <w:tcMar>
+              <w:top w:type="dxa" w:w="60"/>
+              <w:left w:type="dxa" w:w="90"/>
+              <w:bottom w:type="dxa" w:w="60"/>
+              <w:right w:type="dxa" w:w="90"/>
+            </w:tcMar>
+          </w:tcPr>
+          <w:p>
+            <w:pPr>
+              <w:spacing w:after="40"/>
+            </w:pPr>
+            <w:r>
+              <w:rPr>
+                <w:sz w:val="18"/>
+                <w:szCs w:val="18"/>
+              </w:rPr>
+              <w:t xml:space="preserve">Sun, Feng &amp; Zhou (2022)</w:t>
+            </w:r>
+          </w:p>
+        </w:tc>
+        <w:tc>
+          <w:tcPr>
+            <w:tcW w:type="dxa" w:w="2891"/>
+            <w:tcMar>
+              <w:top w:type="dxa" w:w="60"/>
+              <w:left w:type="dxa" w:w="90"/>
+              <w:bottom w:type="dxa" w:w="60"/>
+              <w:right w:type="dxa" w:w="90"/>
+            </w:tcMar>
+          </w:tcPr>
+          <w:p>
+            <w:pPr>
+              <w:spacing w:after="40"/>
+            </w:pPr>
+            <w:r>
+              <w:rPr>
+                <w:sz w:val="18"/>
+                <w:szCs w:val="18"/>
+              </w:rPr>
+              <w:t xml:space="preserve">Green vs conventional, with determinants</w:t>
+            </w:r>
+          </w:p>
+        </w:tc>
+        <w:tc>
+          <w:tcPr>
+            <w:tcW w:type="dxa" w:w="2120"/>
+            <w:tcMar>
+              <w:top w:type="dxa" w:w="60"/>
+              <w:left w:type="dxa" w:w="90"/>
+              <w:bottom w:type="dxa" w:w="60"/>
+              <w:right w:type="dxa" w:w="90"/>
+            </w:tcMar>
+          </w:tcPr>
+          <w:p>
+            <w:pPr>
+              <w:spacing w:after="40"/>
+            </w:pPr>
+            <w:r>
+              <w:rPr>
+                <w:sz w:val="18"/>
+                <w:szCs w:val="18"/>
+              </w:rPr>
+              <w:t xml:space="preserve">227 green and 405 conventional bonds</w:t>
+            </w:r>
+          </w:p>
+        </w:tc>
+        <w:tc>
+          <w:tcPr>
+            <w:tcW w:type="dxa" w:w="2314"/>
+            <w:tcMar>
+              <w:top w:type="dxa" w:w="60"/>
+              <w:left w:type="dxa" w:w="90"/>
+              <w:bottom w:type="dxa" w:w="60"/>
+              <w:right w:type="dxa" w:w="90"/>
+            </w:tcMar>
+          </w:tcPr>
+          <w:p>
+            <w:pPr>
+              <w:spacing w:after="40"/>
+            </w:pPr>
+            <w:r>
+              <w:rPr>
+                <w:sz w:val="18"/>
+                <w:szCs w:val="18"/>
+              </w:rPr>
+              <w:t xml:space="preserve">Much larger; you cannot match its number of controls.</w:t>
+            </w:r>
+          </w:p>
+        </w:tc>
+      </w:tr>
+      <w:tr>
+        <w:trPr>
+          <w:cantSplit w:val="off"/>
+        </w:trPr>
+        <w:tc>
+          <w:tcPr>
+            <w:tcW w:type="dxa" w:w="2313"/>
+            <w:tcMar>
+              <w:top w:type="dxa" w:w="60"/>
+              <w:left w:type="dxa" w:w="90"/>
+              <w:bottom w:type="dxa" w:w="60"/>
+              <w:right w:type="dxa" w:w="90"/>
+            </w:tcMar>
+          </w:tcPr>
+          <w:p>
+            <w:pPr>
+              <w:spacing w:after="40"/>
+            </w:pPr>
+            <w:r>
+              <w:rPr>
+                <w:sz w:val="18"/>
+                <w:szCs w:val="18"/>
+              </w:rPr>
+              <w:t xml:space="preserve">Grishunin, Bukreeva &amp; Suloeva (2023)</w:t>
+            </w:r>
+          </w:p>
+        </w:tc>
+        <w:tc>
+          <w:tcPr>
+            <w:tcW w:type="dxa" w:w="2891"/>
+            <w:tcMar>
+              <w:top w:type="dxa" w:w="60"/>
+              <w:left w:type="dxa" w:w="90"/>
+              <w:bottom w:type="dxa" w:w="60"/>
+              <w:right w:type="dxa" w:w="90"/>
+            </w:tcMar>
+          </w:tcPr>
+          <w:p>
+            <w:pPr>
+              <w:spacing w:after="40"/>
+            </w:pPr>
+            <w:r>
+              <w:rPr>
+                <w:sz w:val="18"/>
+                <w:szCs w:val="18"/>
+              </w:rPr>
+              <w:t xml:space="preserve">Linear regression of yields on determinants</w:t>
+            </w:r>
+          </w:p>
+        </w:tc>
+        <w:tc>
+          <w:tcPr>
+            <w:tcW w:type="dxa" w:w="2120"/>
+            <w:tcMar>
+              <w:top w:type="dxa" w:w="60"/>
+              <w:left w:type="dxa" w:w="90"/>
+              <w:bottom w:type="dxa" w:w="60"/>
+              <w:right w:type="dxa" w:w="90"/>
+            </w:tcMar>
+          </w:tcPr>
+          <w:p>
+            <w:pPr>
+              <w:spacing w:after="40"/>
+            </w:pPr>
+            <w:r>
+              <w:rPr>
+                <w:sz w:val="18"/>
+                <w:szCs w:val="18"/>
+              </w:rPr>
+              <w:t xml:space="preserve">3,851 bonds</w:t>
+            </w:r>
+          </w:p>
+        </w:tc>
+        <w:tc>
+          <w:tcPr>
+            <w:tcW w:type="dxa" w:w="2314"/>
+            <w:tcMar>
+              <w:top w:type="dxa" w:w="60"/>
+              <w:left w:type="dxa" w:w="90"/>
+              <w:bottom w:type="dxa" w:w="60"/>
+              <w:right w:type="dxa" w:w="90"/>
+            </w:tcMar>
+          </w:tcPr>
+          <w:p>
+            <w:pPr>
+              <w:spacing w:after="40"/>
+            </w:pPr>
+            <w:r>
+              <w:rPr>
+                <w:sz w:val="18"/>
+                <w:szCs w:val="18"/>
+              </w:rPr>
+              <w:t xml:space="preserve">Much larger; you cannot match its model size.</w:t>
+            </w:r>
+          </w:p>
+        </w:tc>
+      </w:tr>
+      <w:tr>
+        <w:trPr>
+          <w:cantSplit w:val="off"/>
+        </w:trPr>
+        <w:tc>
+          <w:tcPr>
+            <w:tcW w:type="dxa" w:w="2313"/>
+            <w:tcMar>
+              <w:top w:type="dxa" w:w="60"/>
+              <w:left w:type="dxa" w:w="90"/>
+              <w:bottom w:type="dxa" w:w="60"/>
+              <w:right w:type="dxa" w:w="90"/>
+            </w:tcMar>
+          </w:tcPr>
+          <w:p>
+            <w:pPr>
+              <w:spacing w:after="40"/>
+            </w:pPr>
+            <w:r>
+              <w:rPr>
+                <w:sz w:val="18"/>
+                <w:szCs w:val="18"/>
+              </w:rPr>
+              <w:t xml:space="preserve">Salhani &amp; Mouselli (2022)</w:t>
+            </w:r>
+          </w:p>
+        </w:tc>
+        <w:tc>
+          <w:tcPr>
+            <w:tcW w:type="dxa" w:w="2891"/>
+            <w:tcMar>
+              <w:top w:type="dxa" w:w="60"/>
+              <w:left w:type="dxa" w:w="90"/>
+              <w:bottom w:type="dxa" w:w="60"/>
+              <w:right w:type="dxa" w:w="90"/>
+            </w:tcMar>
+          </w:tcPr>
+          <w:p>
+            <w:pPr>
+              <w:spacing w:after="40"/>
+            </w:pPr>
+            <w:r>
+              <w:rPr>
+                <w:sz w:val="18"/>
+                <w:szCs w:val="18"/>
+              </w:rPr>
+              <w:t xml:space="preserve">Panel of Tier 1 sukuk issuers</w:t>
+            </w:r>
+          </w:p>
+        </w:tc>
+        <w:tc>
+          <w:tcPr>
+            <w:tcW w:type="dxa" w:w="2120"/>
+            <w:tcMar>
+              <w:top w:type="dxa" w:w="60"/>
+              <w:left w:type="dxa" w:w="90"/>
+              <w:bottom w:type="dxa" w:w="60"/>
+              <w:right w:type="dxa" w:w="90"/>
+            </w:tcMar>
+          </w:tcPr>
+          <w:p>
+            <w:pPr>
+              <w:spacing w:after="40"/>
+            </w:pPr>
+            <w:r>
+              <w:rPr>
+                <w:sz w:val="18"/>
+                <w:szCs w:val="18"/>
+              </w:rPr>
+              <w:t xml:space="preserve">All UAE Islamic banks issuing Tier 1 sukuk, 2010–2020</w:t>
+            </w:r>
+          </w:p>
+        </w:tc>
+        <w:tc>
+          <w:tcPr>
+            <w:tcW w:type="dxa" w:w="2314"/>
+            <w:tcMar>
+              <w:top w:type="dxa" w:w="60"/>
+              <w:left w:type="dxa" w:w="90"/>
+              <w:bottom w:type="dxa" w:w="60"/>
+              <w:right w:type="dxa" w:w="90"/>
+            </w:tcMar>
+          </w:tcPr>
+          <w:p>
+            <w:pPr>
+              <w:spacing w:after="40"/>
+            </w:pPr>
+            <w:r>
+              <w:rPr>
+                <w:sz w:val="18"/>
+                <w:szCs w:val="18"/>
+              </w:rPr>
+              <w:t xml:space="preserve">Also small; shows AT1 sukuk panels are necessarily small.</w:t>
+            </w:r>
+          </w:p>
+        </w:tc>
+      </w:tr>
+    </w:tbl>
+    <w:p>
+      <w:pPr>
+        <w:spacing w:after="60"/>
+      </w:pPr>
+    </w:p>
+    <w:p>
+      <w:pPr>
+        <w:spacing w:after="120" w:line="276"/>
+      </w:pPr>
+      <w:r>
+        <w:rPr>
+          <w:b/>
+          <w:bCs/>
+        </w:rPr>
+        <w:t xml:space="preserve">Verdict:</w:t>
+      </w:r>
+      <w:r>
+        <w:t xml:space="preserve"> the sample is large enough for a </w:t>
+      </w:r>
+      <w:r>
+        <w:rPr>
+          <w:b/>
+          <w:bCs/>
+        </w:rPr>
+        <w:t xml:space="preserve">small, pre-specified</w:t>
+      </w:r>
+      <w:r>
+        <w:t xml:space="preserve"> model. It is larger than the closest template (42 bonds) but far smaller than the large regression studies. So: few regressors, pooled classes, small-cluster inference, and report the smallest effect you could detect. It is </w:t>
+      </w:r>
+      <w:r>
+        <w:rPr>
+          <w:b/>
+          <w:bCs/>
+        </w:rPr>
+        <w:t xml:space="preserve">not</w:t>
+      </w:r>
+      <w:r>
+        <w:t xml:space="preserve"> large enough for separate callable models (17 pairs) or regional GCC vs ASEAN models.</w:t>
+      </w:r>
+    </w:p>
+    <w:p>
+      <w:pPr>
+        <w:pStyle w:val="Heading2"/>
+      </w:pPr>
+      <w:r>
+        <w:t xml:space="preserve">5.4 Variables and expected signs</w:t>
+      </w:r>
+    </w:p>
+    <w:p>
+      <w:pPr>
+        <w:spacing w:after="120" w:line="276"/>
+      </w:pPr>
+      <w:r>
+        <w:t xml:space="preserve">Dependent variable: treated (or labelled) yield minus plain yield, in basis points. “+” means the variable widens the differential (higher yield on the feature leg); “−” means it narrows it.</w:t>
+      </w:r>
+    </w:p>
+    <w:tbl>
+      <w:tblPr>
+        <w:tblW w:type="dxa" w:w="9638"/>
+        <w:tblBorders>
+          <w:top w:val="single" w:color="auto" w:sz="4"/>
+          <w:left w:val="single" w:color="auto" w:sz="4"/>
+          <w:bottom w:val="single" w:color="auto" w:sz="4"/>
+          <w:right w:val="single" w:color="auto" w:sz="4"/>
+          <w:insideH w:val="single" w:color="auto" w:sz="4"/>
+          <w:insideV w:val="single" w:color="auto" w:sz="4"/>
+        </w:tblBorders>
+      </w:tblPr>
+      <w:tblGrid>
+        <w:gridCol w:w="1735"/>
+        <w:gridCol w:w="2120"/>
+        <w:gridCol w:w="1349"/>
+        <w:gridCol w:w="4434"/>
+      </w:tblGrid>
+      <w:tr>
+        <w:trPr>
+          <w:tblHeader/>
+        </w:trPr>
+        <w:tc>
+          <w:tcPr>
+            <w:tcW w:type="dxa" w:w="1735"/>
+            <w:shd w:fill="1F3864" w:color="auto" w:val="clear"/>
+            <w:tcMar>
+              <w:top w:type="dxa" w:w="60"/>
+              <w:left w:type="dxa" w:w="90"/>
+              <w:bottom w:type="dxa" w:w="60"/>
+              <w:right w:type="dxa" w:w="90"/>
+            </w:tcMar>
+          </w:tcPr>
+          <w:p>
+            <w:pPr>
+              <w:spacing w:after="40"/>
+            </w:pPr>
+            <w:r>
+              <w:rPr>
+                <w:b/>
+                <w:bCs/>
+                <w:color w:val="FFFFFF"/>
+                <w:sz w:val="18"/>
+                <w:szCs w:val="18"/>
+              </w:rPr>
+              <w:t xml:space="preserve">Variable (step)</w:t>
+            </w:r>
+          </w:p>
+        </w:tc>
+        <w:tc>
+          <w:tcPr>
+            <w:tcW w:type="dxa" w:w="2120"/>
+            <w:shd w:fill="1F3864" w:color="auto" w:val="clear"/>
+            <w:tcMar>
+              <w:top w:type="dxa" w:w="60"/>
+              <w:left w:type="dxa" w:w="90"/>
+              <w:bottom w:type="dxa" w:w="60"/>
+              <w:right w:type="dxa" w:w="90"/>
+            </w:tcMar>
+          </w:tcPr>
+          <w:p>
+            <w:pPr>
+              <w:spacing w:after="40"/>
+            </w:pPr>
+            <w:r>
+              <w:rPr>
+                <w:b/>
+                <w:bCs/>
+                <w:color w:val="FFFFFF"/>
+                <w:sz w:val="18"/>
+                <w:szCs w:val="18"/>
+              </w:rPr>
+              <w:t xml:space="preserve">Measure</w:t>
+            </w:r>
+          </w:p>
+        </w:tc>
+        <w:tc>
+          <w:tcPr>
+            <w:tcW w:type="dxa" w:w="1349"/>
+            <w:shd w:fill="1F3864" w:color="auto" w:val="clear"/>
+            <w:tcMar>
+              <w:top w:type="dxa" w:w="60"/>
+              <w:left w:type="dxa" w:w="90"/>
+              <w:bottom w:type="dxa" w:w="60"/>
+              <w:right w:type="dxa" w:w="90"/>
+            </w:tcMar>
+          </w:tcPr>
+          <w:p>
+            <w:pPr>
+              <w:spacing w:after="40"/>
+            </w:pPr>
+            <w:r>
+              <w:rPr>
+                <w:b/>
+                <w:bCs/>
+                <w:color w:val="FFFFFF"/>
+                <w:sz w:val="18"/>
+                <w:szCs w:val="18"/>
+              </w:rPr>
+              <w:t xml:space="preserve">Expected sign</w:t>
+            </w:r>
+          </w:p>
+        </w:tc>
+        <w:tc>
+          <w:tcPr>
+            <w:tcW w:type="dxa" w:w="4434"/>
+            <w:shd w:fill="1F3864" w:color="auto" w:val="clear"/>
+            <w:tcMar>
+              <w:top w:type="dxa" w:w="60"/>
+              <w:left w:type="dxa" w:w="90"/>
+              <w:bottom w:type="dxa" w:w="60"/>
+              <w:right w:type="dxa" w:w="90"/>
+            </w:tcMar>
+          </w:tcPr>
+          <w:p>
+            <w:pPr>
+              <w:spacing w:after="40"/>
+            </w:pPr>
+            <w:r>
+              <w:rPr>
+                <w:b/>
+                <w:bCs/>
+                <w:color w:val="FFFFFF"/>
+                <w:sz w:val="18"/>
+                <w:szCs w:val="18"/>
+              </w:rPr>
+              <w:t xml:space="preserve">Basis in past research</w:t>
+            </w:r>
+          </w:p>
+        </w:tc>
+      </w:tr>
+      <w:tr>
+        <w:trPr>
+          <w:cantSplit w:val="off"/>
+        </w:trPr>
+        <w:tc>
+          <w:tcPr>
+            <w:tcW w:type="dxa" w:w="1735"/>
+            <w:tcMar>
+              <w:top w:type="dxa" w:w="60"/>
+              <w:left w:type="dxa" w:w="90"/>
+              <w:bottom w:type="dxa" w:w="60"/>
+              <w:right w:type="dxa" w:w="90"/>
+            </w:tcMar>
+          </w:tcPr>
+          <w:p>
+            <w:pPr>
+              <w:spacing w:after="40"/>
+            </w:pPr>
+            <w:r>
+              <w:rPr>
+                <w:sz w:val="18"/>
+                <w:szCs w:val="18"/>
+              </w:rPr>
+              <w:t xml:space="preserve">Credit gap (1)</w:t>
+            </w:r>
+          </w:p>
+        </w:tc>
+        <w:tc>
+          <w:tcPr>
+            <w:tcW w:type="dxa" w:w="2120"/>
+            <w:tcMar>
+              <w:top w:type="dxa" w:w="60"/>
+              <w:left w:type="dxa" w:w="90"/>
+              <w:bottom w:type="dxa" w:w="60"/>
+              <w:right w:type="dxa" w:w="90"/>
+            </w:tcMar>
+          </w:tcPr>
+          <w:p>
+            <w:pPr>
+              <w:spacing w:after="40"/>
+            </w:pPr>
+            <w:r>
+              <w:rPr>
+                <w:sz w:val="18"/>
+                <w:szCs w:val="18"/>
+              </w:rPr>
+              <w:t xml:space="preserve">Rating notch gap; “unrated treated leg” dummy</w:t>
+            </w:r>
+          </w:p>
+        </w:tc>
+        <w:tc>
+          <w:tcPr>
+            <w:tcW w:type="dxa" w:w="1349"/>
+            <w:tcMar>
+              <w:top w:type="dxa" w:w="60"/>
+              <w:left w:type="dxa" w:w="90"/>
+              <w:bottom w:type="dxa" w:w="60"/>
+              <w:right w:type="dxa" w:w="90"/>
+            </w:tcMar>
+          </w:tcPr>
+          <w:p>
+            <w:pPr>
+              <w:spacing w:after="40"/>
+            </w:pPr>
+            <w:r>
+              <w:rPr>
+                <w:sz w:val="18"/>
+                <w:szCs w:val="18"/>
+              </w:rPr>
+              <w:t xml:space="preserve">+ for callable and AT1</w:t>
+            </w:r>
+          </w:p>
+        </w:tc>
+        <w:tc>
+          <w:tcPr>
+            <w:tcW w:type="dxa" w:w="4434"/>
+            <w:tcMar>
+              <w:top w:type="dxa" w:w="60"/>
+              <w:left w:type="dxa" w:w="90"/>
+              <w:bottom w:type="dxa" w:w="60"/>
+              <w:right w:type="dxa" w:w="90"/>
+            </w:tcMar>
+          </w:tcPr>
+          <w:p>
+            <w:pPr>
+              <w:spacing w:after="40"/>
+            </w:pPr>
+            <w:r>
+              <w:rPr>
+                <w:sz w:val="18"/>
+                <w:szCs w:val="18"/>
+              </w:rPr>
+              <w:t xml:space="preserve">Call value is larger for weaker credits (Becker et al., 2024; Samet &amp; Obay, 2014). Unrated Tier 2 CoCos carry an 84 bp call premium vs −12 bp for rated ones (Oster, 2020). Rating affects the greenium (Hinsche, 2022; Oktavio &amp; Riyanti, 2021).</w:t>
+            </w:r>
+          </w:p>
+        </w:tc>
+      </w:tr>
+      <w:tr>
+        <w:trPr>
+          <w:cantSplit w:val="off"/>
+        </w:trPr>
+        <w:tc>
+          <w:tcPr>
+            <w:tcW w:type="dxa" w:w="1735"/>
+            <w:tcMar>
+              <w:top w:type="dxa" w:w="60"/>
+              <w:left w:type="dxa" w:w="90"/>
+              <w:bottom w:type="dxa" w:w="60"/>
+              <w:right w:type="dxa" w:w="90"/>
+            </w:tcMar>
+          </w:tcPr>
+          <w:p>
+            <w:pPr>
+              <w:spacing w:after="40"/>
+            </w:pPr>
+            <w:r>
+              <w:rPr>
+                <w:sz w:val="18"/>
+                <w:szCs w:val="18"/>
+              </w:rPr>
+              <w:t xml:space="preserve">Liquidity gap (1, 2)</w:t>
+            </w:r>
+          </w:p>
+        </w:tc>
+        <w:tc>
+          <w:tcPr>
+            <w:tcW w:type="dxa" w:w="2120"/>
+            <w:tcMar>
+              <w:top w:type="dxa" w:w="60"/>
+              <w:left w:type="dxa" w:w="90"/>
+              <w:bottom w:type="dxa" w:w="60"/>
+              <w:right w:type="dxa" w:w="90"/>
+            </w:tcMar>
+          </w:tcPr>
+          <w:p>
+            <w:pPr>
+              <w:spacing w:after="40"/>
+            </w:pPr>
+            <w:r>
+              <w:rPr>
+                <w:sz w:val="18"/>
+                <w:szCs w:val="18"/>
+              </w:rPr>
+              <w:t xml:space="preserve">Quoted-spread gap; liquidity-score gap</w:t>
+            </w:r>
+          </w:p>
+        </w:tc>
+        <w:tc>
+          <w:tcPr>
+            <w:tcW w:type="dxa" w:w="1349"/>
+            <w:tcMar>
+              <w:top w:type="dxa" w:w="60"/>
+              <w:left w:type="dxa" w:w="90"/>
+              <w:bottom w:type="dxa" w:w="60"/>
+              <w:right w:type="dxa" w:w="90"/>
+            </w:tcMar>
+          </w:tcPr>
+          <w:p>
+            <w:pPr>
+              <w:spacing w:after="40"/>
+            </w:pPr>
+            <w:r>
+              <w:rPr>
+                <w:sz w:val="18"/>
+                <w:szCs w:val="18"/>
+              </w:rPr>
+              <w:t xml:space="preserve">+ when the feature leg is less liquid</w:t>
+            </w:r>
+          </w:p>
+        </w:tc>
+        <w:tc>
+          <w:tcPr>
+            <w:tcW w:type="dxa" w:w="4434"/>
+            <w:tcMar>
+              <w:top w:type="dxa" w:w="60"/>
+              <w:left w:type="dxa" w:w="90"/>
+              <w:bottom w:type="dxa" w:w="60"/>
+              <w:right w:type="dxa" w:w="90"/>
+            </w:tcMar>
+          </w:tcPr>
+          <w:p>
+            <w:pPr>
+              <w:spacing w:after="40"/>
+            </w:pPr>
+            <w:r>
+              <w:rPr>
+                <w:sz w:val="18"/>
+                <w:szCs w:val="18"/>
+              </w:rPr>
+              <w:t xml:space="preserve">Liquidity can flip the sign of the greenium (Fandella &amp; Cociancich, 2024). Wider bid-ask spreads mean higher yields (Grishunin et al., 2023). Liquidity explains the sovereign sukuk premium (Asmuni &amp; Tan, 2020).</w:t>
+            </w:r>
+          </w:p>
+        </w:tc>
+      </w:tr>
+      <w:tr>
+        <w:trPr>
+          <w:cantSplit w:val="off"/>
+        </w:trPr>
+        <w:tc>
+          <w:tcPr>
+            <w:tcW w:type="dxa" w:w="1735"/>
+            <w:tcMar>
+              <w:top w:type="dxa" w:w="60"/>
+              <w:left w:type="dxa" w:w="90"/>
+              <w:bottom w:type="dxa" w:w="60"/>
+              <w:right w:type="dxa" w:w="90"/>
+            </w:tcMar>
+          </w:tcPr>
+          <w:p>
+            <w:pPr>
+              <w:spacing w:after="40"/>
+            </w:pPr>
+            <w:r>
+              <w:rPr>
+                <w:sz w:val="18"/>
+                <w:szCs w:val="18"/>
+              </w:rPr>
+              <w:t xml:space="preserve">Issue size gap (1)</w:t>
+            </w:r>
+          </w:p>
+        </w:tc>
+        <w:tc>
+          <w:tcPr>
+            <w:tcW w:type="dxa" w:w="2120"/>
+            <w:tcMar>
+              <w:top w:type="dxa" w:w="60"/>
+              <w:left w:type="dxa" w:w="90"/>
+              <w:bottom w:type="dxa" w:w="60"/>
+              <w:right w:type="dxa" w:w="90"/>
+            </w:tcMar>
+          </w:tcPr>
+          <w:p>
+            <w:pPr>
+              <w:spacing w:after="40"/>
+            </w:pPr>
+            <w:r>
+              <w:rPr>
+                <w:sz w:val="18"/>
+                <w:szCs w:val="18"/>
+              </w:rPr>
+              <w:t xml:space="preserve">Log size, treated minus control</w:t>
+            </w:r>
+          </w:p>
+        </w:tc>
+        <w:tc>
+          <w:tcPr>
+            <w:tcW w:type="dxa" w:w="1349"/>
+            <w:tcMar>
+              <w:top w:type="dxa" w:w="60"/>
+              <w:left w:type="dxa" w:w="90"/>
+              <w:bottom w:type="dxa" w:w="60"/>
+              <w:right w:type="dxa" w:w="90"/>
+            </w:tcMar>
+          </w:tcPr>
+          <w:p>
+            <w:pPr>
+              <w:spacing w:after="40"/>
+            </w:pPr>
+            <w:r>
+              <w:rPr>
+                <w:sz w:val="18"/>
+                <w:szCs w:val="18"/>
+              </w:rPr>
+              <w:t xml:space="preserve">Mixed</w:t>
+            </w:r>
+          </w:p>
+        </w:tc>
+        <w:tc>
+          <w:tcPr>
+            <w:tcW w:type="dxa" w:w="4434"/>
+            <w:tcMar>
+              <w:top w:type="dxa" w:w="60"/>
+              <w:left w:type="dxa" w:w="90"/>
+              <w:bottom w:type="dxa" w:w="60"/>
+              <w:right w:type="dxa" w:w="90"/>
+            </w:tcMar>
+          </w:tcPr>
+          <w:p>
+            <w:pPr>
+              <w:spacing w:after="40"/>
+            </w:pPr>
+            <w:r>
+              <w:rPr>
+                <w:sz w:val="18"/>
+                <w:szCs w:val="18"/>
+              </w:rPr>
+              <w:t xml:space="preserve">Size matters in some studies (Oktavio &amp; Riyanti, 2021) but not in others (Hinsche, 2022).</w:t>
+            </w:r>
+          </w:p>
+        </w:tc>
+      </w:tr>
+      <w:tr>
+        <w:trPr>
+          <w:cantSplit w:val="off"/>
+        </w:trPr>
+        <w:tc>
+          <w:tcPr>
+            <w:tcW w:type="dxa" w:w="1735"/>
+            <w:tcMar>
+              <w:top w:type="dxa" w:w="60"/>
+              <w:left w:type="dxa" w:w="90"/>
+              <w:bottom w:type="dxa" w:w="60"/>
+              <w:right w:type="dxa" w:w="90"/>
+            </w:tcMar>
+          </w:tcPr>
+          <w:p>
+            <w:pPr>
+              <w:spacing w:after="40"/>
+            </w:pPr>
+            <w:r>
+              <w:rPr>
+                <w:sz w:val="18"/>
+                <w:szCs w:val="18"/>
+              </w:rPr>
+              <w:t xml:space="preserve">Horizon gap (1)</w:t>
+            </w:r>
+          </w:p>
+        </w:tc>
+        <w:tc>
+          <w:tcPr>
+            <w:tcW w:type="dxa" w:w="2120"/>
+            <w:tcMar>
+              <w:top w:type="dxa" w:w="60"/>
+              <w:left w:type="dxa" w:w="90"/>
+              <w:bottom w:type="dxa" w:w="60"/>
+              <w:right w:type="dxa" w:w="90"/>
+            </w:tcMar>
+          </w:tcPr>
+          <w:p>
+            <w:pPr>
+              <w:spacing w:after="40"/>
+            </w:pPr>
+            <w:r>
+              <w:rPr>
+                <w:sz w:val="18"/>
+                <w:szCs w:val="18"/>
+              </w:rPr>
+              <w:t xml:space="preserve">Years to workout, treated minus control</w:t>
+            </w:r>
+          </w:p>
+        </w:tc>
+        <w:tc>
+          <w:tcPr>
+            <w:tcW w:type="dxa" w:w="1349"/>
+            <w:tcMar>
+              <w:top w:type="dxa" w:w="60"/>
+              <w:left w:type="dxa" w:w="90"/>
+              <w:bottom w:type="dxa" w:w="60"/>
+              <w:right w:type="dxa" w:w="90"/>
+            </w:tcMar>
+          </w:tcPr>
+          <w:p>
+            <w:pPr>
+              <w:spacing w:after="40"/>
+            </w:pPr>
+            <w:r>
+              <w:rPr>
+                <w:sz w:val="18"/>
+                <w:szCs w:val="18"/>
+              </w:rPr>
+              <w:t xml:space="preserve">Mixed (+ for labels in several studies)</w:t>
+            </w:r>
+          </w:p>
+        </w:tc>
+        <w:tc>
+          <w:tcPr>
+            <w:tcW w:type="dxa" w:w="4434"/>
+            <w:tcMar>
+              <w:top w:type="dxa" w:w="60"/>
+              <w:left w:type="dxa" w:w="90"/>
+              <w:bottom w:type="dxa" w:w="60"/>
+              <w:right w:type="dxa" w:w="90"/>
+            </w:tcMar>
+          </w:tcPr>
+          <w:p>
+            <w:pPr>
+              <w:spacing w:after="40"/>
+            </w:pPr>
+            <w:r>
+              <w:rPr>
+                <w:sz w:val="18"/>
+                <w:szCs w:val="18"/>
+              </w:rPr>
+              <w:t xml:space="preserve">Oktavio &amp; Riyanti (2021) report a larger greenium for longer maturities in earlier studies. Your curve cancellation weakens this.</w:t>
+            </w:r>
+          </w:p>
+        </w:tc>
+      </w:tr>
+      <w:tr>
+        <w:trPr>
+          <w:cantSplit w:val="off"/>
+        </w:trPr>
+        <w:tc>
+          <w:tcPr>
+            <w:tcW w:type="dxa" w:w="1735"/>
+            <w:tcMar>
+              <w:top w:type="dxa" w:w="60"/>
+              <w:left w:type="dxa" w:w="90"/>
+              <w:bottom w:type="dxa" w:w="60"/>
+              <w:right w:type="dxa" w:w="90"/>
+            </w:tcMar>
+          </w:tcPr>
+          <w:p>
+            <w:pPr>
+              <w:spacing w:after="40"/>
+            </w:pPr>
+            <w:r>
+              <w:rPr>
+                <w:sz w:val="18"/>
+                <w:szCs w:val="18"/>
+              </w:rPr>
+              <w:t xml:space="preserve">Time to first call (2)</w:t>
+            </w:r>
+          </w:p>
+        </w:tc>
+        <w:tc>
+          <w:tcPr>
+            <w:tcW w:type="dxa" w:w="2120"/>
+            <w:tcMar>
+              <w:top w:type="dxa" w:w="60"/>
+              <w:left w:type="dxa" w:w="90"/>
+              <w:bottom w:type="dxa" w:w="60"/>
+              <w:right w:type="dxa" w:w="90"/>
+            </w:tcMar>
+          </w:tcPr>
+          <w:p>
+            <w:pPr>
+              <w:spacing w:after="40"/>
+            </w:pPr>
+            <w:r>
+              <w:rPr>
+                <w:sz w:val="18"/>
+                <w:szCs w:val="18"/>
+              </w:rPr>
+              <w:t xml:space="preserve">Years to next call date</w:t>
+            </w:r>
+          </w:p>
+        </w:tc>
+        <w:tc>
+          <w:tcPr>
+            <w:tcW w:type="dxa" w:w="1349"/>
+            <w:tcMar>
+              <w:top w:type="dxa" w:w="60"/>
+              <w:left w:type="dxa" w:w="90"/>
+              <w:bottom w:type="dxa" w:w="60"/>
+              <w:right w:type="dxa" w:w="90"/>
+            </w:tcMar>
+          </w:tcPr>
+          <w:p>
+            <w:pPr>
+              <w:spacing w:after="40"/>
+            </w:pPr>
+            <w:r>
+              <w:rPr>
+                <w:sz w:val="18"/>
+                <w:szCs w:val="18"/>
+              </w:rPr>
+              <w:t xml:space="preserve">+ for AT1 if exercise is expected</w:t>
+            </w:r>
+          </w:p>
+        </w:tc>
+        <w:tc>
+          <w:tcPr>
+            <w:tcW w:type="dxa" w:w="4434"/>
+            <w:tcMar>
+              <w:top w:type="dxa" w:w="60"/>
+              <w:left w:type="dxa" w:w="90"/>
+              <w:bottom w:type="dxa" w:w="60"/>
+              <w:right w:type="dxa" w:w="90"/>
+            </w:tcMar>
+          </w:tcPr>
+          <w:p>
+            <w:pPr>
+              <w:spacing w:after="40"/>
+            </w:pPr>
+            <w:r>
+              <w:rPr>
+                <w:sz w:val="18"/>
+                <w:szCs w:val="18"/>
+              </w:rPr>
+              <w:t xml:space="preserve">Bonds are revalued at call decisions (Ivashchenko &amp; Rockinger, 2026). Your own slope (§4.9, p. 47) is not significant, so treat this as a test, not a given.</w:t>
+            </w:r>
+          </w:p>
+        </w:tc>
+      </w:tr>
+      <w:tr>
+        <w:trPr>
+          <w:cantSplit w:val="off"/>
+        </w:trPr>
+        <w:tc>
+          <w:tcPr>
+            <w:tcW w:type="dxa" w:w="1735"/>
+            <w:tcMar>
+              <w:top w:type="dxa" w:w="60"/>
+              <w:left w:type="dxa" w:w="90"/>
+              <w:bottom w:type="dxa" w:w="60"/>
+              <w:right w:type="dxa" w:w="90"/>
+            </w:tcMar>
+          </w:tcPr>
+          <w:p>
+            <w:pPr>
+              <w:spacing w:after="40"/>
+            </w:pPr>
+            <w:r>
+              <w:rPr>
+                <w:sz w:val="18"/>
+                <w:szCs w:val="18"/>
+              </w:rPr>
+              <w:t xml:space="preserve">Rate environment (2)</w:t>
+            </w:r>
+          </w:p>
+        </w:tc>
+        <w:tc>
+          <w:tcPr>
+            <w:tcW w:type="dxa" w:w="2120"/>
+            <w:tcMar>
+              <w:top w:type="dxa" w:w="60"/>
+              <w:left w:type="dxa" w:w="90"/>
+              <w:bottom w:type="dxa" w:w="60"/>
+              <w:right w:type="dxa" w:w="90"/>
+            </w:tcMar>
+          </w:tcPr>
+          <w:p>
+            <w:pPr>
+              <w:spacing w:after="40"/>
+            </w:pPr>
+            <w:r>
+              <w:rPr>
+                <w:sz w:val="18"/>
+                <w:szCs w:val="18"/>
+              </w:rPr>
+              <w:t xml:space="preserve">Rate level or volatility × callable</w:t>
+            </w:r>
+          </w:p>
+        </w:tc>
+        <w:tc>
+          <w:tcPr>
+            <w:tcW w:type="dxa" w:w="1349"/>
+            <w:tcMar>
+              <w:top w:type="dxa" w:w="60"/>
+              <w:left w:type="dxa" w:w="90"/>
+              <w:bottom w:type="dxa" w:w="60"/>
+              <w:right w:type="dxa" w:w="90"/>
+            </w:tcMar>
+          </w:tcPr>
+          <w:p>
+            <w:pPr>
+              <w:spacing w:after="40"/>
+            </w:pPr>
+            <w:r>
+              <w:rPr>
+                <w:sz w:val="18"/>
+                <w:szCs w:val="18"/>
+              </w:rPr>
+              <w:t xml:space="preserve">+</w:t>
+            </w:r>
+          </w:p>
+        </w:tc>
+        <w:tc>
+          <w:tcPr>
+            <w:tcW w:type="dxa" w:w="4434"/>
+            <w:tcMar>
+              <w:top w:type="dxa" w:w="60"/>
+              <w:left w:type="dxa" w:w="90"/>
+              <w:bottom w:type="dxa" w:w="60"/>
+              <w:right w:type="dxa" w:w="90"/>
+            </w:tcMar>
+          </w:tcPr>
+          <w:p>
+            <w:pPr>
+              <w:spacing w:after="40"/>
+            </w:pPr>
+            <w:r>
+              <w:rPr>
+                <w:sz w:val="18"/>
+                <w:szCs w:val="18"/>
+              </w:rPr>
+              <w:t xml:space="preserve">The call premium rises with expected rate changes (Spivey, 1989).</w:t>
+            </w:r>
+          </w:p>
+        </w:tc>
+      </w:tr>
+      <w:tr>
+        <w:trPr>
+          <w:cantSplit w:val="off"/>
+        </w:trPr>
+        <w:tc>
+          <w:tcPr>
+            <w:tcW w:type="dxa" w:w="1735"/>
+            <w:tcMar>
+              <w:top w:type="dxa" w:w="60"/>
+              <w:left w:type="dxa" w:w="90"/>
+              <w:bottom w:type="dxa" w:w="60"/>
+              <w:right w:type="dxa" w:w="90"/>
+            </w:tcMar>
+          </w:tcPr>
+          <w:p>
+            <w:pPr>
+              <w:spacing w:after="40"/>
+            </w:pPr>
+            <w:r>
+              <w:rPr>
+                <w:sz w:val="18"/>
+                <w:szCs w:val="18"/>
+              </w:rPr>
+              <w:t xml:space="preserve">Market stress (2)</w:t>
+            </w:r>
+          </w:p>
+        </w:tc>
+        <w:tc>
+          <w:tcPr>
+            <w:tcW w:type="dxa" w:w="2120"/>
+            <w:tcMar>
+              <w:top w:type="dxa" w:w="60"/>
+              <w:left w:type="dxa" w:w="90"/>
+              <w:bottom w:type="dxa" w:w="60"/>
+              <w:right w:type="dxa" w:w="90"/>
+            </w:tcMar>
+          </w:tcPr>
+          <w:p>
+            <w:pPr>
+              <w:spacing w:after="40"/>
+            </w:pPr>
+            <w:r>
+              <w:rPr>
+                <w:sz w:val="18"/>
+                <w:szCs w:val="18"/>
+              </w:rPr>
+              <w:t xml:space="preserve">AT1 × March 2023 dummy</w:t>
+            </w:r>
+          </w:p>
+        </w:tc>
+        <w:tc>
+          <w:tcPr>
+            <w:tcW w:type="dxa" w:w="1349"/>
+            <w:tcMar>
+              <w:top w:type="dxa" w:w="60"/>
+              <w:left w:type="dxa" w:w="90"/>
+              <w:bottom w:type="dxa" w:w="60"/>
+              <w:right w:type="dxa" w:w="90"/>
+            </w:tcMar>
+          </w:tcPr>
+          <w:p>
+            <w:pPr>
+              <w:spacing w:after="40"/>
+            </w:pPr>
+            <w:r>
+              <w:rPr>
+                <w:sz w:val="18"/>
+                <w:szCs w:val="18"/>
+              </w:rPr>
+              <w:t xml:space="preserve">+</w:t>
+            </w:r>
+          </w:p>
+        </w:tc>
+        <w:tc>
+          <w:tcPr>
+            <w:tcW w:type="dxa" w:w="4434"/>
+            <w:tcMar>
+              <w:top w:type="dxa" w:w="60"/>
+              <w:left w:type="dxa" w:w="90"/>
+              <w:bottom w:type="dxa" w:w="60"/>
+              <w:right w:type="dxa" w:w="90"/>
+            </w:tcMar>
+          </w:tcPr>
+          <w:p>
+            <w:pPr>
+              <w:spacing w:after="40"/>
+            </w:pPr>
+            <w:r>
+              <w:rPr>
+                <w:sz w:val="18"/>
+                <w:szCs w:val="18"/>
+              </w:rPr>
+              <w:t xml:space="preserve">The Credit Suisse write-down repriced AT1 risk (Bolton, Jiang &amp; Kartasheva, 2023). AT1 spread drivers are regulatory and design factors (Kind, Oster &amp; Peter, 2022).</w:t>
+            </w:r>
+          </w:p>
+        </w:tc>
+      </w:tr>
+      <w:tr>
+        <w:trPr>
+          <w:cantSplit w:val="off"/>
+        </w:trPr>
+        <w:tc>
+          <w:tcPr>
+            <w:tcW w:type="dxa" w:w="1735"/>
+            <w:tcMar>
+              <w:top w:type="dxa" w:w="60"/>
+              <w:left w:type="dxa" w:w="90"/>
+              <w:bottom w:type="dxa" w:w="60"/>
+              <w:right w:type="dxa" w:w="90"/>
+            </w:tcMar>
+          </w:tcPr>
+          <w:p>
+            <w:pPr>
+              <w:spacing w:after="40"/>
+            </w:pPr>
+            <w:r>
+              <w:rPr>
+                <w:sz w:val="18"/>
+                <w:szCs w:val="18"/>
+              </w:rPr>
+              <w:t xml:space="preserve">External verification (1)</w:t>
+            </w:r>
+          </w:p>
+        </w:tc>
+        <w:tc>
+          <w:tcPr>
+            <w:tcW w:type="dxa" w:w="2120"/>
+            <w:tcMar>
+              <w:top w:type="dxa" w:w="60"/>
+              <w:left w:type="dxa" w:w="90"/>
+              <w:bottom w:type="dxa" w:w="60"/>
+              <w:right w:type="dxa" w:w="90"/>
+            </w:tcMar>
+          </w:tcPr>
+          <w:p>
+            <w:pPr>
+              <w:spacing w:after="40"/>
+            </w:pPr>
+            <w:r>
+              <w:rPr>
+                <w:sz w:val="18"/>
+                <w:szCs w:val="18"/>
+              </w:rPr>
+              <w:t xml:space="preserve">Second-party opinion or post-issuance report, labelled pairs</w:t>
+            </w:r>
+          </w:p>
+        </w:tc>
+        <w:tc>
+          <w:tcPr>
+            <w:tcW w:type="dxa" w:w="1349"/>
+            <w:tcMar>
+              <w:top w:type="dxa" w:w="60"/>
+              <w:left w:type="dxa" w:w="90"/>
+              <w:bottom w:type="dxa" w:w="60"/>
+              <w:right w:type="dxa" w:w="90"/>
+            </w:tcMar>
+          </w:tcPr>
+          <w:p>
+            <w:pPr>
+              <w:spacing w:after="40"/>
+            </w:pPr>
+            <w:r>
+              <w:rPr>
+                <w:sz w:val="18"/>
+                <w:szCs w:val="18"/>
+              </w:rPr>
+              <w:t xml:space="preserve">− (larger greenium)</w:t>
+            </w:r>
+          </w:p>
+        </w:tc>
+        <w:tc>
+          <w:tcPr>
+            <w:tcW w:type="dxa" w:w="4434"/>
+            <w:tcMar>
+              <w:top w:type="dxa" w:w="60"/>
+              <w:left w:type="dxa" w:w="90"/>
+              <w:bottom w:type="dxa" w:w="60"/>
+              <w:right w:type="dxa" w:w="90"/>
+            </w:tcMar>
+          </w:tcPr>
+          <w:p>
+            <w:pPr>
+              <w:spacing w:after="40"/>
+            </w:pPr>
+            <w:r>
+              <w:rPr>
+                <w:sz w:val="18"/>
+                <w:szCs w:val="18"/>
+              </w:rPr>
+              <w:t xml:space="preserve">The greenium rises with external review or certification (Dorfleitner et al., 2021; Fatica et al., 2021; Sun et al., 2022; Sheng et al., 2021).</w:t>
+            </w:r>
+          </w:p>
+        </w:tc>
+      </w:tr>
+      <w:tr>
+        <w:trPr>
+          <w:cantSplit w:val="off"/>
+        </w:trPr>
+        <w:tc>
+          <w:tcPr>
+            <w:tcW w:type="dxa" w:w="1735"/>
+            <w:tcMar>
+              <w:top w:type="dxa" w:w="60"/>
+              <w:left w:type="dxa" w:w="90"/>
+              <w:bottom w:type="dxa" w:w="60"/>
+              <w:right w:type="dxa" w:w="90"/>
+            </w:tcMar>
+          </w:tcPr>
+          <w:p>
+            <w:pPr>
+              <w:spacing w:after="40"/>
+            </w:pPr>
+            <w:r>
+              <w:rPr>
+                <w:sz w:val="18"/>
+                <w:szCs w:val="18"/>
+              </w:rPr>
+              <w:t xml:space="preserve">Issuer type (1)</w:t>
+            </w:r>
+          </w:p>
+        </w:tc>
+        <w:tc>
+          <w:tcPr>
+            <w:tcW w:type="dxa" w:w="2120"/>
+            <w:tcMar>
+              <w:top w:type="dxa" w:w="60"/>
+              <w:left w:type="dxa" w:w="90"/>
+              <w:bottom w:type="dxa" w:w="60"/>
+              <w:right w:type="dxa" w:w="90"/>
+            </w:tcMar>
+          </w:tcPr>
+          <w:p>
+            <w:pPr>
+              <w:spacing w:after="40"/>
+            </w:pPr>
+            <w:r>
+              <w:rPr>
+                <w:sz w:val="18"/>
+                <w:szCs w:val="18"/>
+              </w:rPr>
+              <w:t xml:space="preserve">Sovereign or state-linked; financial</w:t>
+            </w:r>
+          </w:p>
+        </w:tc>
+        <w:tc>
+          <w:tcPr>
+            <w:tcW w:type="dxa" w:w="1349"/>
+            <w:tcMar>
+              <w:top w:type="dxa" w:w="60"/>
+              <w:left w:type="dxa" w:w="90"/>
+              <w:bottom w:type="dxa" w:w="60"/>
+              <w:right w:type="dxa" w:w="90"/>
+            </w:tcMar>
+          </w:tcPr>
+          <w:p>
+            <w:pPr>
+              <w:spacing w:after="40"/>
+            </w:pPr>
+            <w:r>
+              <w:rPr>
+                <w:sz w:val="18"/>
+                <w:szCs w:val="18"/>
+              </w:rPr>
+              <w:t xml:space="preserve">Sovereign/state: −. Financial: mixed</w:t>
+            </w:r>
+          </w:p>
+        </w:tc>
+        <w:tc>
+          <w:tcPr>
+            <w:tcW w:type="dxa" w:w="4434"/>
+            <w:tcMar>
+              <w:top w:type="dxa" w:w="60"/>
+              <w:left w:type="dxa" w:w="90"/>
+              <w:bottom w:type="dxa" w:w="60"/>
+              <w:right w:type="dxa" w:w="90"/>
+            </w:tcMar>
+          </w:tcPr>
+          <w:p>
+            <w:pPr>
+              <w:spacing w:after="40"/>
+            </w:pPr>
+            <w:r>
+              <w:rPr>
+                <w:sz w:val="18"/>
+                <w:szCs w:val="18"/>
+              </w:rPr>
+              <w:t xml:space="preserve">The greenium is larger for supranational, state-owned and non-corporate issuers (Hinsche, 2022; Sheng et al., 2021; Lehkonen et al., 2025). For financials: none (Fatica et al., 2021; Sun et al., 2022) vs larger (Sheng et al., 2021; Dorfleitner et al., 2021).</w:t>
+            </w:r>
+          </w:p>
+        </w:tc>
+      </w:tr>
+      <w:tr>
+        <w:trPr>
+          <w:cantSplit w:val="off"/>
+        </w:trPr>
+        <w:tc>
+          <w:tcPr>
+            <w:tcW w:type="dxa" w:w="1735"/>
+            <w:tcMar>
+              <w:top w:type="dxa" w:w="60"/>
+              <w:left w:type="dxa" w:w="90"/>
+              <w:bottom w:type="dxa" w:w="60"/>
+              <w:right w:type="dxa" w:w="90"/>
+            </w:tcMar>
+          </w:tcPr>
+          <w:p>
+            <w:pPr>
+              <w:spacing w:after="40"/>
+            </w:pPr>
+            <w:r>
+              <w:rPr>
+                <w:sz w:val="18"/>
+                <w:szCs w:val="18"/>
+              </w:rPr>
+              <w:t xml:space="preserve">Sovereign sukuk control (1)</w:t>
+            </w:r>
+          </w:p>
+        </w:tc>
+        <w:tc>
+          <w:tcPr>
+            <w:tcW w:type="dxa" w:w="2120"/>
+            <w:tcMar>
+              <w:top w:type="dxa" w:w="60"/>
+              <w:left w:type="dxa" w:w="90"/>
+              <w:bottom w:type="dxa" w:w="60"/>
+              <w:right w:type="dxa" w:w="90"/>
+            </w:tcMar>
+          </w:tcPr>
+          <w:p>
+            <w:pPr>
+              <w:spacing w:after="40"/>
+            </w:pPr>
+            <w:r>
+              <w:rPr>
+                <w:sz w:val="18"/>
+                <w:szCs w:val="18"/>
+              </w:rPr>
+              <w:t xml:space="preserve">Control leg is a sovereign sukuk</w:t>
+            </w:r>
+          </w:p>
+        </w:tc>
+        <w:tc>
+          <w:tcPr>
+            <w:tcW w:type="dxa" w:w="1349"/>
+            <w:tcMar>
+              <w:top w:type="dxa" w:w="60"/>
+              <w:left w:type="dxa" w:w="90"/>
+              <w:bottom w:type="dxa" w:w="60"/>
+              <w:right w:type="dxa" w:w="90"/>
+            </w:tcMar>
+          </w:tcPr>
+          <w:p>
+            <w:pPr>
+              <w:spacing w:after="40"/>
+            </w:pPr>
+            <w:r>
+              <w:rPr>
+                <w:sz w:val="18"/>
+                <w:szCs w:val="18"/>
+              </w:rPr>
+              <w:t xml:space="preserve">−</w:t>
+            </w:r>
+          </w:p>
+        </w:tc>
+        <w:tc>
+          <w:tcPr>
+            <w:tcW w:type="dxa" w:w="4434"/>
+            <w:tcMar>
+              <w:top w:type="dxa" w:w="60"/>
+              <w:left w:type="dxa" w:w="90"/>
+              <w:bottom w:type="dxa" w:w="60"/>
+              <w:right w:type="dxa" w:w="90"/>
+            </w:tcMar>
+          </w:tcPr>
+          <w:p>
+            <w:pPr>
+              <w:spacing w:after="40"/>
+            </w:pPr>
+            <w:r>
+              <w:rPr>
+                <w:sz w:val="18"/>
+                <w:szCs w:val="18"/>
+              </w:rPr>
+              <w:t xml:space="preserve">Sovereign sukuk yield more than comparable conventional bonds (Ariff et al., 2017; Asmuni &amp; Tan, 2020), which raises the control yield.</w:t>
+            </w:r>
+          </w:p>
+        </w:tc>
+      </w:tr>
+      <w:tr>
+        <w:trPr>
+          <w:cantSplit w:val="off"/>
+        </w:trPr>
+        <w:tc>
+          <w:tcPr>
+            <w:tcW w:type="dxa" w:w="1735"/>
+            <w:tcMar>
+              <w:top w:type="dxa" w:w="60"/>
+              <w:left w:type="dxa" w:w="90"/>
+              <w:bottom w:type="dxa" w:w="60"/>
+              <w:right w:type="dxa" w:w="90"/>
+            </w:tcMar>
+          </w:tcPr>
+          <w:p>
+            <w:pPr>
+              <w:spacing w:after="40"/>
+            </w:pPr>
+            <w:r>
+              <w:rPr>
+                <w:sz w:val="18"/>
+                <w:szCs w:val="18"/>
+              </w:rPr>
+              <w:t xml:space="preserve">Post-2022 period (2)</w:t>
+            </w:r>
+          </w:p>
+        </w:tc>
+        <w:tc>
+          <w:tcPr>
+            <w:tcW w:type="dxa" w:w="2120"/>
+            <w:tcMar>
+              <w:top w:type="dxa" w:w="60"/>
+              <w:left w:type="dxa" w:w="90"/>
+              <w:bottom w:type="dxa" w:w="60"/>
+              <w:right w:type="dxa" w:w="90"/>
+            </w:tcMar>
+          </w:tcPr>
+          <w:p>
+            <w:pPr>
+              <w:spacing w:after="40"/>
+            </w:pPr>
+            <w:r>
+              <w:rPr>
+                <w:sz w:val="18"/>
+                <w:szCs w:val="18"/>
+              </w:rPr>
+              <w:t xml:space="preserve">Dummy for 2023 onward × labelled</w:t>
+            </w:r>
+          </w:p>
+        </w:tc>
+        <w:tc>
+          <w:tcPr>
+            <w:tcW w:type="dxa" w:w="1349"/>
+            <w:tcMar>
+              <w:top w:type="dxa" w:w="60"/>
+              <w:left w:type="dxa" w:w="90"/>
+              <w:bottom w:type="dxa" w:w="60"/>
+              <w:right w:type="dxa" w:w="90"/>
+            </w:tcMar>
+          </w:tcPr>
+          <w:p>
+            <w:pPr>
+              <w:spacing w:after="40"/>
+            </w:pPr>
+            <w:r>
+              <w:rPr>
+                <w:sz w:val="18"/>
+                <w:szCs w:val="18"/>
+              </w:rPr>
+              <w:t xml:space="preserve">+ (greenium shrinks or reverses)</w:t>
+            </w:r>
+          </w:p>
+        </w:tc>
+        <w:tc>
+          <w:tcPr>
+            <w:tcW w:type="dxa" w:w="4434"/>
+            <w:tcMar>
+              <w:top w:type="dxa" w:w="60"/>
+              <w:left w:type="dxa" w:w="90"/>
+              <w:bottom w:type="dxa" w:w="60"/>
+              <w:right w:type="dxa" w:w="90"/>
+            </w:tcMar>
+          </w:tcPr>
+          <w:p>
+            <w:pPr>
+              <w:spacing w:after="40"/>
+            </w:pPr>
+            <w:r>
+              <w:rPr>
+                <w:sz w:val="18"/>
+                <w:szCs w:val="18"/>
+              </w:rPr>
+              <w:t xml:space="preserve">The corporate greenium reversed from 2023 (Wollny et al., 2026) and has been shrinking (Lehkonen et al., 2025).</w:t>
+            </w:r>
+          </w:p>
+        </w:tc>
+      </w:tr>
+    </w:tbl>
+    <w:p>
+      <w:pPr>
+        <w:spacing w:after="60"/>
+      </w:pPr>
+    </w:p>
+    <w:p>
+      <w:pPr>
+        <w:spacing w:after="120" w:line="276"/>
+      </w:pPr>
+      <w:r>
+        <w:rPr>
+          <w:b/>
+          <w:bCs/>
+        </w:rPr>
+        <w:t xml:space="preserve">Keep the model small.</w:t>
+      </w:r>
+      <w:r>
+        <w:t xml:space="preserve"> Do not include every row. For Step 1, I suggest: credit gap, liquidity gap, issuer type, sovereign-control dummy, and verification (labelled pairs only). For Step 2: liquidity gap, time to first call, and AT1 × March 2023. State the expected signs in Chapter 3 before you estimate.</w:t>
+      </w:r>
+    </w:p>
+    <w:p>
+      <w:pPr>
         <w:pStyle w:val="Heading2"/>
       </w:pPr>
       <w:r>
@@ -12504,7 +15557,7 @@
           <w:sz w:val="19"/>
           <w:szCs w:val="19"/>
         </w:rPr>
-        <w:t xml:space="preserve">Canay, I. A., Romano, J. P., &amp; Shaikh, A. M. (2017). Randomization tests under an approximate symmetry assumption. </w:t>
+        <w:t xml:space="preserve">Cameron, A. C., Gelbach, J. B., &amp; Miller, D. L. (2008). Bootstrap-based improvements for inference with clustered errors. </w:t>
       </w:r>
       <w:r>
         <w:rPr>
@@ -12513,14 +15566,14 @@
           <w:sz w:val="19"/>
           <w:szCs w:val="19"/>
         </w:rPr>
-        <w:t xml:space="preserve">Econometrica, 85</w:t>
+        <w:t xml:space="preserve">The Review of Economics and Statistics, 90</w:t>
       </w:r>
       <w:r>
         <w:rPr>
           <w:sz w:val="19"/>
           <w:szCs w:val="19"/>
         </w:rPr>
-        <w:t xml:space="preserve">(3), 1013–1030. https://doi.org/10.3982/ECTA13081</w:t>
+        <w:t xml:space="preserve">(3), 414–427. https://doi.org/10.1162/rest.90.3.414</w:t>
       </w:r>
     </w:p>
     <w:p>
@@ -12533,7 +15586,7 @@
           <w:sz w:val="19"/>
           <w:szCs w:val="19"/>
         </w:rPr>
-        <w:t xml:space="preserve">Dorfleitner, G., Utz, S., &amp; Zhang, R. (2021). The pricing of green bonds: External reviews and the shades of green. </w:t>
+        <w:t xml:space="preserve">Canay, I. A., Romano, J. P., &amp; Shaikh, A. M. (2017). Randomization tests under an approximate symmetry assumption. </w:t>
       </w:r>
       <w:r>
         <w:rPr>
@@ -12542,14 +15595,14 @@
           <w:sz w:val="19"/>
           <w:szCs w:val="19"/>
         </w:rPr>
-        <w:t xml:space="preserve">Review of Managerial Science, 16</w:t>
+        <w:t xml:space="preserve">Econometrica, 85</w:t>
       </w:r>
       <w:r>
         <w:rPr>
           <w:sz w:val="19"/>
           <w:szCs w:val="19"/>
         </w:rPr>
-        <w:t xml:space="preserve">(3), 797–834. https://doi.org/10.1007/s11846-021-00458-9</w:t>
+        <w:t xml:space="preserve">(3), 1013–1030. https://doi.org/10.3982/ECTA13081</w:t>
       </w:r>
     </w:p>
     <w:p>
@@ -12562,7 +15615,7 @@
           <w:sz w:val="19"/>
           <w:szCs w:val="19"/>
         </w:rPr>
-        <w:t xml:space="preserve">Elkamhi, R., Ericsson, J., &amp; Wang, H. (2012). What risks do corporate bond put features insure against? </w:t>
+        <w:t xml:space="preserve">Dorfleitner, G., Utz, S., &amp; Zhang, R. (2021). The pricing of green bonds: External reviews and the shades of green. </w:t>
       </w:r>
       <w:r>
         <w:rPr>
@@ -12571,14 +15624,14 @@
           <w:sz w:val="19"/>
           <w:szCs w:val="19"/>
         </w:rPr>
-        <w:t xml:space="preserve">Journal of Futures Markets, 32</w:t>
+        <w:t xml:space="preserve">Review of Managerial Science, 16</w:t>
       </w:r>
       <w:r>
         <w:rPr>
           <w:sz w:val="19"/>
           <w:szCs w:val="19"/>
         </w:rPr>
-        <w:t xml:space="preserve">(11), 1060–1090. https://doi.org/10.1002/fut.20546</w:t>
+        <w:t xml:space="preserve">(3), 797–834. https://doi.org/10.1007/s11846-021-00458-9</w:t>
       </w:r>
     </w:p>
     <w:p>
@@ -12591,7 +15644,7 @@
           <w:sz w:val="19"/>
           <w:szCs w:val="19"/>
         </w:rPr>
-        <w:t xml:space="preserve">Fama, E. F. (1970). Efficient capital markets: A review of theory and empirical work. </w:t>
+        <w:t xml:space="preserve">Elkamhi, R., Ericsson, J., &amp; Wang, H. (2012). What risks do corporate bond put features insure against? </w:t>
       </w:r>
       <w:r>
         <w:rPr>
@@ -12600,14 +15653,14 @@
           <w:sz w:val="19"/>
           <w:szCs w:val="19"/>
         </w:rPr>
-        <w:t xml:space="preserve">The Journal of Finance, 25</w:t>
+        <w:t xml:space="preserve">Journal of Futures Markets, 32</w:t>
       </w:r>
       <w:r>
         <w:rPr>
           <w:sz w:val="19"/>
           <w:szCs w:val="19"/>
         </w:rPr>
-        <w:t xml:space="preserve">(2), 383–417. https://doi.org/10.2307/2325486</w:t>
+        <w:t xml:space="preserve">(11), 1060–1090. https://doi.org/10.1002/fut.20546</w:t>
       </w:r>
     </w:p>
     <w:p>
@@ -12620,7 +15673,7 @@
           <w:sz w:val="19"/>
           <w:szCs w:val="19"/>
         </w:rPr>
-        <w:t xml:space="preserve">Fandella, P., &amp; Cociancich, V. (2024). Uncovering the greenium: Investigating the yield spread between green and conventional bonds. </w:t>
+        <w:t xml:space="preserve">Fama, E. F. (1970). Efficient capital markets: A review of theory and empirical work. </w:t>
       </w:r>
       <w:r>
         <w:rPr>
@@ -12629,14 +15682,14 @@
           <w:sz w:val="19"/>
           <w:szCs w:val="19"/>
         </w:rPr>
-        <w:t xml:space="preserve">Investment Management and Financial Innovations, 21</w:t>
+        <w:t xml:space="preserve">The Journal of Finance, 25</w:t>
       </w:r>
       <w:r>
         <w:rPr>
           <w:sz w:val="19"/>
           <w:szCs w:val="19"/>
         </w:rPr>
-        <w:t xml:space="preserve">(2), 56–69. https://doi.org/10.21511/imfi.21(2).2024.05</w:t>
+        <w:t xml:space="preserve">(2), 383–417. https://doi.org/10.2307/2325486</w:t>
       </w:r>
     </w:p>
     <w:p>
@@ -12649,7 +15702,7 @@
           <w:sz w:val="19"/>
           <w:szCs w:val="19"/>
         </w:rPr>
-        <w:t xml:space="preserve">Fatica, S., Panzica, R., &amp; Rancan, M. (2021). The pricing of green bonds: Are financial institutions special? </w:t>
+        <w:t xml:space="preserve">Fandella, P., &amp; Cociancich, V. (2024). Uncovering the greenium: Investigating the yield spread between green and conventional bonds. </w:t>
       </w:r>
       <w:r>
         <w:rPr>
@@ -12658,14 +15711,14 @@
           <w:sz w:val="19"/>
           <w:szCs w:val="19"/>
         </w:rPr>
-        <w:t xml:space="preserve">Journal of Financial Stability, 54</w:t>
+        <w:t xml:space="preserve">Investment Management and Financial Innovations, 21</w:t>
       </w:r>
       <w:r>
         <w:rPr>
           <w:sz w:val="19"/>
           <w:szCs w:val="19"/>
         </w:rPr>
-        <w:t xml:space="preserve">, 100873. https://doi.org/10.1016/j.jfs.2021.100873</w:t>
+        <w:t xml:space="preserve">(2), 56–69. https://doi.org/10.21511/imfi.21(2).2024.05</w:t>
       </w:r>
     </w:p>
     <w:p>
@@ -12678,7 +15731,7 @@
           <w:sz w:val="19"/>
           <w:szCs w:val="19"/>
         </w:rPr>
-        <w:t xml:space="preserve">Harvey, C. R. (2017). Presidential address: The scientific outlook in financial economics. </w:t>
+        <w:t xml:space="preserve">Fatica, S., Panzica, R., &amp; Rancan, M. (2021). The pricing of green bonds: Are financial institutions special? </w:t>
       </w:r>
       <w:r>
         <w:rPr>
@@ -12687,14 +15740,14 @@
           <w:sz w:val="19"/>
           <w:szCs w:val="19"/>
         </w:rPr>
-        <w:t xml:space="preserve">The Journal of Finance, 72</w:t>
+        <w:t xml:space="preserve">Journal of Financial Stability, 54</w:t>
       </w:r>
       <w:r>
         <w:rPr>
           <w:sz w:val="19"/>
           <w:szCs w:val="19"/>
         </w:rPr>
-        <w:t xml:space="preserve">(4), 1399–1440. https://doi.org/10.1111/jofi.12530</w:t>
+        <w:t xml:space="preserve">, 100873. https://doi.org/10.1016/j.jfs.2021.100873</w:t>
       </w:r>
     </w:p>
     <w:p>
@@ -12707,7 +15760,7 @@
           <w:sz w:val="19"/>
           <w:szCs w:val="19"/>
         </w:rPr>
-        <w:t xml:space="preserve">Hoenig, J. M., &amp; Heisey, D. M. (2001). The abuse of power: The pervasive fallacy of power calculations for data analysis. </w:t>
+        <w:t xml:space="preserve">Grishunin, S., Bukreeva, A., &amp; Suloeva, S. (2023). Analysis of yields and their determinants in the European corporate green bond market. </w:t>
       </w:r>
       <w:r>
         <w:rPr>
@@ -12716,14 +15769,14 @@
           <w:sz w:val="19"/>
           <w:szCs w:val="19"/>
         </w:rPr>
-        <w:t xml:space="preserve">The American Statistician, 55</w:t>
+        <w:t xml:space="preserve">Risks, 11</w:t>
       </w:r>
       <w:r>
         <w:rPr>
           <w:sz w:val="19"/>
           <w:szCs w:val="19"/>
         </w:rPr>
-        <w:t xml:space="preserve">(1), 19–24. https://doi.org/10.1198/000313001300339897</w:t>
+        <w:t xml:space="preserve">(1), 14. https://doi.org/10.3390/risks11010014</w:t>
       </w:r>
     </w:p>
     <w:p>
@@ -12736,7 +15789,7 @@
           <w:sz w:val="19"/>
           <w:szCs w:val="19"/>
         </w:rPr>
-        <w:t xml:space="preserve">Ivashchenko, A., &amp; Rockinger, M. (2026). Call me maybe: Corporate bond prices upon missed call opportunities. </w:t>
+        <w:t xml:space="preserve">Harvey, C. R. (2017). Presidential address: The scientific outlook in financial economics. </w:t>
       </w:r>
       <w:r>
         <w:rPr>
@@ -12745,14 +15798,14 @@
           <w:sz w:val="19"/>
           <w:szCs w:val="19"/>
         </w:rPr>
-        <w:t xml:space="preserve">Financial Management, 55</w:t>
+        <w:t xml:space="preserve">The Journal of Finance, 72</w:t>
       </w:r>
       <w:r>
         <w:rPr>
           <w:sz w:val="19"/>
           <w:szCs w:val="19"/>
         </w:rPr>
-        <w:t xml:space="preserve">(1), 49–65. https://doi.org/10.1111/fima.12503</w:t>
+        <w:t xml:space="preserve">(4), 1399–1440. https://doi.org/10.1111/jofi.12530</w:t>
       </w:r>
     </w:p>
     <w:p>
@@ -12765,7 +15818,20 @@
           <w:sz w:val="19"/>
           <w:szCs w:val="19"/>
         </w:rPr>
-        <w:t xml:space="preserve">Kalotay, A. J., Williams, G. O., &amp; Fabozzi, F. J. (1993). A model for valuing bonds and embedded options. </w:t>
+        <w:t xml:space="preserve">Hinsche, I. C. (2022). A greenium for the Next Generation EU green bonds: Analysis of a potential green bond premium and its drivers [Working paper]. SSRN. https://doi.org/10.2139/ssrn.3965664</w:t>
+      </w:r>
+    </w:p>
+    <w:p>
+      <w:pPr>
+        <w:spacing w:after="70"/>
+        <w:ind w:left="567" w:hanging="567"/>
+      </w:pPr>
+      <w:r>
+        <w:rPr>
+          <w:sz w:val="19"/>
+          <w:szCs w:val="19"/>
+        </w:rPr>
+        <w:t xml:space="preserve">Hoenig, J. M., &amp; Heisey, D. M. (2001). The abuse of power: The pervasive fallacy of power calculations for data analysis. </w:t>
       </w:r>
       <w:r>
         <w:rPr>
@@ -12774,14 +15840,14 @@
           <w:sz w:val="19"/>
           <w:szCs w:val="19"/>
         </w:rPr>
-        <w:t xml:space="preserve">Financial Analysts Journal, 49</w:t>
+        <w:t xml:space="preserve">The American Statistician, 55</w:t>
       </w:r>
       <w:r>
         <w:rPr>
           <w:sz w:val="19"/>
           <w:szCs w:val="19"/>
         </w:rPr>
-        <w:t xml:space="preserve">(3), 35–46. https://doi.org/10.2469/faj.v49.n3.35</w:t>
+        <w:t xml:space="preserve">(1), 19–24. https://doi.org/10.1198/000313001300339897</w:t>
       </w:r>
     </w:p>
     <w:p>
@@ -12794,7 +15860,7 @@
           <w:sz w:val="19"/>
           <w:szCs w:val="19"/>
         </w:rPr>
-        <w:t xml:space="preserve">Kind, A., Oster, P., &amp; Peter, F. J. (2022). The determinants of banks’ AT1 CoCo spreads. </w:t>
+        <w:t xml:space="preserve">Ivashchenko, A., &amp; Rockinger, M. (2026). Call me maybe: Corporate bond prices upon missed call opportunities. </w:t>
       </w:r>
       <w:r>
         <w:rPr>
@@ -12803,14 +15869,14 @@
           <w:sz w:val="19"/>
           <w:szCs w:val="19"/>
         </w:rPr>
-        <w:t xml:space="preserve">European Financial Management, 28</w:t>
+        <w:t xml:space="preserve">Financial Management, 55</w:t>
       </w:r>
       <w:r>
         <w:rPr>
           <w:sz w:val="19"/>
           <w:szCs w:val="19"/>
         </w:rPr>
-        <w:t xml:space="preserve">(2), 567–604. https://doi.org/10.1111/eufm.12314</w:t>
+        <w:t xml:space="preserve">(1), 49–65. https://doi.org/10.1111/fima.12503</w:t>
       </w:r>
     </w:p>
     <w:p>
@@ -12823,20 +15889,7 @@
           <w:sz w:val="19"/>
           <w:szCs w:val="19"/>
         </w:rPr>
-        <w:t xml:space="preserve">Lai, W. N., &amp; Lu, X. (2026). The green bond premium: Evidence from disclosure and synthetic counterfactuals [Working paper]. SSRN. https://doi.org/10.2139/ssrn.6501665</w:t>
-      </w:r>
-    </w:p>
-    <w:p>
-      <w:pPr>
-        <w:spacing w:after="70"/>
-        <w:ind w:left="567" w:hanging="567"/>
-      </w:pPr>
-      <w:r>
-        <w:rPr>
-          <w:sz w:val="19"/>
-          <w:szCs w:val="19"/>
-        </w:rPr>
-        <w:t xml:space="preserve">Larcker, D. F., &amp; Watts, E. M. (2020). Where’s the greenium? </w:t>
+        <w:t xml:space="preserve">Kalotay, A. J., Williams, G. O., &amp; Fabozzi, F. J. (1993). A model for valuing bonds and embedded options. </w:t>
       </w:r>
       <w:r>
         <w:rPr>
@@ -12845,14 +15898,14 @@
           <w:sz w:val="19"/>
           <w:szCs w:val="19"/>
         </w:rPr>
-        <w:t xml:space="preserve">Journal of Accounting and Economics, 69</w:t>
+        <w:t xml:space="preserve">Financial Analysts Journal, 49</w:t>
       </w:r>
       <w:r>
         <w:rPr>
           <w:sz w:val="19"/>
           <w:szCs w:val="19"/>
         </w:rPr>
-        <w:t xml:space="preserve">(2–3), 101312. https://doi.org/10.1016/j.jacceco.2020.101312</w:t>
+        <w:t xml:space="preserve">(3), 35–46. https://doi.org/10.2469/faj.v49.n3.35</w:t>
       </w:r>
     </w:p>
     <w:p>
@@ -12865,33 +15918,7 @@
           <w:sz w:val="19"/>
           <w:szCs w:val="19"/>
         </w:rPr>
-        <w:t xml:space="preserve">Latif, A., Husodo, Z., &amp; Hendranastiti, N. D. (2026). Green sukuk and climate finance: Evidence from Indonesia [Working paper]. SSRN. https://doi.org/10.2139/ssrn.6169811</w:t>
-      </w:r>
-    </w:p>
-    <w:p>
-      <w:pPr>
-        <w:spacing w:after="70"/>
-        <w:ind w:left="567" w:hanging="567"/>
-      </w:pPr>
-      <w:r>
-        <w:rPr>
-          <w:sz w:val="19"/>
-          <w:szCs w:val="19"/>
-        </w:rPr>
-        <w:t xml:space="preserve">Lehkonen, H., Heimonen, K., &amp; Simola, J. (2025). Dissipating green bond premium [Working paper]. SSRN. https://doi.org/10.2139/ssrn.5267279</w:t>
-      </w:r>
-    </w:p>
-    <w:p>
-      <w:pPr>
-        <w:spacing w:after="70"/>
-        <w:ind w:left="567" w:hanging="567"/>
-      </w:pPr>
-      <w:r>
-        <w:rPr>
-          <w:sz w:val="19"/>
-          <w:szCs w:val="19"/>
-        </w:rPr>
-        <w:t xml:space="preserve">Löffler, K. U., Petreski, A., &amp; Stephan, A. (2021). Drivers of green bond issuance and new evidence on the “greenium”. </w:t>
+        <w:t xml:space="preserve">Kind, A., Oster, P., &amp; Peter, F. J. (2022). The determinants of banks’ AT1 CoCo spreads. </w:t>
       </w:r>
       <w:r>
         <w:rPr>
@@ -12900,14 +15927,140 @@
           <w:sz w:val="19"/>
           <w:szCs w:val="19"/>
         </w:rPr>
-        <w:t xml:space="preserve">Eurasian Economic Review, 11</w:t>
+        <w:t xml:space="preserve">European Financial Management, 28</w:t>
       </w:r>
       <w:r>
         <w:rPr>
           <w:sz w:val="19"/>
           <w:szCs w:val="19"/>
         </w:rPr>
+        <w:t xml:space="preserve">(2), 567–604. https://doi.org/10.1111/eufm.12314</w:t>
+      </w:r>
+    </w:p>
+    <w:p>
+      <w:pPr>
+        <w:spacing w:after="70"/>
+        <w:ind w:left="567" w:hanging="567"/>
+      </w:pPr>
+      <w:r>
+        <w:rPr>
+          <w:sz w:val="19"/>
+          <w:szCs w:val="19"/>
+        </w:rPr>
+        <w:t xml:space="preserve">Lai, W. N., &amp; Lu, X. (2026). The green bond premium: Evidence from disclosure and synthetic counterfactuals [Working paper]. SSRN. https://doi.org/10.2139/ssrn.6501665</w:t>
+      </w:r>
+    </w:p>
+    <w:p>
+      <w:pPr>
+        <w:spacing w:after="70"/>
+        <w:ind w:left="567" w:hanging="567"/>
+      </w:pPr>
+      <w:r>
+        <w:rPr>
+          <w:sz w:val="19"/>
+          <w:szCs w:val="19"/>
+        </w:rPr>
+        <w:t xml:space="preserve">Larcker, D. F., &amp; Watts, E. M. (2020). Where’s the greenium? </w:t>
+      </w:r>
+      <w:r>
+        <w:rPr>
+          <w:i/>
+          <w:iCs/>
+          <w:sz w:val="19"/>
+          <w:szCs w:val="19"/>
+        </w:rPr>
+        <w:t xml:space="preserve">Journal of Accounting and Economics, 69</w:t>
+      </w:r>
+      <w:r>
+        <w:rPr>
+          <w:sz w:val="19"/>
+          <w:szCs w:val="19"/>
+        </w:rPr>
+        <w:t xml:space="preserve">(2–3), 101312. https://doi.org/10.1016/j.jacceco.2020.101312</w:t>
+      </w:r>
+    </w:p>
+    <w:p>
+      <w:pPr>
+        <w:spacing w:after="70"/>
+        <w:ind w:left="567" w:hanging="567"/>
+      </w:pPr>
+      <w:r>
+        <w:rPr>
+          <w:sz w:val="19"/>
+          <w:szCs w:val="19"/>
+        </w:rPr>
+        <w:t xml:space="preserve">Latif, A., Husodo, Z., &amp; Hendranastiti, N. D. (2026). Green sukuk and climate finance: Evidence from Indonesia [Working paper]. SSRN. https://doi.org/10.2139/ssrn.6169811</w:t>
+      </w:r>
+    </w:p>
+    <w:p>
+      <w:pPr>
+        <w:spacing w:after="70"/>
+        <w:ind w:left="567" w:hanging="567"/>
+      </w:pPr>
+      <w:r>
+        <w:rPr>
+          <w:sz w:val="19"/>
+          <w:szCs w:val="19"/>
+        </w:rPr>
+        <w:t xml:space="preserve">Lehkonen, H., Heimonen, K., &amp; Simola, J. (2025). Dissipating green bond premium [Working paper]. SSRN. https://doi.org/10.2139/ssrn.5267279</w:t>
+      </w:r>
+    </w:p>
+    <w:p>
+      <w:pPr>
+        <w:spacing w:after="70"/>
+        <w:ind w:left="567" w:hanging="567"/>
+      </w:pPr>
+      <w:r>
+        <w:rPr>
+          <w:sz w:val="19"/>
+          <w:szCs w:val="19"/>
+        </w:rPr>
+        <w:t xml:space="preserve">Löffler, K. U., Petreski, A., &amp; Stephan, A. (2021). Drivers of green bond issuance and new evidence on the “greenium”. </w:t>
+      </w:r>
+      <w:r>
+        <w:rPr>
+          <w:i/>
+          <w:iCs/>
+          <w:sz w:val="19"/>
+          <w:szCs w:val="19"/>
+        </w:rPr>
+        <w:t xml:space="preserve">Eurasian Economic Review, 11</w:t>
+      </w:r>
+      <w:r>
+        <w:rPr>
+          <w:sz w:val="19"/>
+          <w:szCs w:val="19"/>
+        </w:rPr>
         <w:t xml:space="preserve">(1), 1–24. https://doi.org/10.1007/s40822-020-00165-y</w:t>
+      </w:r>
+    </w:p>
+    <w:p>
+      <w:pPr>
+        <w:spacing w:after="70"/>
+        <w:ind w:left="567" w:hanging="567"/>
+      </w:pPr>
+      <w:r>
+        <w:rPr>
+          <w:sz w:val="19"/>
+          <w:szCs w:val="19"/>
+        </w:rPr>
+        <w:t xml:space="preserve">MacKinnon, J. G., &amp; Webb, M. D. (2017). Wild bootstrap inference for wildly different cluster sizes. </w:t>
+      </w:r>
+      <w:r>
+        <w:rPr>
+          <w:i/>
+          <w:iCs/>
+          <w:sz w:val="19"/>
+          <w:szCs w:val="19"/>
+        </w:rPr>
+        <w:t xml:space="preserve">Journal of Applied Econometrics, 32</w:t>
+      </w:r>
+      <w:r>
+        <w:rPr>
+          <w:sz w:val="19"/>
+          <w:szCs w:val="19"/>
+        </w:rPr>
+        <w:t xml:space="preserve">(2), 233–254. https://doi.org/10.1002/jae.2508</w:t>
       </w:r>
     </w:p>
     <w:p>

</xml_diff>